<commit_message>
docs: add interactive ZKP section
</commit_message>
<xml_diff>
--- a/thesis.docx
+++ b/thesis.docx
@@ -68,10 +68,10 @@
                   <v:path o:extrusionok="f" gradientshapeok="t" o:connecttype="rect"/>
                   <o:lock v:ext="edit" aspectratio="t"/>
                 </v:shapetype>
-                <v:shape id="_x0000_i1025" type="#_x0000_t75" alt="" style="width:63.6pt;height:63.6pt;mso-width-percent:0;mso-height-percent:0;mso-width-percent:0;mso-height-percent:0" o:ole="" fillcolor="window">
+                <v:shape id="_x0000_i1025" type="#_x0000_t75" alt="" style="width:63.25pt;height:63.25pt;mso-width-percent:0;mso-height-percent:0;mso-width-percent:0;mso-height-percent:0" o:ole="" fillcolor="window">
                   <v:imagedata r:id="rId8" o:title=""/>
                 </v:shape>
-                <o:OLEObject Type="Embed" ProgID="CorelDraw.Graphic.7" ShapeID="_x0000_i1025" DrawAspect="Content" ObjectID="_1848060991" r:id="rId9"/>
+                <o:OLEObject Type="Embed" ProgID="CorelDraw.Graphic.7" ShapeID="_x0000_i1025" DrawAspect="Content" ObjectID="_1848065826" r:id="rId9"/>
               </w:object>
             </w:r>
           </w:p>
@@ -144,6 +144,9 @@
               </w:rPr>
             </w:pPr>
             <w:r>
+              <w:rPr>
+                <w:noProof/>
+              </w:rPr>
               <w:drawing>
                 <wp:inline distT="0" distB="0" distL="0" distR="0" wp14:anchorId="5423F435" wp14:editId="597F11A6">
                   <wp:extent cx="783590" cy="866775"/>
@@ -6944,7 +6947,7 @@
             </w:rPr>
             <w:fldChar w:fldCharType="separate"/>
           </w:r>
-          <w:hyperlink w:anchor="_Toc237443360" w:history="1">
+          <w:hyperlink w:anchor="_Toc237451631" w:history="1">
             <w:r>
               <w:rPr>
                 <w:rStyle w:val="Hyperlink"/>
@@ -6990,7 +6993,7 @@
                 <w:noProof/>
                 <w:webHidden/>
               </w:rPr>
-              <w:instrText xml:space="preserve"> PAGEREF _Toc237443360 \h </w:instrText>
+              <w:instrText xml:space="preserve"> PAGEREF _Toc237451631 \h </w:instrText>
             </w:r>
             <w:r>
               <w:rPr>
@@ -7036,7 +7039,7 @@
               <w:lang w:val="en-US"/>
             </w:rPr>
           </w:pPr>
-          <w:hyperlink w:anchor="_Toc237443361" w:history="1">
+          <w:hyperlink w:anchor="_Toc237451632" w:history="1">
             <w:r>
               <w:rPr>
                 <w:rStyle w:val="Hyperlink"/>
@@ -7069,13 +7072,53 @@
                 <w:noProof/>
                 <w:lang w:val="en-US"/>
               </w:rPr>
-              <w:t>Zero-Knowledge Proof</w:t>
+              <w:t>Zero</w:t>
+            </w:r>
+            <w:r>
+              <w:rPr>
+                <w:rStyle w:val="Hyperlink"/>
+                <w:i/>
+                <w:iCs/>
+                <w:noProof/>
+                <w:lang w:val="ru-RU"/>
+              </w:rPr>
+              <w:t>-</w:t>
+            </w:r>
+            <w:r>
+              <w:rPr>
+                <w:rStyle w:val="Hyperlink"/>
+                <w:i/>
+                <w:iCs/>
+                <w:noProof/>
+                <w:lang w:val="en-US"/>
+              </w:rPr>
+              <w:t>Knowledge</w:t>
+            </w:r>
+            <w:r>
+              <w:rPr>
+                <w:rStyle w:val="Hyperlink"/>
+                <w:i/>
+                <w:iCs/>
+                <w:noProof/>
+                <w:lang w:val="ru-RU"/>
+              </w:rPr>
+              <w:t xml:space="preserve"> </w:t>
+            </w:r>
+            <w:r>
+              <w:rPr>
+                <w:rStyle w:val="Hyperlink"/>
+                <w:i/>
+                <w:iCs/>
+                <w:noProof/>
+                <w:lang w:val="en-US"/>
+              </w:rPr>
+              <w:t>Proof</w:t>
             </w:r>
             <w:r>
               <w:rPr>
                 <w:rStyle w:val="Hyperlink"/>
                 <w:noProof/>
-                <w:lang w:val="en-US"/>
+                <w:lang w:val="ru-RU"/>
               </w:rPr>
               <w:t xml:space="preserve"> </w:t>
             </w:r>
@@ -7105,7 +7148,7 @@
                 <w:noProof/>
                 <w:webHidden/>
               </w:rPr>
-              <w:instrText xml:space="preserve"> PAGEREF _Toc237443361 \h </w:instrText>
+              <w:instrText xml:space="preserve"> PAGEREF _Toc237451632 \h </w:instrText>
             </w:r>
             <w:r>
               <w:rPr>
@@ -7151,7 +7194,7 @@
               <w:lang w:val="en-US"/>
             </w:rPr>
           </w:pPr>
-          <w:hyperlink w:anchor="_Toc237443362" w:history="1">
+          <w:hyperlink w:anchor="_Toc237451633" w:history="1">
             <w:r>
               <w:rPr>
                 <w:rStyle w:val="Hyperlink"/>
@@ -7260,7 +7303,7 @@
                 <w:noProof/>
                 <w:webHidden/>
               </w:rPr>
-              <w:instrText xml:space="preserve"> PAGEREF _Toc237443362 \h </w:instrText>
+              <w:instrText xml:space="preserve"> PAGEREF _Toc237451633 \h </w:instrText>
             </w:r>
             <w:r>
               <w:rPr>
@@ -7306,7 +7349,7 @@
               <w:lang w:val="en-US"/>
             </w:rPr>
           </w:pPr>
-          <w:hyperlink w:anchor="_Toc237443363" w:history="1">
+          <w:hyperlink w:anchor="_Toc237451634" w:history="1">
             <w:r>
               <w:rPr>
                 <w:rStyle w:val="Hyperlink"/>
@@ -7369,7 +7412,7 @@
                 <w:noProof/>
                 <w:webHidden/>
               </w:rPr>
-              <w:instrText xml:space="preserve"> PAGEREF _Toc237443363 \h </w:instrText>
+              <w:instrText xml:space="preserve"> PAGEREF _Toc237451634 \h </w:instrText>
             </w:r>
             <w:r>
               <w:rPr>
@@ -7415,7 +7458,7 @@
               <w:lang w:val="en-US"/>
             </w:rPr>
           </w:pPr>
-          <w:hyperlink w:anchor="_Toc237443364" w:history="1">
+          <w:hyperlink w:anchor="_Toc237451635" w:history="1">
             <w:r>
               <w:rPr>
                 <w:rStyle w:val="Hyperlink"/>
@@ -7461,7 +7504,7 @@
                 <w:noProof/>
                 <w:webHidden/>
               </w:rPr>
-              <w:instrText xml:space="preserve"> PAGEREF _Toc237443364 \h </w:instrText>
+              <w:instrText xml:space="preserve"> PAGEREF _Toc237451635 \h </w:instrText>
             </w:r>
             <w:r>
               <w:rPr>
@@ -7507,7 +7550,7 @@
               <w:lang w:val="en-US"/>
             </w:rPr>
           </w:pPr>
-          <w:hyperlink w:anchor="_Toc237443365" w:history="1">
+          <w:hyperlink w:anchor="_Toc237451636" w:history="1">
             <w:r>
               <w:rPr>
                 <w:rStyle w:val="Hyperlink"/>
@@ -7551,7 +7594,7 @@
                 <w:noProof/>
                 <w:webHidden/>
               </w:rPr>
-              <w:instrText xml:space="preserve"> PAGEREF _Toc237443365 \h </w:instrText>
+              <w:instrText xml:space="preserve"> PAGEREF _Toc237451636 \h </w:instrText>
             </w:r>
             <w:r>
               <w:rPr>
@@ -7597,7 +7640,7 @@
               <w:lang w:val="en-US"/>
             </w:rPr>
           </w:pPr>
-          <w:hyperlink w:anchor="_Toc237443366" w:history="1">
+          <w:hyperlink w:anchor="_Toc237451637" w:history="1">
             <w:r>
               <w:rPr>
                 <w:rStyle w:val="Hyperlink"/>
@@ -7641,7 +7684,7 @@
                 <w:noProof/>
                 <w:webHidden/>
               </w:rPr>
-              <w:instrText xml:space="preserve"> PAGEREF _Toc237443366 \h </w:instrText>
+              <w:instrText xml:space="preserve"> PAGEREF _Toc237451637 \h </w:instrText>
             </w:r>
             <w:r>
               <w:rPr>
@@ -7687,7 +7730,7 @@
               <w:lang w:val="en-US"/>
             </w:rPr>
           </w:pPr>
-          <w:hyperlink w:anchor="_Toc237443367" w:history="1">
+          <w:hyperlink w:anchor="_Toc237451638" w:history="1">
             <w:r>
               <w:rPr>
                 <w:rStyle w:val="Hyperlink"/>
@@ -7786,7 +7829,7 @@
                 <w:noProof/>
                 <w:webHidden/>
               </w:rPr>
-              <w:instrText xml:space="preserve"> PAGEREF _Toc237443367 \h </w:instrText>
+              <w:instrText xml:space="preserve"> PAGEREF _Toc237451638 \h </w:instrText>
             </w:r>
             <w:r>
               <w:rPr>
@@ -7832,7 +7875,33 @@
               <w:lang w:val="en-US"/>
             </w:rPr>
           </w:pPr>
-          <w:hyperlink w:anchor="_Toc237443368" w:history="1">
+          <w:hyperlink w:anchor="_Toc237451639" w:history="1">
+            <w:r>
+              <w:rPr>
+                <w:rStyle w:val="Hyperlink"/>
+                <w:i/>
+                <w:iCs/>
+                <w:noProof/>
+              </w:rPr>
+              <w:t>2.4</w:t>
+            </w:r>
+            <w:r>
+              <w:rPr>
+                <w:rFonts w:eastAsiaTheme="minorEastAsia"/>
+                <w:noProof/>
+                <w:sz w:val="24"/>
+                <w:szCs w:val="24"/>
+                <w:lang w:val="en-US"/>
+              </w:rPr>
+              <w:tab/>
+            </w:r>
+            <w:r>
+              <w:rPr>
+                <w:rStyle w:val="Hyperlink"/>
+                <w:noProof/>
+              </w:rPr>
+              <w:t xml:space="preserve">Интерактивни  </w:t>
+            </w:r>
             <w:r>
               <w:rPr>
                 <w:rStyle w:val="Hyperlink"/>
@@ -7841,33 +7910,6 @@
                 <w:noProof/>
                 <w:lang w:val="en-US"/>
               </w:rPr>
-              <w:t>2.4</w:t>
-            </w:r>
-            <w:r>
-              <w:rPr>
-                <w:rFonts w:eastAsiaTheme="minorEastAsia"/>
-                <w:noProof/>
-                <w:sz w:val="24"/>
-                <w:szCs w:val="24"/>
-                <w:lang w:val="en-US"/>
-              </w:rPr>
-              <w:tab/>
-            </w:r>
-            <w:r>
-              <w:rPr>
-                <w:rStyle w:val="Hyperlink"/>
-                <w:noProof/>
-              </w:rPr>
-              <w:t xml:space="preserve">Интерактивни  </w:t>
-            </w:r>
-            <w:r>
-              <w:rPr>
-                <w:rStyle w:val="Hyperlink"/>
-                <w:i/>
-                <w:iCs/>
-                <w:noProof/>
-                <w:lang w:val="en-US"/>
-              </w:rPr>
               <w:t>ZKP</w:t>
             </w:r>
             <w:r>
@@ -7889,7 +7931,7 @@
                 <w:noProof/>
                 <w:webHidden/>
               </w:rPr>
-              <w:instrText xml:space="preserve"> PAGEREF _Toc237443368 \h </w:instrText>
+              <w:instrText xml:space="preserve"> PAGEREF _Toc237451639 \h </w:instrText>
             </w:r>
             <w:r>
               <w:rPr>
@@ -7935,7 +7977,7 @@
               <w:lang w:val="en-US"/>
             </w:rPr>
           </w:pPr>
-          <w:hyperlink w:anchor="_Toc237443369" w:history="1">
+          <w:hyperlink w:anchor="_Toc237451640" w:history="1">
             <w:r>
               <w:rPr>
                 <w:rStyle w:val="Hyperlink"/>
@@ -7990,7 +8032,7 @@
                 <w:noProof/>
                 <w:webHidden/>
               </w:rPr>
-              <w:instrText xml:space="preserve"> PAGEREF _Toc237443369 \h </w:instrText>
+              <w:instrText xml:space="preserve"> PAGEREF _Toc237451640 \h </w:instrText>
             </w:r>
             <w:r>
               <w:rPr>
@@ -8010,7 +8052,7 @@
                 <w:noProof/>
                 <w:webHidden/>
               </w:rPr>
-              <w:t>5</w:t>
+              <w:t>7</w:t>
             </w:r>
             <w:r>
               <w:rPr>
@@ -8036,10 +8078,11 @@
               <w:lang w:val="en-US"/>
             </w:rPr>
           </w:pPr>
-          <w:hyperlink w:anchor="_Toc237443370" w:history="1">
+          <w:hyperlink w:anchor="_Toc237451641" w:history="1">
             <w:r>
               <w:rPr>
                 <w:rStyle w:val="Hyperlink"/>
+                <w:rFonts w:ascii="Times New Roman" w:hAnsi="Times New Roman" w:cs="Times New Roman"/>
                 <w:noProof/>
               </w:rPr>
               <w:t>3</w:t>
@@ -8057,9 +8100,28 @@
             <w:r>
               <w:rPr>
                 <w:rStyle w:val="Hyperlink"/>
+                <w:rFonts w:ascii="Times New Roman" w:hAnsi="Times New Roman" w:cs="Times New Roman"/>
                 <w:noProof/>
               </w:rPr>
-              <w:t>Навођење слика, графикона, табела, листинга и литературе</w:t>
+              <w:t xml:space="preserve">Пројектовање и имплементација </w:t>
+            </w:r>
+            <w:r>
+              <w:rPr>
+                <w:rStyle w:val="Hyperlink"/>
+                <w:rFonts w:ascii="Times New Roman" w:hAnsi="Times New Roman" w:cs="Times New Roman"/>
+                <w:noProof/>
+                <w:lang w:val="en-US"/>
+              </w:rPr>
+              <w:t>ZKP</w:t>
+            </w:r>
+            <w:r>
+              <w:rPr>
+                <w:rStyle w:val="Hyperlink"/>
+                <w:rFonts w:ascii="Times New Roman" w:hAnsi="Times New Roman" w:cs="Times New Roman"/>
+                <w:noProof/>
+                <w:lang w:val="ru-RU"/>
+              </w:rPr>
+              <w:t xml:space="preserve"> библиотеке</w:t>
             </w:r>
             <w:r>
               <w:rPr>
@@ -8080,7 +8142,7 @@
                 <w:noProof/>
                 <w:webHidden/>
               </w:rPr>
-              <w:instrText xml:space="preserve"> PAGEREF _Toc237443370 \h </w:instrText>
+              <w:instrText xml:space="preserve"> PAGEREF _Toc237451641 \h </w:instrText>
             </w:r>
             <w:r>
               <w:rPr>
@@ -8100,7 +8162,7 @@
                 <w:noProof/>
                 <w:webHidden/>
               </w:rPr>
-              <w:t>6</w:t>
+              <w:t>8</w:t>
             </w:r>
             <w:r>
               <w:rPr>
@@ -8126,10 +8188,11 @@
               <w:lang w:val="en-US"/>
             </w:rPr>
           </w:pPr>
-          <w:hyperlink w:anchor="_Toc237443371" w:history="1">
+          <w:hyperlink w:anchor="_Toc237451642" w:history="1">
             <w:r>
               <w:rPr>
                 <w:rStyle w:val="Hyperlink"/>
+                <w:rFonts w:ascii="Times New Roman" w:hAnsi="Times New Roman" w:cs="Times New Roman"/>
                 <w:noProof/>
               </w:rPr>
               <w:t>4</w:t>
@@ -8147,9 +8210,10 @@
             <w:r>
               <w:rPr>
                 <w:rStyle w:val="Hyperlink"/>
+                <w:rFonts w:ascii="Times New Roman" w:hAnsi="Times New Roman" w:cs="Times New Roman"/>
                 <w:noProof/>
               </w:rPr>
-              <w:t>4 Презентација</w:t>
+              <w:t>Примјена библиотеке у микросервисном окружењу</w:t>
             </w:r>
             <w:r>
               <w:rPr>
@@ -8170,7 +8234,7 @@
                 <w:noProof/>
                 <w:webHidden/>
               </w:rPr>
-              <w:instrText xml:space="preserve"> PAGEREF _Toc237443371 \h </w:instrText>
+              <w:instrText xml:space="preserve"> PAGEREF _Toc237451642 \h </w:instrText>
             </w:r>
             <w:r>
               <w:rPr>
@@ -8190,7 +8254,7 @@
                 <w:noProof/>
                 <w:webHidden/>
               </w:rPr>
-              <w:t>9</w:t>
+              <w:t>11</w:t>
             </w:r>
             <w:r>
               <w:rPr>
@@ -8216,10 +8280,11 @@
               <w:lang w:val="en-US"/>
             </w:rPr>
           </w:pPr>
-          <w:hyperlink w:anchor="_Toc237443372" w:history="1">
+          <w:hyperlink w:anchor="_Toc237451643" w:history="1">
             <w:r>
               <w:rPr>
                 <w:rStyle w:val="Hyperlink"/>
+                <w:rFonts w:ascii="Times New Roman" w:hAnsi="Times New Roman" w:cs="Times New Roman"/>
                 <w:noProof/>
               </w:rPr>
               <w:t>5</w:t>
@@ -8237,9 +8302,10 @@
             <w:r>
               <w:rPr>
                 <w:rStyle w:val="Hyperlink"/>
+                <w:rFonts w:ascii="Times New Roman" w:hAnsi="Times New Roman" w:cs="Times New Roman"/>
                 <w:noProof/>
               </w:rPr>
-              <w:t>Литература</w:t>
+              <w:t>Закључак</w:t>
             </w:r>
             <w:r>
               <w:rPr>
@@ -8260,7 +8326,7 @@
                 <w:noProof/>
                 <w:webHidden/>
               </w:rPr>
-              <w:instrText xml:space="preserve"> PAGEREF _Toc237443372 \h </w:instrText>
+              <w:instrText xml:space="preserve"> PAGEREF _Toc237451643 \h </w:instrText>
             </w:r>
             <w:r>
               <w:rPr>
@@ -8280,7 +8346,7 @@
                 <w:noProof/>
                 <w:webHidden/>
               </w:rPr>
-              <w:t>10</w:t>
+              <w:t>11</w:t>
             </w:r>
             <w:r>
               <w:rPr>
@@ -8306,10 +8372,11 @@
               <w:lang w:val="en-US"/>
             </w:rPr>
           </w:pPr>
-          <w:hyperlink w:anchor="_Toc237443373" w:history="1">
+          <w:hyperlink w:anchor="_Toc237451644" w:history="1">
             <w:r>
               <w:rPr>
                 <w:rStyle w:val="Hyperlink"/>
+                <w:rFonts w:ascii="Times New Roman" w:hAnsi="Times New Roman" w:cs="Times New Roman"/>
                 <w:noProof/>
               </w:rPr>
               <w:t>6</w:t>
@@ -8327,9 +8394,10 @@
             <w:r>
               <w:rPr>
                 <w:rStyle w:val="Hyperlink"/>
+                <w:rFonts w:ascii="Times New Roman" w:hAnsi="Times New Roman" w:cs="Times New Roman"/>
                 <w:noProof/>
               </w:rPr>
-              <w:t>Биографија</w:t>
+              <w:t>Литература</w:t>
             </w:r>
             <w:r>
               <w:rPr>
@@ -8350,7 +8418,7 @@
                 <w:noProof/>
                 <w:webHidden/>
               </w:rPr>
-              <w:instrText xml:space="preserve"> PAGEREF _Toc237443373 \h </w:instrText>
+              <w:instrText xml:space="preserve"> PAGEREF _Toc237451644 \h </w:instrText>
             </w:r>
             <w:r>
               <w:rPr>
@@ -8370,7 +8438,99 @@
                 <w:noProof/>
                 <w:webHidden/>
               </w:rPr>
-              <w:t>11</w:t>
+              <w:t>12</w:t>
+            </w:r>
+            <w:r>
+              <w:rPr>
+                <w:noProof/>
+                <w:webHidden/>
+              </w:rPr>
+              <w:fldChar w:fldCharType="end"/>
+            </w:r>
+          </w:hyperlink>
+        </w:p>
+        <w:p>
+          <w:pPr>
+            <w:pStyle w:val="TOC1"/>
+            <w:tabs>
+              <w:tab w:val="left" w:pos="440"/>
+              <w:tab w:val="right" w:leader="dot" w:pos="9304"/>
+            </w:tabs>
+            <w:rPr>
+              <w:rFonts w:eastAsiaTheme="minorEastAsia"/>
+              <w:noProof/>
+              <w:sz w:val="24"/>
+              <w:szCs w:val="24"/>
+              <w:lang w:val="en-US"/>
+            </w:rPr>
+          </w:pPr>
+          <w:hyperlink w:anchor="_Toc237451645" w:history="1">
+            <w:r>
+              <w:rPr>
+                <w:rStyle w:val="Hyperlink"/>
+                <w:rFonts w:ascii="Times New Roman" w:hAnsi="Times New Roman" w:cs="Times New Roman"/>
+                <w:noProof/>
+              </w:rPr>
+              <w:t>7</w:t>
+            </w:r>
+            <w:r>
+              <w:rPr>
+                <w:rFonts w:eastAsiaTheme="minorEastAsia"/>
+                <w:noProof/>
+                <w:sz w:val="24"/>
+                <w:szCs w:val="24"/>
+                <w:lang w:val="en-US"/>
+              </w:rPr>
+              <w:tab/>
+            </w:r>
+            <w:r>
+              <w:rPr>
+                <w:rStyle w:val="Hyperlink"/>
+                <w:rFonts w:ascii="Times New Roman" w:hAnsi="Times New Roman" w:cs="Times New Roman"/>
+                <w:noProof/>
+              </w:rPr>
+              <w:t>Биографија</w:t>
+            </w:r>
+            <w:r>
+              <w:rPr>
+                <w:noProof/>
+                <w:webHidden/>
+              </w:rPr>
+              <w:tab/>
+            </w:r>
+            <w:r>
+              <w:rPr>
+                <w:noProof/>
+                <w:webHidden/>
+              </w:rPr>
+              <w:fldChar w:fldCharType="begin"/>
+            </w:r>
+            <w:r>
+              <w:rPr>
+                <w:noProof/>
+                <w:webHidden/>
+              </w:rPr>
+              <w:instrText xml:space="preserve"> PAGEREF _Toc237451645 \h </w:instrText>
+            </w:r>
+            <w:r>
+              <w:rPr>
+                <w:noProof/>
+                <w:webHidden/>
+              </w:rPr>
+            </w:r>
+            <w:r>
+              <w:rPr>
+                <w:noProof/>
+                <w:webHidden/>
+              </w:rPr>
+              <w:fldChar w:fldCharType="separate"/>
+            </w:r>
+            <w:r>
+              <w:rPr>
+                <w:noProof/>
+                <w:webHidden/>
+              </w:rPr>
+              <w:t>13</w:t>
             </w:r>
             <w:r>
               <w:rPr>
@@ -8440,7 +8600,7 @@
           <w:rFonts w:ascii="Times New Roman" w:hAnsi="Times New Roman" w:cs="Times New Roman"/>
         </w:rPr>
       </w:pPr>
-      <w:bookmarkStart w:id="0" w:name="_Toc237443360"/>
+      <w:bookmarkStart w:id="0" w:name="_Toc237451631"/>
       <w:r>
         <w:rPr>
           <w:rFonts w:ascii="Times New Roman" w:hAnsi="Times New Roman" w:cs="Times New Roman"/>
@@ -8505,13 +8665,6 @@
           <w:sz w:val="24"/>
           <w:szCs w:val="24"/>
         </w:rPr>
-      </w:r>
-      <w:r>
-        <w:rPr>
-          <w:rFonts w:ascii="Times New Roman" w:hAnsi="Times New Roman" w:cs="Times New Roman"/>
-          <w:sz w:val="24"/>
-          <w:szCs w:val="24"/>
-        </w:rPr>
         <w:instrText xml:space="preserve"> \* MERGEFORMAT </w:instrText>
       </w:r>
       <w:r>
@@ -8520,6 +8673,13 @@
           <w:sz w:val="24"/>
           <w:szCs w:val="24"/>
         </w:rPr>
+      </w:r>
+      <w:r>
+        <w:rPr>
+          <w:rFonts w:ascii="Times New Roman" w:hAnsi="Times New Roman" w:cs="Times New Roman"/>
+          <w:sz w:val="24"/>
+          <w:szCs w:val="24"/>
+        </w:rPr>
         <w:fldChar w:fldCharType="separate"/>
       </w:r>
       <w:r>
@@ -8568,14 +8728,14 @@
           <w:sz w:val="24"/>
           <w:szCs w:val="24"/>
         </w:rPr>
-      </w:r>
-      <w:r>
-        <w:rPr>
-          <w:rFonts w:ascii="Times New Roman" w:hAnsi="Times New Roman" w:cs="Times New Roman"/>
-          <w:sz w:val="24"/>
-          <w:szCs w:val="24"/>
-        </w:rPr>
         <w:instrText xml:space="preserve"> \* MERGEFORMAT </w:instrText>
+      </w:r>
+      <w:r>
+        <w:rPr>
+          <w:rFonts w:ascii="Times New Roman" w:hAnsi="Times New Roman" w:cs="Times New Roman"/>
+          <w:sz w:val="24"/>
+          <w:szCs w:val="24"/>
+        </w:rPr>
       </w:r>
       <w:r>
         <w:rPr>
@@ -8667,13 +8827,6 @@
           <w:sz w:val="24"/>
           <w:szCs w:val="24"/>
         </w:rPr>
-      </w:r>
-      <w:r>
-        <w:rPr>
-          <w:rFonts w:ascii="Times New Roman" w:hAnsi="Times New Roman" w:cs="Times New Roman"/>
-          <w:sz w:val="24"/>
-          <w:szCs w:val="24"/>
-        </w:rPr>
         <w:instrText xml:space="preserve"> \* MERGEFORMAT </w:instrText>
       </w:r>
       <w:r>
@@ -8682,6 +8835,13 @@
           <w:sz w:val="24"/>
           <w:szCs w:val="24"/>
         </w:rPr>
+      </w:r>
+      <w:r>
+        <w:rPr>
+          <w:rFonts w:ascii="Times New Roman" w:hAnsi="Times New Roman" w:cs="Times New Roman"/>
+          <w:sz w:val="24"/>
+          <w:szCs w:val="24"/>
+        </w:rPr>
         <w:fldChar w:fldCharType="separate"/>
       </w:r>
       <w:r>
@@ -8730,14 +8890,14 @@
           <w:sz w:val="24"/>
           <w:szCs w:val="24"/>
         </w:rPr>
-      </w:r>
-      <w:r>
-        <w:rPr>
-          <w:rFonts w:ascii="Times New Roman" w:hAnsi="Times New Roman" w:cs="Times New Roman"/>
-          <w:sz w:val="24"/>
-          <w:szCs w:val="24"/>
-        </w:rPr>
         <w:instrText xml:space="preserve"> \* MERGEFORMAT </w:instrText>
+      </w:r>
+      <w:r>
+        <w:rPr>
+          <w:rFonts w:ascii="Times New Roman" w:hAnsi="Times New Roman" w:cs="Times New Roman"/>
+          <w:sz w:val="24"/>
+          <w:szCs w:val="24"/>
+        </w:rPr>
       </w:r>
       <w:r>
         <w:rPr>
@@ -8893,13 +9053,6 @@
           <w:sz w:val="24"/>
           <w:szCs w:val="24"/>
         </w:rPr>
-      </w:r>
-      <w:r>
-        <w:rPr>
-          <w:rFonts w:ascii="Times New Roman" w:hAnsi="Times New Roman" w:cs="Times New Roman"/>
-          <w:sz w:val="24"/>
-          <w:szCs w:val="24"/>
-        </w:rPr>
         <w:instrText xml:space="preserve"> \* MERGEFORMAT </w:instrText>
       </w:r>
       <w:r>
@@ -8908,6 +9061,13 @@
           <w:sz w:val="24"/>
           <w:szCs w:val="24"/>
         </w:rPr>
+      </w:r>
+      <w:r>
+        <w:rPr>
+          <w:rFonts w:ascii="Times New Roman" w:hAnsi="Times New Roman" w:cs="Times New Roman"/>
+          <w:sz w:val="24"/>
+          <w:szCs w:val="24"/>
+        </w:rPr>
         <w:fldChar w:fldCharType="separate"/>
       </w:r>
       <w:r>
@@ -8956,14 +9116,14 @@
           <w:sz w:val="24"/>
           <w:szCs w:val="24"/>
         </w:rPr>
-      </w:r>
-      <w:r>
-        <w:rPr>
-          <w:rFonts w:ascii="Times New Roman" w:hAnsi="Times New Roman" w:cs="Times New Roman"/>
-          <w:sz w:val="24"/>
-          <w:szCs w:val="24"/>
-        </w:rPr>
         <w:instrText xml:space="preserve"> \* MERGEFORMAT </w:instrText>
+      </w:r>
+      <w:r>
+        <w:rPr>
+          <w:rFonts w:ascii="Times New Roman" w:hAnsi="Times New Roman" w:cs="Times New Roman"/>
+          <w:sz w:val="24"/>
+          <w:szCs w:val="24"/>
+        </w:rPr>
       </w:r>
       <w:r>
         <w:rPr>
@@ -9139,7 +9299,7 @@
           <w:rFonts w:ascii="Times New Roman" w:hAnsi="Times New Roman" w:cs="Times New Roman"/>
           <w:sz w:val="24"/>
           <w:szCs w:val="24"/>
-          <w:lang w:val="en-US"/>
+          <w:lang w:val="ru-RU"/>
         </w:rPr>
       </w:pPr>
     </w:p>
@@ -9150,7 +9310,7 @@
           <w:rFonts w:ascii="Times New Roman" w:hAnsi="Times New Roman" w:cs="Times New Roman"/>
           <w:sz w:val="24"/>
           <w:szCs w:val="24"/>
-          <w:lang w:val="en-US"/>
+          <w:lang w:val="ru-RU"/>
         </w:rPr>
       </w:pPr>
     </w:p>
@@ -9161,7 +9321,7 @@
           <w:rFonts w:ascii="Times New Roman" w:hAnsi="Times New Roman" w:cs="Times New Roman"/>
           <w:sz w:val="24"/>
           <w:szCs w:val="24"/>
-          <w:lang w:val="en-US"/>
+          <w:lang w:val="ru-RU"/>
         </w:rPr>
       </w:pPr>
     </w:p>
@@ -9172,7 +9332,7 @@
           <w:rFonts w:ascii="Times New Roman" w:hAnsi="Times New Roman" w:cs="Times New Roman"/>
           <w:sz w:val="24"/>
           <w:szCs w:val="24"/>
-          <w:lang w:val="en-US"/>
+          <w:lang w:val="ru-RU"/>
         </w:rPr>
       </w:pPr>
     </w:p>
@@ -9180,7 +9340,7 @@
       <w:pPr>
         <w:pStyle w:val="Heading1"/>
       </w:pPr>
-      <w:bookmarkStart w:id="1" w:name="_Toc237443361"/>
+      <w:bookmarkStart w:id="1" w:name="_Toc237451632"/>
       <w:r>
         <w:lastRenderedPageBreak/>
         <w:t xml:space="preserve">Теоријске основе </w:t>
@@ -9191,11 +9351,43 @@
           <w:iCs/>
           <w:lang w:val="en-US"/>
         </w:rPr>
-        <w:t>Zero-Knowledge Proof</w:t>
-      </w:r>
-      <w:r>
-        <w:rPr>
+        <w:t>Zero</w:t>
+      </w:r>
+      <w:r>
+        <w:rPr>
+          <w:i/>
+          <w:iCs/>
+          <w:lang w:val="ru-RU"/>
+        </w:rPr>
+        <w:t>-</w:t>
+      </w:r>
+      <w:r>
+        <w:rPr>
+          <w:i/>
+          <w:iCs/>
           <w:lang w:val="en-US"/>
+        </w:rPr>
+        <w:t>Knowledge</w:t>
+      </w:r>
+      <w:r>
+        <w:rPr>
+          <w:i/>
+          <w:iCs/>
+          <w:lang w:val="ru-RU"/>
+        </w:rPr>
+        <w:t xml:space="preserve"> </w:t>
+      </w:r>
+      <w:r>
+        <w:rPr>
+          <w:i/>
+          <w:iCs/>
+          <w:lang w:val="en-US"/>
+        </w:rPr>
+        <w:t>Proof</w:t>
+      </w:r>
+      <w:r>
+        <w:rPr>
+          <w:lang w:val="ru-RU"/>
         </w:rPr>
         <w:t xml:space="preserve"> </w:t>
       </w:r>
@@ -9221,15 +9413,7 @@
           <w:sz w:val="24"/>
           <w:szCs w:val="24"/>
         </w:rPr>
-        <w:t xml:space="preserve">У овом </w:t>
-      </w:r>
-      <w:r>
-        <w:rPr>
-          <w:rFonts w:ascii="Times New Roman" w:hAnsi="Times New Roman" w:cs="Times New Roman"/>
-          <w:sz w:val="24"/>
-          <w:szCs w:val="24"/>
-        </w:rPr>
-        <w:t xml:space="preserve">поглављу детаљније ћемо размотрити </w:t>
+        <w:t xml:space="preserve">У овом поглављу детаљније ћемо размотрити </w:t>
       </w:r>
       <w:r>
         <w:rPr>
@@ -9289,7 +9473,7 @@
       <w:pPr>
         <w:pStyle w:val="Heading2"/>
       </w:pPr>
-      <w:bookmarkStart w:id="2" w:name="_Toc237443362"/>
+      <w:bookmarkStart w:id="2" w:name="_Toc237451633"/>
       <w:r>
         <w:t xml:space="preserve">Основни концепт </w:t>
       </w:r>
@@ -9915,7 +10099,7 @@
           <w:rFonts w:ascii="Times New Roman" w:hAnsi="Times New Roman" w:cs="Times New Roman"/>
         </w:rPr>
       </w:pPr>
-      <w:bookmarkStart w:id="3" w:name="_Toc237443363"/>
+      <w:bookmarkStart w:id="3" w:name="_Toc237451634"/>
       <w:r>
         <w:rPr>
           <w:rFonts w:ascii="Times New Roman" w:hAnsi="Times New Roman" w:cs="Times New Roman"/>
@@ -9984,7 +10168,7 @@
           <w:rFonts w:ascii="Times New Roman" w:hAnsi="Times New Roman" w:cs="Times New Roman"/>
         </w:rPr>
       </w:pPr>
-      <w:bookmarkStart w:id="4" w:name="_Toc237443364"/>
+      <w:bookmarkStart w:id="4" w:name="_Toc237451635"/>
       <w:r>
         <w:rPr>
           <w:rFonts w:ascii="Times New Roman" w:hAnsi="Times New Roman" w:cs="Times New Roman"/>
@@ -10059,7 +10243,7 @@
       <w:pPr>
         <w:pStyle w:val="Heading3"/>
       </w:pPr>
-      <w:bookmarkStart w:id="5" w:name="_Toc237443365"/>
+      <w:bookmarkStart w:id="5" w:name="_Toc237451636"/>
       <w:r>
         <w:t>Поузданост</w:t>
       </w:r>
@@ -10615,7 +10799,7 @@
       <w:pPr>
         <w:pStyle w:val="Heading3"/>
       </w:pPr>
-      <w:bookmarkStart w:id="6" w:name="_Toc237443366"/>
+      <w:bookmarkStart w:id="6" w:name="_Toc237451637"/>
       <w:r>
         <w:t>Нулто знање</w:t>
       </w:r>
@@ -11403,7 +11587,7 @@
       <w:pPr>
         <w:pStyle w:val="Heading2"/>
       </w:pPr>
-      <w:bookmarkStart w:id="7" w:name="_Toc237443367"/>
+      <w:bookmarkStart w:id="7" w:name="_Toc237451638"/>
       <w:r>
         <w:lastRenderedPageBreak/>
         <w:t xml:space="preserve">Начин функционисања </w:t>
@@ -13159,10 +13343,9 @@
         <w:rPr>
           <w:i/>
           <w:iCs/>
-          <w:lang w:val="en-US"/>
-        </w:rPr>
-      </w:pPr>
-      <w:bookmarkStart w:id="8" w:name="_Toc237443368"/>
+        </w:rPr>
+      </w:pPr>
+      <w:bookmarkStart w:id="8" w:name="_Toc237451639"/>
       <w:r>
         <w:lastRenderedPageBreak/>
         <w:t xml:space="preserve">Интерактивни  </w:t>
@@ -13180,13 +13363,1019 @@
     <w:p>
       <w:pPr>
         <w:ind w:left="288"/>
-        <w:rPr>
-          <w:rFonts w:asciiTheme="majorHAnsi" w:eastAsiaTheme="majorEastAsia" w:hAnsiTheme="majorHAnsi" w:cstheme="majorBidi"/>
+        <w:jc w:val="both"/>
+        <w:rPr>
+          <w:rFonts w:ascii="Times New Roman" w:hAnsi="Times New Roman" w:cs="Times New Roman"/>
+          <w:sz w:val="24"/>
+          <w:szCs w:val="24"/>
+        </w:rPr>
+      </w:pPr>
+      <w:r>
+        <w:rPr>
+          <w:rFonts w:ascii="Times New Roman" w:hAnsi="Times New Roman" w:cs="Times New Roman"/>
+          <w:sz w:val="24"/>
+          <w:szCs w:val="24"/>
+        </w:rPr>
+        <w:t xml:space="preserve">Интерактивни </w:t>
+      </w:r>
+      <w:r>
+        <w:rPr>
+          <w:rFonts w:ascii="Times New Roman" w:hAnsi="Times New Roman" w:cs="Times New Roman"/>
+          <w:i/>
+          <w:iCs/>
+          <w:sz w:val="24"/>
+          <w:szCs w:val="24"/>
+        </w:rPr>
+        <w:t>Zero-Knowledge Proof</w:t>
+      </w:r>
+      <w:r>
+        <w:rPr>
+          <w:rFonts w:ascii="Times New Roman" w:hAnsi="Times New Roman" w:cs="Times New Roman"/>
+          <w:sz w:val="24"/>
+          <w:szCs w:val="24"/>
+        </w:rPr>
+        <w:t xml:space="preserve"> протоколи представљају протоколе код којих доказивач (</w:t>
+      </w:r>
+      <w:r>
+        <w:rPr>
+          <w:rFonts w:ascii="Times New Roman" w:hAnsi="Times New Roman" w:cs="Times New Roman"/>
+          <w:i/>
+          <w:iCs/>
+          <w:sz w:val="24"/>
+          <w:szCs w:val="24"/>
+        </w:rPr>
+        <w:t>prover</w:t>
+      </w:r>
+      <w:r>
+        <w:rPr>
+          <w:rFonts w:ascii="Times New Roman" w:hAnsi="Times New Roman" w:cs="Times New Roman"/>
+          <w:sz w:val="24"/>
+          <w:szCs w:val="24"/>
+        </w:rPr>
+        <w:t>) и провјерилац (</w:t>
+      </w:r>
+      <w:r>
+        <w:rPr>
+          <w:rFonts w:ascii="Times New Roman" w:hAnsi="Times New Roman" w:cs="Times New Roman"/>
+          <w:i/>
+          <w:iCs/>
+          <w:sz w:val="24"/>
+          <w:szCs w:val="24"/>
+        </w:rPr>
+        <w:t>verifier</w:t>
+      </w:r>
+      <w:r>
+        <w:rPr>
+          <w:rFonts w:ascii="Times New Roman" w:hAnsi="Times New Roman" w:cs="Times New Roman"/>
+          <w:sz w:val="24"/>
+          <w:szCs w:val="24"/>
+        </w:rPr>
+        <w:t>) међусобно комуницирају током процеса доказивања. За разлику од приступа код којих је довољно формирати доказ и прослиједити га на провјеру, код интерактивних протокола доказ се заснива на размјени више порука између учесника. Циљ ове комуникације је да доказивач увјери провјериоца да посједује одређену тајну информацију, без откривања саме информације.</w:t>
+      </w:r>
+    </w:p>
+    <w:p>
+      <w:pPr>
+        <w:ind w:left="288"/>
+        <w:jc w:val="both"/>
+        <w:rPr>
+          <w:rFonts w:ascii="Times New Roman" w:hAnsi="Times New Roman" w:cs="Times New Roman"/>
+          <w:sz w:val="24"/>
+          <w:szCs w:val="24"/>
+        </w:rPr>
+      </w:pPr>
+      <w:r>
+        <w:rPr>
+          <w:rFonts w:ascii="Times New Roman" w:hAnsi="Times New Roman" w:cs="Times New Roman"/>
+          <w:sz w:val="24"/>
+          <w:szCs w:val="24"/>
+        </w:rPr>
+        <w:t>Основни интерактивни протокол може се посматрати кроз три корака: формирање обавезе (</w:t>
+      </w:r>
+      <w:r>
+        <w:rPr>
+          <w:rFonts w:ascii="Times New Roman" w:hAnsi="Times New Roman" w:cs="Times New Roman"/>
+          <w:i/>
+          <w:iCs/>
+          <w:sz w:val="24"/>
+          <w:szCs w:val="24"/>
+        </w:rPr>
+        <w:t>commitment</w:t>
+      </w:r>
+      <w:r>
+        <w:rPr>
+          <w:rFonts w:ascii="Times New Roman" w:hAnsi="Times New Roman" w:cs="Times New Roman"/>
+          <w:sz w:val="24"/>
+          <w:szCs w:val="24"/>
+        </w:rPr>
+        <w:t>), задавање изазова (</w:t>
+      </w:r>
+      <w:r>
+        <w:rPr>
+          <w:rFonts w:ascii="Times New Roman" w:hAnsi="Times New Roman" w:cs="Times New Roman"/>
+          <w:i/>
+          <w:iCs/>
+          <w:sz w:val="24"/>
+          <w:szCs w:val="24"/>
+        </w:rPr>
+        <w:t>challenge</w:t>
+      </w:r>
+      <w:r>
+        <w:rPr>
+          <w:rFonts w:ascii="Times New Roman" w:hAnsi="Times New Roman" w:cs="Times New Roman"/>
+          <w:sz w:val="24"/>
+          <w:szCs w:val="24"/>
+        </w:rPr>
+        <w:t>) и слање одговора (</w:t>
+      </w:r>
+      <w:r>
+        <w:rPr>
+          <w:rFonts w:ascii="Times New Roman" w:hAnsi="Times New Roman" w:cs="Times New Roman"/>
+          <w:i/>
+          <w:iCs/>
+          <w:sz w:val="24"/>
+          <w:szCs w:val="24"/>
+        </w:rPr>
+        <w:t>response</w:t>
+      </w:r>
+      <w:r>
+        <w:rPr>
+          <w:rFonts w:ascii="Times New Roman" w:hAnsi="Times New Roman" w:cs="Times New Roman"/>
+          <w:sz w:val="24"/>
+          <w:szCs w:val="24"/>
+        </w:rPr>
+        <w:t>). На почетку доказивач на основу тајне коју посједује и случајно генерисане вриједности формира обавезу коју просљеђује провјериоцу. Ова вриједност не треба да омогући провјериоцу да на основу ње одреди тајну коју доказивач посједује.</w:t>
+      </w:r>
+    </w:p>
+    <w:p>
+      <w:pPr>
+        <w:ind w:left="288"/>
+        <w:jc w:val="both"/>
+        <w:rPr>
+          <w:rFonts w:ascii="Times New Roman" w:eastAsiaTheme="majorEastAsia" w:hAnsi="Times New Roman" w:cs="Times New Roman"/>
           <w:color w:val="000000" w:themeColor="text1"/>
-          <w:sz w:val="32"/>
-          <w:szCs w:val="32"/>
+          <w:sz w:val="24"/>
+          <w:szCs w:val="24"/>
+          <w:lang w:val="ru-RU"/>
+        </w:rPr>
+      </w:pPr>
+      <w:r>
+        <w:rPr>
+          <w:rFonts w:ascii="Times New Roman" w:eastAsiaTheme="majorEastAsia" w:hAnsi="Times New Roman" w:cs="Times New Roman"/>
+          <w:color w:val="000000" w:themeColor="text1"/>
+          <w:sz w:val="24"/>
+          <w:szCs w:val="24"/>
+        </w:rPr>
+        <w:t>Након пријема обавезе, провјерилац генерише случајни изазов и просљеђује га доказивачу. Доказивач користећи примљени изазов, своју тајну и претходно кориштене податке, формира одговор. На основу добијене обавезе, послатог изазова и примљеног одговора, провјерилац провјерава да ли је испуњен услов дефинисан конкретним протоколом и доноси одлуку о прихватању или одбијању доказа</w:t>
+      </w:r>
+      <w:r>
+        <w:rPr>
+          <w:rFonts w:ascii="Times New Roman" w:eastAsiaTheme="majorEastAsia" w:hAnsi="Times New Roman" w:cs="Times New Roman"/>
+          <w:color w:val="000000" w:themeColor="text1"/>
+          <w:sz w:val="24"/>
+          <w:szCs w:val="24"/>
+        </w:rPr>
+        <w:t>.</w:t>
+      </w:r>
+    </w:p>
+    <w:p>
+      <w:pPr>
+        <w:ind w:left="288"/>
+        <w:jc w:val="both"/>
+        <w:rPr>
+          <w:rFonts w:ascii="Times New Roman" w:eastAsiaTheme="majorEastAsia" w:hAnsi="Times New Roman" w:cs="Times New Roman"/>
+          <w:color w:val="000000" w:themeColor="text1"/>
+          <w:sz w:val="24"/>
+          <w:szCs w:val="24"/>
+          <w:lang w:val="ru-RU"/>
+        </w:rPr>
+      </w:pPr>
+      <w:r>
+        <w:rPr>
+          <w:rFonts w:ascii="Times New Roman" w:eastAsiaTheme="majorEastAsia" w:hAnsi="Times New Roman" w:cs="Times New Roman"/>
+          <w:color w:val="000000" w:themeColor="text1"/>
+          <w:sz w:val="24"/>
+          <w:szCs w:val="24"/>
+        </w:rPr>
+        <w:t>Основни ток комуникације између доказивача и провјериоца приказуј</w:t>
+      </w:r>
+      <w:r>
+        <w:rPr>
+          <w:rFonts w:ascii="Times New Roman" w:eastAsiaTheme="majorEastAsia" w:hAnsi="Times New Roman" w:cs="Times New Roman"/>
+          <w:color w:val="000000" w:themeColor="text1"/>
+          <w:sz w:val="24"/>
+          <w:szCs w:val="24"/>
+        </w:rPr>
+        <w:t>е</w:t>
+      </w:r>
+      <w:r>
+        <w:rPr>
+          <w:rFonts w:ascii="Times New Roman" w:eastAsiaTheme="majorEastAsia" w:hAnsi="Times New Roman" w:cs="Times New Roman"/>
+          <w:color w:val="000000" w:themeColor="text1"/>
+          <w:sz w:val="24"/>
+          <w:szCs w:val="24"/>
+          <w:lang w:val="ru-RU"/>
+        </w:rPr>
+        <w:t xml:space="preserve"> </w:t>
+      </w:r>
+      <w:r>
+        <w:rPr>
+          <w:rFonts w:ascii="Times New Roman" w:eastAsiaTheme="majorEastAsia" w:hAnsi="Times New Roman" w:cs="Times New Roman"/>
+          <w:color w:val="000000" w:themeColor="text1"/>
+          <w:sz w:val="24"/>
+          <w:szCs w:val="24"/>
+          <w:lang w:val="ru-RU"/>
+        </w:rPr>
+        <w:fldChar w:fldCharType="begin"/>
+      </w:r>
+      <w:r>
+        <w:rPr>
+          <w:rFonts w:ascii="Times New Roman" w:eastAsiaTheme="majorEastAsia" w:hAnsi="Times New Roman" w:cs="Times New Roman"/>
+          <w:color w:val="000000" w:themeColor="text1"/>
+          <w:sz w:val="24"/>
+          <w:szCs w:val="24"/>
+          <w:lang w:val="ru-RU"/>
+        </w:rPr>
+        <w:instrText xml:space="preserve"> REF _Ref237452808 \h </w:instrText>
+      </w:r>
+      <w:r>
+        <w:rPr>
+          <w:rFonts w:ascii="Times New Roman" w:eastAsiaTheme="majorEastAsia" w:hAnsi="Times New Roman" w:cs="Times New Roman"/>
+          <w:color w:val="000000" w:themeColor="text1"/>
+          <w:sz w:val="24"/>
+          <w:szCs w:val="24"/>
+          <w:lang w:val="ru-RU"/>
+        </w:rPr>
+      </w:r>
+      <w:r>
+        <w:rPr>
+          <w:rFonts w:ascii="Times New Roman" w:eastAsiaTheme="majorEastAsia" w:hAnsi="Times New Roman" w:cs="Times New Roman"/>
+          <w:color w:val="000000" w:themeColor="text1"/>
+          <w:sz w:val="24"/>
+          <w:szCs w:val="24"/>
+          <w:lang w:val="ru-RU"/>
+        </w:rPr>
+        <w:instrText xml:space="preserve"> \* MERGEFORMAT </w:instrText>
+      </w:r>
+      <w:r>
+        <w:rPr>
+          <w:rFonts w:ascii="Times New Roman" w:eastAsiaTheme="majorEastAsia" w:hAnsi="Times New Roman" w:cs="Times New Roman"/>
+          <w:color w:val="000000" w:themeColor="text1"/>
+          <w:sz w:val="24"/>
+          <w:szCs w:val="24"/>
+          <w:lang w:val="ru-RU"/>
+        </w:rPr>
+        <w:fldChar w:fldCharType="separate"/>
+      </w:r>
+      <w:r>
+        <w:rPr>
+          <w:rFonts w:ascii="Times New Roman" w:hAnsi="Times New Roman" w:cs="Times New Roman"/>
+          <w:sz w:val="24"/>
+          <w:szCs w:val="24"/>
+        </w:rPr>
+        <w:t>Сли</w:t>
+      </w:r>
+      <w:r>
+        <w:rPr>
+          <w:rFonts w:ascii="Times New Roman" w:hAnsi="Times New Roman" w:cs="Times New Roman"/>
+          <w:sz w:val="24"/>
+          <w:szCs w:val="24"/>
+        </w:rPr>
+        <w:t>к</w:t>
+      </w:r>
+      <w:r>
+        <w:rPr>
+          <w:rFonts w:ascii="Times New Roman" w:hAnsi="Times New Roman" w:cs="Times New Roman"/>
+          <w:sz w:val="24"/>
+          <w:szCs w:val="24"/>
+        </w:rPr>
+        <w:t>а</w:t>
+      </w:r>
+      <w:r>
+        <w:rPr>
+          <w:rFonts w:ascii="Times New Roman" w:hAnsi="Times New Roman" w:cs="Times New Roman"/>
+          <w:sz w:val="24"/>
+          <w:szCs w:val="24"/>
+        </w:rPr>
+        <w:t xml:space="preserve"> </w:t>
+      </w:r>
+      <w:r>
+        <w:rPr>
+          <w:rFonts w:ascii="Times New Roman" w:hAnsi="Times New Roman" w:cs="Times New Roman"/>
+          <w:noProof/>
+          <w:sz w:val="24"/>
+          <w:szCs w:val="24"/>
+        </w:rPr>
+        <w:t>1</w:t>
+      </w:r>
+      <w:r>
+        <w:rPr>
+          <w:rFonts w:ascii="Times New Roman" w:eastAsiaTheme="majorEastAsia" w:hAnsi="Times New Roman" w:cs="Times New Roman"/>
+          <w:color w:val="000000" w:themeColor="text1"/>
+          <w:sz w:val="24"/>
+          <w:szCs w:val="24"/>
+          <w:lang w:val="ru-RU"/>
+        </w:rPr>
+        <w:fldChar w:fldCharType="end"/>
+      </w:r>
+      <w:r>
+        <w:rPr>
+          <w:rFonts w:ascii="Times New Roman" w:eastAsiaTheme="majorEastAsia" w:hAnsi="Times New Roman" w:cs="Times New Roman"/>
+          <w:color w:val="000000" w:themeColor="text1"/>
+          <w:sz w:val="24"/>
+          <w:szCs w:val="24"/>
+        </w:rPr>
+        <w:t>.</w:t>
+      </w:r>
+    </w:p>
+    <w:p>
+      <w:pPr>
+        <w:keepNext/>
+        <w:ind w:left="288"/>
+        <w:jc w:val="center"/>
+      </w:pPr>
+      <w:r>
+        <w:rPr>
+          <w:rFonts w:ascii="Times New Roman" w:eastAsiaTheme="majorEastAsia" w:hAnsi="Times New Roman" w:cs="Times New Roman"/>
+          <w:noProof/>
+          <w:color w:val="000000" w:themeColor="text1"/>
+          <w:sz w:val="24"/>
+          <w:szCs w:val="24"/>
           <w:lang w:val="en-US"/>
         </w:rPr>
+        <w:drawing>
+          <wp:inline distT="0" distB="0" distL="0" distR="0" wp14:anchorId="570FC397" wp14:editId="1E629C96">
+            <wp:extent cx="2962656" cy="1929384"/>
+            <wp:effectExtent l="0" t="0" r="0" b="0"/>
+            <wp:docPr id="684311600" name="Picture 3"/>
+            <wp:cNvGraphicFramePr>
+              <a:graphicFrameLocks xmlns:a="http://schemas.openxmlformats.org/drawingml/2006/main" noChangeAspect="1"/>
+            </wp:cNvGraphicFramePr>
+            <a:graphic xmlns:a="http://schemas.openxmlformats.org/drawingml/2006/main">
+              <a:graphicData uri="http://schemas.openxmlformats.org/drawingml/2006/picture">
+                <pic:pic xmlns:pic="http://schemas.openxmlformats.org/drawingml/2006/picture">
+                  <pic:nvPicPr>
+                    <pic:cNvPr id="684311600" name="Picture 684311600"/>
+                    <pic:cNvPicPr/>
+                  </pic:nvPicPr>
+                  <pic:blipFill>
+                    <a:blip r:embed="rId31" cstate="print">
+                      <a:extLst>
+                        <a:ext uri="{28A0092B-C50C-407E-A947-70E740481C1C}">
+                          <a14:useLocalDpi xmlns:a14="http://schemas.microsoft.com/office/drawing/2010/main" val="0"/>
+                        </a:ext>
+                      </a:extLst>
+                    </a:blip>
+                    <a:stretch>
+                      <a:fillRect/>
+                    </a:stretch>
+                  </pic:blipFill>
+                  <pic:spPr>
+                    <a:xfrm>
+                      <a:off x="0" y="0"/>
+                      <a:ext cx="2962656" cy="1929384"/>
+                    </a:xfrm>
+                    <a:prstGeom prst="rect">
+                      <a:avLst/>
+                    </a:prstGeom>
+                  </pic:spPr>
+                </pic:pic>
+              </a:graphicData>
+            </a:graphic>
+          </wp:inline>
+        </w:drawing>
+      </w:r>
+    </w:p>
+    <w:p>
+      <w:pPr>
+        <w:pStyle w:val="Caption"/>
+        <w:ind w:firstLine="288"/>
+        <w:jc w:val="center"/>
+        <w:rPr>
+          <w:rFonts w:ascii="Times New Roman" w:hAnsi="Times New Roman" w:cs="Times New Roman"/>
+          <w:i w:val="0"/>
+          <w:iCs w:val="0"/>
+          <w:sz w:val="24"/>
+          <w:szCs w:val="24"/>
+        </w:rPr>
+      </w:pPr>
+      <w:bookmarkStart w:id="9" w:name="_Ref237452802"/>
+      <w:bookmarkStart w:id="10" w:name="_Ref237452808"/>
+      <w:r>
+        <w:rPr>
+          <w:rFonts w:ascii="Times New Roman" w:hAnsi="Times New Roman" w:cs="Times New Roman"/>
+          <w:i w:val="0"/>
+          <w:iCs w:val="0"/>
+          <w:sz w:val="24"/>
+          <w:szCs w:val="24"/>
+        </w:rPr>
+        <w:t xml:space="preserve">Слика </w:t>
+      </w:r>
+      <w:r>
+        <w:rPr>
+          <w:rFonts w:ascii="Times New Roman" w:hAnsi="Times New Roman" w:cs="Times New Roman"/>
+          <w:i w:val="0"/>
+          <w:iCs w:val="0"/>
+          <w:sz w:val="24"/>
+          <w:szCs w:val="24"/>
+        </w:rPr>
+        <w:fldChar w:fldCharType="begin"/>
+      </w:r>
+      <w:r>
+        <w:rPr>
+          <w:rFonts w:ascii="Times New Roman" w:hAnsi="Times New Roman" w:cs="Times New Roman"/>
+          <w:i w:val="0"/>
+          <w:iCs w:val="0"/>
+          <w:sz w:val="24"/>
+          <w:szCs w:val="24"/>
+        </w:rPr>
+        <w:instrText xml:space="preserve"> SEQ Слика \* ARABIC </w:instrText>
+      </w:r>
+      <w:r>
+        <w:rPr>
+          <w:rFonts w:ascii="Times New Roman" w:hAnsi="Times New Roman" w:cs="Times New Roman"/>
+          <w:i w:val="0"/>
+          <w:iCs w:val="0"/>
+          <w:sz w:val="24"/>
+          <w:szCs w:val="24"/>
+        </w:rPr>
+        <w:fldChar w:fldCharType="separate"/>
+      </w:r>
+      <w:r>
+        <w:rPr>
+          <w:rFonts w:ascii="Times New Roman" w:hAnsi="Times New Roman" w:cs="Times New Roman"/>
+          <w:i w:val="0"/>
+          <w:iCs w:val="0"/>
+          <w:noProof/>
+          <w:sz w:val="24"/>
+          <w:szCs w:val="24"/>
+        </w:rPr>
+        <w:t>1</w:t>
+      </w:r>
+      <w:r>
+        <w:rPr>
+          <w:rFonts w:ascii="Times New Roman" w:hAnsi="Times New Roman" w:cs="Times New Roman"/>
+          <w:i w:val="0"/>
+          <w:iCs w:val="0"/>
+          <w:sz w:val="24"/>
+          <w:szCs w:val="24"/>
+        </w:rPr>
+        <w:fldChar w:fldCharType="end"/>
+      </w:r>
+      <w:bookmarkEnd w:id="10"/>
+      <w:r>
+        <w:rPr>
+          <w:rFonts w:ascii="Times New Roman" w:hAnsi="Times New Roman" w:cs="Times New Roman"/>
+          <w:i w:val="0"/>
+          <w:iCs w:val="0"/>
+          <w:sz w:val="24"/>
+          <w:szCs w:val="24"/>
+        </w:rPr>
+        <w:t>.</w:t>
+      </w:r>
+      <w:r>
+        <w:rPr>
+          <w:rFonts w:ascii="Times New Roman" w:hAnsi="Times New Roman" w:cs="Times New Roman"/>
+          <w:i w:val="0"/>
+          <w:iCs w:val="0"/>
+          <w:sz w:val="24"/>
+          <w:szCs w:val="24"/>
+        </w:rPr>
+        <w:t xml:space="preserve">  Интеракција између доказивача и провјериоца код интерактивног ZKP протокола (ауторски приказ према [7])</w:t>
+      </w:r>
+      <w:bookmarkEnd w:id="9"/>
+    </w:p>
+    <w:p>
+      <w:pPr>
+        <w:ind w:left="288"/>
+        <w:jc w:val="both"/>
+        <w:rPr>
+          <w:rFonts w:ascii="Times New Roman" w:eastAsiaTheme="majorEastAsia" w:hAnsi="Times New Roman" w:cs="Times New Roman"/>
+          <w:color w:val="000000" w:themeColor="text1"/>
+          <w:sz w:val="24"/>
+          <w:szCs w:val="24"/>
+        </w:rPr>
+      </w:pPr>
+      <w:r>
+        <w:rPr>
+          <w:rFonts w:ascii="Times New Roman" w:eastAsiaTheme="majorEastAsia" w:hAnsi="Times New Roman" w:cs="Times New Roman"/>
+          <w:color w:val="000000" w:themeColor="text1"/>
+          <w:sz w:val="24"/>
+          <w:szCs w:val="24"/>
+        </w:rPr>
+        <w:t>Једна интеракција између доказивача и провјериоца не мора увијек бити довољна да обезбиједи жељени ниво сигурности. У зависности од протокола, поступак се може поновити више пута са различитим случајно изабраним изазовима. Сваким успјешним понављањем смањује се вјероватноћа да доказивач који не посједује одговарајућу тајну успјешно увјери провјериоца у исправност своје тврдње</w:t>
+      </w:r>
+      <w:r>
+        <w:rPr>
+          <w:rFonts w:ascii="Times New Roman" w:eastAsiaTheme="majorEastAsia" w:hAnsi="Times New Roman" w:cs="Times New Roman"/>
+          <w:color w:val="000000" w:themeColor="text1"/>
+          <w:sz w:val="24"/>
+          <w:szCs w:val="24"/>
+        </w:rPr>
+        <w:t>.</w:t>
+      </w:r>
+    </w:p>
+    <w:p>
+      <w:pPr>
+        <w:ind w:left="288"/>
+        <w:jc w:val="both"/>
+        <w:rPr>
+          <w:rFonts w:ascii="Times New Roman" w:eastAsiaTheme="majorEastAsia" w:hAnsi="Times New Roman" w:cs="Times New Roman"/>
+          <w:color w:val="000000" w:themeColor="text1"/>
+          <w:sz w:val="24"/>
+          <w:szCs w:val="24"/>
+        </w:rPr>
+      </w:pPr>
+      <w:r>
+        <w:rPr>
+          <w:rFonts w:ascii="Times New Roman" w:eastAsiaTheme="majorEastAsia" w:hAnsi="Times New Roman" w:cs="Times New Roman"/>
+          <w:color w:val="000000" w:themeColor="text1"/>
+          <w:sz w:val="24"/>
+          <w:szCs w:val="24"/>
+        </w:rPr>
+        <w:t>Важну улогу у оваквим протоколима има случајност изазова који генерише провјерилац. Доказивач не треба унапријед да зна који ће изазов добити, јер би у супротном могао припремити одговор без стварног посједовања информације чије знање доказује. Изазов се генерише тек након што је доказивач формирао и послао обавезу, чиме се спречава прилагођавање почетне поруке конкретном изазову.</w:t>
+      </w:r>
+    </w:p>
+    <w:p>
+      <w:pPr>
+        <w:ind w:left="288"/>
+        <w:jc w:val="both"/>
+        <w:rPr>
+          <w:rFonts w:ascii="Times New Roman" w:eastAsiaTheme="majorEastAsia" w:hAnsi="Times New Roman" w:cs="Times New Roman"/>
+          <w:color w:val="000000" w:themeColor="text1"/>
+          <w:sz w:val="24"/>
+          <w:szCs w:val="24"/>
+        </w:rPr>
+      </w:pPr>
+      <w:r>
+        <w:rPr>
+          <w:rFonts w:ascii="Times New Roman" w:eastAsiaTheme="majorEastAsia" w:hAnsi="Times New Roman" w:cs="Times New Roman"/>
+          <w:color w:val="000000" w:themeColor="text1"/>
+          <w:sz w:val="24"/>
+          <w:szCs w:val="24"/>
+        </w:rPr>
+        <w:t xml:space="preserve">Један од познатих примјера интерактивног доказивања знања представља Schnorr протокол. Код овог протокола доказивач доказује познавање приватне вриједности која одговара јавно доступној вриједности, без откривања саме приватне вриједности. </w:t>
+      </w:r>
+      <w:r>
+        <w:rPr>
+          <w:rFonts w:ascii="Times New Roman" w:eastAsiaTheme="majorEastAsia" w:hAnsi="Times New Roman" w:cs="Times New Roman"/>
+          <w:color w:val="000000" w:themeColor="text1"/>
+          <w:sz w:val="24"/>
+          <w:szCs w:val="24"/>
+        </w:rPr>
+        <w:lastRenderedPageBreak/>
+        <w:t>Комуникација се такође заснива на размјени обавезе, случајног изазова и одговора, након чега провјерилац математичком провјером утврђује исправност доказа</w:t>
+      </w:r>
+      <w:r>
+        <w:rPr>
+          <w:rFonts w:ascii="Times New Roman" w:eastAsiaTheme="majorEastAsia" w:hAnsi="Times New Roman" w:cs="Times New Roman"/>
+          <w:color w:val="000000" w:themeColor="text1"/>
+          <w:sz w:val="24"/>
+          <w:szCs w:val="24"/>
+          <w:lang w:val="ru-RU"/>
+        </w:rPr>
+        <w:t xml:space="preserve"> </w:t>
+      </w:r>
+      <w:r>
+        <w:rPr>
+          <w:rFonts w:ascii="Times New Roman" w:eastAsiaTheme="majorEastAsia" w:hAnsi="Times New Roman" w:cs="Times New Roman"/>
+          <w:color w:val="000000" w:themeColor="text1"/>
+          <w:sz w:val="24"/>
+          <w:szCs w:val="24"/>
+          <w:lang w:val="ru-RU"/>
+        </w:rPr>
+        <w:fldChar w:fldCharType="begin"/>
+      </w:r>
+      <w:r>
+        <w:rPr>
+          <w:rFonts w:ascii="Times New Roman" w:eastAsiaTheme="majorEastAsia" w:hAnsi="Times New Roman" w:cs="Times New Roman"/>
+          <w:color w:val="000000" w:themeColor="text1"/>
+          <w:sz w:val="24"/>
+          <w:szCs w:val="24"/>
+          <w:lang w:val="ru-RU"/>
+        </w:rPr>
+        <w:instrText xml:space="preserve"> REF _Ref237451559 \r \h </w:instrText>
+      </w:r>
+      <w:r>
+        <w:rPr>
+          <w:rFonts w:ascii="Times New Roman" w:eastAsiaTheme="majorEastAsia" w:hAnsi="Times New Roman" w:cs="Times New Roman"/>
+          <w:color w:val="000000" w:themeColor="text1"/>
+          <w:sz w:val="24"/>
+          <w:szCs w:val="24"/>
+          <w:lang w:val="ru-RU"/>
+        </w:rPr>
+      </w:r>
+      <w:r>
+        <w:rPr>
+          <w:rFonts w:ascii="Times New Roman" w:eastAsiaTheme="majorEastAsia" w:hAnsi="Times New Roman" w:cs="Times New Roman"/>
+          <w:color w:val="000000" w:themeColor="text1"/>
+          <w:sz w:val="24"/>
+          <w:szCs w:val="24"/>
+          <w:lang w:val="ru-RU"/>
+        </w:rPr>
+        <w:fldChar w:fldCharType="separate"/>
+      </w:r>
+      <w:r>
+        <w:rPr>
+          <w:rFonts w:ascii="Times New Roman" w:eastAsiaTheme="majorEastAsia" w:hAnsi="Times New Roman" w:cs="Times New Roman"/>
+          <w:color w:val="000000" w:themeColor="text1"/>
+          <w:sz w:val="24"/>
+          <w:szCs w:val="24"/>
+          <w:lang w:val="ru-RU"/>
+        </w:rPr>
+        <w:t>[7]</w:t>
+      </w:r>
+      <w:r>
+        <w:rPr>
+          <w:rFonts w:ascii="Times New Roman" w:eastAsiaTheme="majorEastAsia" w:hAnsi="Times New Roman" w:cs="Times New Roman"/>
+          <w:color w:val="000000" w:themeColor="text1"/>
+          <w:sz w:val="24"/>
+          <w:szCs w:val="24"/>
+          <w:lang w:val="ru-RU"/>
+        </w:rPr>
+        <w:fldChar w:fldCharType="end"/>
+      </w:r>
+      <w:r>
+        <w:rPr>
+          <w:rFonts w:ascii="Times New Roman" w:eastAsiaTheme="majorEastAsia" w:hAnsi="Times New Roman" w:cs="Times New Roman"/>
+          <w:color w:val="000000" w:themeColor="text1"/>
+          <w:sz w:val="24"/>
+          <w:szCs w:val="24"/>
+        </w:rPr>
+        <w:t>.</w:t>
+      </w:r>
+    </w:p>
+    <w:p>
+      <w:pPr>
+        <w:ind w:left="288"/>
+        <w:jc w:val="both"/>
+        <w:rPr>
+          <w:rFonts w:ascii="Times New Roman" w:eastAsiaTheme="majorEastAsia" w:hAnsi="Times New Roman" w:cs="Times New Roman"/>
+          <w:color w:val="000000" w:themeColor="text1"/>
+          <w:sz w:val="24"/>
+          <w:szCs w:val="24"/>
+        </w:rPr>
+      </w:pPr>
+      <w:r>
+        <w:rPr>
+          <w:rFonts w:ascii="Times New Roman" w:eastAsiaTheme="majorEastAsia" w:hAnsi="Times New Roman" w:cs="Times New Roman"/>
+          <w:color w:val="000000" w:themeColor="text1"/>
+          <w:sz w:val="24"/>
+          <w:szCs w:val="24"/>
+        </w:rPr>
+        <w:t>Предност интерактивних ZKP протокола огледа се у томе што провјерилац активно учествује у процесу доказивања и генерисањем непредвидивог изазова утиче на формирање доказа. Међутим, потреба за размјеном више порука може представљати недостатак у дистрибуираним системима, јер повећава број комуникационих корака између учесника.</w:t>
+      </w:r>
+    </w:p>
+    <w:p>
+      <w:pPr>
+        <w:ind w:left="288"/>
+        <w:jc w:val="both"/>
+        <w:rPr>
+          <w:rFonts w:ascii="Times New Roman" w:eastAsiaTheme="majorEastAsia" w:hAnsi="Times New Roman" w:cs="Times New Roman"/>
+          <w:color w:val="000000" w:themeColor="text1"/>
+          <w:sz w:val="24"/>
+          <w:szCs w:val="24"/>
+        </w:rPr>
+      </w:pPr>
+      <w:r>
+        <w:rPr>
+          <w:rFonts w:ascii="Times New Roman" w:eastAsiaTheme="majorEastAsia" w:hAnsi="Times New Roman" w:cs="Times New Roman"/>
+          <w:color w:val="000000" w:themeColor="text1"/>
+          <w:sz w:val="24"/>
+          <w:szCs w:val="24"/>
+        </w:rPr>
+        <w:t xml:space="preserve">Да би се смањила потреба за оваквом интеракцијом, развијени су неинтерактивни </w:t>
+      </w:r>
+      <w:r>
+        <w:rPr>
+          <w:rFonts w:ascii="Times New Roman" w:eastAsiaTheme="majorEastAsia" w:hAnsi="Times New Roman" w:cs="Times New Roman"/>
+          <w:i/>
+          <w:iCs/>
+          <w:color w:val="000000" w:themeColor="text1"/>
+          <w:sz w:val="24"/>
+          <w:szCs w:val="24"/>
+        </w:rPr>
+        <w:t>Zero-Knowledge Proof</w:t>
+      </w:r>
+      <w:r>
+        <w:rPr>
+          <w:rFonts w:ascii="Times New Roman" w:eastAsiaTheme="majorEastAsia" w:hAnsi="Times New Roman" w:cs="Times New Roman"/>
+          <w:color w:val="000000" w:themeColor="text1"/>
+          <w:sz w:val="24"/>
+          <w:szCs w:val="24"/>
+        </w:rPr>
+        <w:t xml:space="preserve"> протоколи код којих доказивач може формирати доказ који се касније провјерава без размјене више порука са провјериоцем. Ова врста протокола биће детаљније описана у наредном поглављу.</w:t>
+      </w:r>
+    </w:p>
+    <w:p>
+      <w:pPr>
+        <w:ind w:left="288"/>
+        <w:jc w:val="both"/>
+        <w:rPr>
+          <w:rFonts w:ascii="Times New Roman" w:eastAsiaTheme="majorEastAsia" w:hAnsi="Times New Roman" w:cs="Times New Roman"/>
+          <w:color w:val="000000" w:themeColor="text1"/>
+          <w:sz w:val="24"/>
+          <w:szCs w:val="24"/>
+          <w:lang w:val="en-US"/>
+        </w:rPr>
+      </w:pPr>
+    </w:p>
+    <w:p>
+      <w:pPr>
+        <w:ind w:left="288"/>
+        <w:jc w:val="both"/>
+        <w:rPr>
+          <w:rFonts w:ascii="Times New Roman" w:eastAsiaTheme="majorEastAsia" w:hAnsi="Times New Roman" w:cs="Times New Roman"/>
+          <w:color w:val="000000" w:themeColor="text1"/>
+          <w:sz w:val="24"/>
+          <w:szCs w:val="24"/>
+          <w:lang w:val="en-US"/>
+        </w:rPr>
+      </w:pPr>
+    </w:p>
+    <w:p>
+      <w:pPr>
+        <w:ind w:left="288"/>
+        <w:jc w:val="both"/>
+        <w:rPr>
+          <w:rFonts w:ascii="Times New Roman" w:eastAsiaTheme="majorEastAsia" w:hAnsi="Times New Roman" w:cs="Times New Roman"/>
+          <w:color w:val="000000" w:themeColor="text1"/>
+          <w:sz w:val="24"/>
+          <w:szCs w:val="24"/>
+          <w:lang w:val="en-US"/>
+        </w:rPr>
+      </w:pPr>
+    </w:p>
+    <w:p>
+      <w:pPr>
+        <w:ind w:left="288"/>
+        <w:jc w:val="both"/>
+        <w:rPr>
+          <w:rFonts w:ascii="Times New Roman" w:eastAsiaTheme="majorEastAsia" w:hAnsi="Times New Roman" w:cs="Times New Roman"/>
+          <w:color w:val="000000" w:themeColor="text1"/>
+          <w:sz w:val="24"/>
+          <w:szCs w:val="24"/>
+          <w:lang w:val="en-US"/>
+        </w:rPr>
+      </w:pPr>
+    </w:p>
+    <w:p>
+      <w:pPr>
+        <w:ind w:left="288"/>
+        <w:jc w:val="both"/>
+        <w:rPr>
+          <w:rFonts w:ascii="Times New Roman" w:eastAsiaTheme="majorEastAsia" w:hAnsi="Times New Roman" w:cs="Times New Roman"/>
+          <w:color w:val="000000" w:themeColor="text1"/>
+          <w:sz w:val="24"/>
+          <w:szCs w:val="24"/>
+          <w:lang w:val="en-US"/>
+        </w:rPr>
+      </w:pPr>
+    </w:p>
+    <w:p>
+      <w:pPr>
+        <w:ind w:left="288"/>
+        <w:jc w:val="both"/>
+        <w:rPr>
+          <w:rFonts w:ascii="Times New Roman" w:eastAsiaTheme="majorEastAsia" w:hAnsi="Times New Roman" w:cs="Times New Roman"/>
+          <w:color w:val="000000" w:themeColor="text1"/>
+          <w:sz w:val="24"/>
+          <w:szCs w:val="24"/>
+          <w:lang w:val="en-US"/>
+        </w:rPr>
+      </w:pPr>
+    </w:p>
+    <w:p>
+      <w:pPr>
+        <w:ind w:left="288"/>
+        <w:jc w:val="both"/>
+        <w:rPr>
+          <w:rFonts w:ascii="Times New Roman" w:eastAsiaTheme="majorEastAsia" w:hAnsi="Times New Roman" w:cs="Times New Roman"/>
+          <w:color w:val="000000" w:themeColor="text1"/>
+          <w:sz w:val="24"/>
+          <w:szCs w:val="24"/>
+          <w:lang w:val="en-US"/>
+        </w:rPr>
+      </w:pPr>
+    </w:p>
+    <w:p>
+      <w:pPr>
+        <w:ind w:left="288"/>
+        <w:jc w:val="both"/>
+        <w:rPr>
+          <w:rFonts w:ascii="Times New Roman" w:eastAsiaTheme="majorEastAsia" w:hAnsi="Times New Roman" w:cs="Times New Roman"/>
+          <w:color w:val="000000" w:themeColor="text1"/>
+          <w:sz w:val="24"/>
+          <w:szCs w:val="24"/>
+          <w:lang w:val="en-US"/>
+        </w:rPr>
+      </w:pPr>
+    </w:p>
+    <w:p>
+      <w:pPr>
+        <w:ind w:left="288"/>
+        <w:jc w:val="both"/>
+        <w:rPr>
+          <w:rFonts w:ascii="Times New Roman" w:eastAsiaTheme="majorEastAsia" w:hAnsi="Times New Roman" w:cs="Times New Roman"/>
+          <w:color w:val="000000" w:themeColor="text1"/>
+          <w:sz w:val="24"/>
+          <w:szCs w:val="24"/>
+          <w:lang w:val="en-US"/>
+        </w:rPr>
+      </w:pPr>
+    </w:p>
+    <w:p>
+      <w:pPr>
+        <w:ind w:left="288"/>
+        <w:jc w:val="both"/>
+        <w:rPr>
+          <w:rFonts w:ascii="Times New Roman" w:eastAsiaTheme="majorEastAsia" w:hAnsi="Times New Roman" w:cs="Times New Roman"/>
+          <w:color w:val="000000" w:themeColor="text1"/>
+          <w:sz w:val="24"/>
+          <w:szCs w:val="24"/>
+          <w:lang w:val="en-US"/>
+        </w:rPr>
+      </w:pPr>
+    </w:p>
+    <w:p>
+      <w:pPr>
+        <w:ind w:left="288"/>
+        <w:jc w:val="both"/>
+        <w:rPr>
+          <w:rFonts w:ascii="Times New Roman" w:eastAsiaTheme="majorEastAsia" w:hAnsi="Times New Roman" w:cs="Times New Roman"/>
+          <w:color w:val="000000" w:themeColor="text1"/>
+          <w:sz w:val="24"/>
+          <w:szCs w:val="24"/>
+          <w:lang w:val="en-US"/>
+        </w:rPr>
+      </w:pPr>
+    </w:p>
+    <w:p>
+      <w:pPr>
+        <w:ind w:left="288"/>
+        <w:jc w:val="both"/>
+        <w:rPr>
+          <w:rFonts w:ascii="Times New Roman" w:eastAsiaTheme="majorEastAsia" w:hAnsi="Times New Roman" w:cs="Times New Roman"/>
+          <w:color w:val="000000" w:themeColor="text1"/>
+          <w:sz w:val="24"/>
+          <w:szCs w:val="24"/>
+          <w:lang w:val="en-US"/>
+        </w:rPr>
+      </w:pPr>
+    </w:p>
+    <w:p>
+      <w:pPr>
+        <w:ind w:left="288"/>
+        <w:jc w:val="both"/>
+        <w:rPr>
+          <w:rFonts w:ascii="Times New Roman" w:eastAsiaTheme="majorEastAsia" w:hAnsi="Times New Roman" w:cs="Times New Roman"/>
+          <w:color w:val="000000" w:themeColor="text1"/>
+          <w:sz w:val="24"/>
+          <w:szCs w:val="24"/>
+          <w:lang w:val="en-US"/>
+        </w:rPr>
+      </w:pPr>
+    </w:p>
+    <w:p>
+      <w:pPr>
+        <w:ind w:left="288"/>
+        <w:jc w:val="both"/>
+        <w:rPr>
+          <w:rFonts w:ascii="Times New Roman" w:eastAsiaTheme="majorEastAsia" w:hAnsi="Times New Roman" w:cs="Times New Roman"/>
+          <w:color w:val="000000" w:themeColor="text1"/>
+          <w:sz w:val="24"/>
+          <w:szCs w:val="24"/>
+          <w:lang w:val="en-US"/>
+        </w:rPr>
+      </w:pPr>
+    </w:p>
+    <w:p>
+      <w:pPr>
+        <w:ind w:left="288"/>
+        <w:jc w:val="both"/>
+        <w:rPr>
+          <w:rFonts w:ascii="Times New Roman" w:eastAsiaTheme="majorEastAsia" w:hAnsi="Times New Roman" w:cs="Times New Roman"/>
+          <w:color w:val="000000" w:themeColor="text1"/>
+          <w:sz w:val="24"/>
+          <w:szCs w:val="24"/>
+          <w:lang w:val="en-US"/>
+        </w:rPr>
+      </w:pPr>
+    </w:p>
+    <w:p>
+      <w:pPr>
+        <w:ind w:left="288"/>
+        <w:jc w:val="both"/>
+        <w:rPr>
+          <w:rFonts w:ascii="Times New Roman" w:eastAsiaTheme="majorEastAsia" w:hAnsi="Times New Roman" w:cs="Times New Roman"/>
+          <w:color w:val="000000" w:themeColor="text1"/>
+          <w:sz w:val="24"/>
+          <w:szCs w:val="24"/>
+          <w:lang w:val="en-US"/>
+        </w:rPr>
+      </w:pPr>
+    </w:p>
+    <w:p>
+      <w:pPr>
+        <w:ind w:left="288"/>
+        <w:jc w:val="both"/>
+        <w:rPr>
+          <w:rFonts w:ascii="Times New Roman" w:eastAsiaTheme="majorEastAsia" w:hAnsi="Times New Roman" w:cs="Times New Roman"/>
+          <w:color w:val="000000" w:themeColor="text1"/>
+          <w:sz w:val="24"/>
+          <w:szCs w:val="24"/>
+          <w:lang w:val="en-US"/>
+        </w:rPr>
+      </w:pPr>
+    </w:p>
+    <w:p>
+      <w:pPr>
+        <w:ind w:left="288"/>
+        <w:jc w:val="both"/>
+        <w:rPr>
+          <w:rFonts w:ascii="Times New Roman" w:eastAsiaTheme="majorEastAsia" w:hAnsi="Times New Roman" w:cs="Times New Roman"/>
+          <w:color w:val="000000" w:themeColor="text1"/>
+          <w:sz w:val="24"/>
+          <w:szCs w:val="24"/>
+          <w:lang w:val="en-US"/>
+        </w:rPr>
+      </w:pPr>
+    </w:p>
+    <w:p>
+      <w:pPr>
+        <w:ind w:left="288"/>
+        <w:jc w:val="both"/>
+        <w:rPr>
+          <w:rFonts w:ascii="Times New Roman" w:eastAsiaTheme="majorEastAsia" w:hAnsi="Times New Roman" w:cs="Times New Roman"/>
+          <w:color w:val="000000" w:themeColor="text1"/>
+          <w:sz w:val="24"/>
+          <w:szCs w:val="24"/>
+          <w:lang w:val="en-US"/>
+        </w:rPr>
+      </w:pPr>
+    </w:p>
+    <w:p>
+      <w:pPr>
+        <w:ind w:left="288"/>
+        <w:jc w:val="both"/>
+        <w:rPr>
+          <w:rFonts w:ascii="Times New Roman" w:eastAsiaTheme="majorEastAsia" w:hAnsi="Times New Roman" w:cs="Times New Roman"/>
+          <w:color w:val="000000" w:themeColor="text1"/>
+          <w:sz w:val="24"/>
+          <w:szCs w:val="24"/>
+          <w:lang w:val="en-US"/>
+        </w:rPr>
+      </w:pPr>
+    </w:p>
+    <w:p>
+      <w:pPr>
+        <w:ind w:left="288"/>
+        <w:jc w:val="both"/>
+        <w:rPr>
+          <w:rFonts w:ascii="Times New Roman" w:eastAsiaTheme="majorEastAsia" w:hAnsi="Times New Roman" w:cs="Times New Roman"/>
+          <w:color w:val="000000" w:themeColor="text1"/>
+          <w:sz w:val="24"/>
+          <w:szCs w:val="24"/>
+          <w:lang w:val="en-US"/>
+        </w:rPr>
+      </w:pPr>
+    </w:p>
+    <w:p>
+      <w:pPr>
+        <w:ind w:left="288"/>
+        <w:jc w:val="both"/>
+        <w:rPr>
+          <w:rFonts w:ascii="Times New Roman" w:eastAsiaTheme="majorEastAsia" w:hAnsi="Times New Roman" w:cs="Times New Roman"/>
+          <w:color w:val="000000" w:themeColor="text1"/>
+          <w:sz w:val="24"/>
+          <w:szCs w:val="24"/>
+          <w:lang w:val="en-US"/>
+        </w:rPr>
+      </w:pPr>
+    </w:p>
+    <w:p>
+      <w:pPr>
+        <w:ind w:left="288"/>
+        <w:jc w:val="both"/>
+        <w:rPr>
+          <w:rFonts w:ascii="Times New Roman" w:eastAsiaTheme="majorEastAsia" w:hAnsi="Times New Roman" w:cs="Times New Roman"/>
+          <w:color w:val="000000" w:themeColor="text1"/>
+          <w:sz w:val="24"/>
+          <w:szCs w:val="24"/>
+          <w:lang w:val="en-US"/>
+        </w:rPr>
+      </w:pPr>
+    </w:p>
+    <w:p>
+      <w:pPr>
+        <w:ind w:left="288"/>
+        <w:jc w:val="both"/>
+        <w:rPr>
+          <w:rFonts w:ascii="Times New Roman" w:eastAsiaTheme="majorEastAsia" w:hAnsi="Times New Roman" w:cs="Times New Roman"/>
+          <w:color w:val="000000" w:themeColor="text1"/>
+          <w:sz w:val="24"/>
+          <w:szCs w:val="24"/>
+          <w:lang w:val="en-US"/>
+        </w:rPr>
       </w:pPr>
     </w:p>
     <w:p>
@@ -13196,7 +14385,7 @@
           <w:lang w:val="en-US"/>
         </w:rPr>
       </w:pPr>
-      <w:bookmarkStart w:id="9" w:name="_Toc237443369"/>
+      <w:bookmarkStart w:id="11" w:name="_Toc237451640"/>
       <w:r>
         <w:t xml:space="preserve">Неинтерактивни </w:t>
       </w:r>
@@ -13208,7 +14397,7 @@
         </w:rPr>
         <w:t>ZKP</w:t>
       </w:r>
-      <w:bookmarkEnd w:id="9"/>
+      <w:bookmarkEnd w:id="11"/>
     </w:p>
     <w:p>
       <w:pPr>
@@ -13413,19 +14602,33 @@
     <w:p>
       <w:pPr>
         <w:pStyle w:val="Heading1"/>
-      </w:pPr>
-      <w:bookmarkStart w:id="10" w:name="_Toc237443370"/>
-      <w:r>
+        <w:rPr>
+          <w:rFonts w:ascii="Times New Roman" w:hAnsi="Times New Roman" w:cs="Times New Roman"/>
+        </w:rPr>
+      </w:pPr>
+      <w:bookmarkStart w:id="12" w:name="_Toc237451641"/>
+      <w:r>
+        <w:rPr>
+          <w:rFonts w:ascii="Times New Roman" w:hAnsi="Times New Roman" w:cs="Times New Roman"/>
+        </w:rPr>
         <w:lastRenderedPageBreak/>
-        <w:t>Навођење слика, графикона, табела</w:t>
-      </w:r>
-      <w:r>
-        <w:t>, листинга</w:t>
-      </w:r>
-      <w:r>
-        <w:t xml:space="preserve"> и литературе</w:t>
-      </w:r>
-      <w:bookmarkEnd w:id="10"/>
+        <w:t xml:space="preserve">Пројектовање и имплементација </w:t>
+      </w:r>
+      <w:r>
+        <w:rPr>
+          <w:rFonts w:ascii="Times New Roman" w:hAnsi="Times New Roman" w:cs="Times New Roman"/>
+          <w:lang w:val="en-US"/>
+        </w:rPr>
+        <w:t>ZKP</w:t>
+      </w:r>
+      <w:r>
+        <w:rPr>
+          <w:rFonts w:ascii="Times New Roman" w:hAnsi="Times New Roman" w:cs="Times New Roman"/>
+          <w:lang w:val="ru-RU"/>
+        </w:rPr>
+        <w:t xml:space="preserve"> библиотеке</w:t>
+      </w:r>
+      <w:bookmarkEnd w:id="12"/>
     </w:p>
     <w:p>
       <w:pPr>
@@ -13549,6 +14752,7 @@
       <w:r>
         <w:rPr>
           <w:rFonts w:ascii="Times New Roman" w:hAnsi="Times New Roman" w:cs="Times New Roman"/>
+          <w:noProof/>
           <w:sz w:val="24"/>
           <w:szCs w:val="24"/>
         </w:rPr>
@@ -13570,7 +14774,7 @@
                     </pic:cNvPicPr>
                   </pic:nvPicPr>
                   <pic:blipFill>
-                    <a:blip r:embed="rId31" cstate="print">
+                    <a:blip r:embed="rId32" cstate="print">
                       <a:extLst>
                         <a:ext uri="{28A0092B-C50C-407E-A947-70E740481C1C}">
                           <a14:useLocalDpi xmlns:a14="http://schemas.microsoft.com/office/drawing/2010/main" val="0"/>
@@ -13888,6 +15092,7 @@
       <w:r>
         <w:rPr>
           <w:rFonts w:ascii="Times New Roman" w:hAnsi="Times New Roman" w:cs="Times New Roman"/>
+          <w:noProof/>
           <w:sz w:val="24"/>
           <w:szCs w:val="24"/>
         </w:rPr>
@@ -13945,10 +15150,10 @@
                                 <w:sz w:val="20"/>
                               </w:rPr>
                               <w:object w:dxaOrig="1382" w:dyaOrig="1380" w14:anchorId="07567C10">
-                                <v:shape id="_x0000_i1027" type="#_x0000_t75" alt="" style="width:94.8pt;height:94.8pt;mso-width-percent:0;mso-height-percent:0;mso-width-percent:0;mso-height-percent:0" o:ole="" fillcolor="window">
+                                <v:shape id="_x0000_i1027" type="#_x0000_t75" alt="" style="width:94.9pt;height:94.9pt;mso-width-percent:0;mso-height-percent:0;mso-width-percent:0;mso-height-percent:0" o:ole="" fillcolor="window">
                                   <v:imagedata r:id="rId8" o:title=""/>
                                 </v:shape>
-                                <o:OLEObject Type="Embed" ProgID="CorelDraw.Graphic.7" ShapeID="_x0000_i1027" DrawAspect="Content" ObjectID="_1848060992" r:id="rId32"/>
+                                <o:OLEObject Type="Embed" ProgID="CorelDraw.Graphic.7" ShapeID="_x0000_i1027" DrawAspect="Content" ObjectID="_1848065827" r:id="rId33"/>
                               </w:object>
                             </w:r>
                           </w:p>
@@ -14006,10 +15211,10 @@
                           <w:sz w:val="20"/>
                         </w:rPr>
                         <w:object w:dxaOrig="1382" w:dyaOrig="1380" w14:anchorId="07567C10">
-                          <v:shape id="_x0000_i1027" type="#_x0000_t75" alt="" style="width:94.8pt;height:94.8pt;mso-width-percent:0;mso-height-percent:0;mso-width-percent:0;mso-height-percent:0" o:ole="" fillcolor="window">
-                            <v:imagedata r:id="rId8" o:title=""/>
+                          <v:shape id="_x0000_i1027" type="#_x0000_t75" alt="" style="width:95.15pt;height:95.15pt;mso-width-percent:0;mso-height-percent:0;mso-width-percent:0;mso-height-percent:0" o:ole="" fillcolor="window">
+                            <v:imagedata r:id="rId34" o:title=""/>
                           </v:shape>
-                          <o:OLEObject Type="Embed" ProgID="CorelDraw.Graphic.7" ShapeID="_x0000_i1027" DrawAspect="Content" ObjectID="_1848060992" r:id="rId33"/>
+                          <o:OLEObject Type="Embed" ProgID="CorelDraw.Graphic.7" ShapeID="_x0000_i1027" DrawAspect="Content" ObjectID="_1848064428" r:id="rId35"/>
                         </w:object>
                       </w:r>
                     </w:p>
@@ -14115,25 +15320,26 @@
           <w:sz w:val="24"/>
           <w:szCs w:val="24"/>
         </w:rPr>
+        <w:t xml:space="preserve">Свака преузета слика или графикон мора да поседује референцу ка оригиналном извору, као што је то урађено на Слици 3.3. </w:t>
+      </w:r>
+    </w:p>
+    <w:p>
+      <w:pPr>
+        <w:jc w:val="center"/>
+        <w:rPr>
+          <w:rFonts w:ascii="Times New Roman" w:hAnsi="Times New Roman" w:cs="Times New Roman"/>
+          <w:sz w:val="24"/>
+          <w:szCs w:val="24"/>
+        </w:rPr>
+      </w:pPr>
+      <w:r>
+        <w:rPr>
+          <w:rFonts w:ascii="Times New Roman" w:hAnsi="Times New Roman" w:cs="Times New Roman"/>
+          <w:noProof/>
+          <w:sz w:val="24"/>
+          <w:szCs w:val="24"/>
+        </w:rPr>
         <w:lastRenderedPageBreak/>
-        <w:t xml:space="preserve">Свака преузета слика или графикон мора да поседује референцу ка оригиналном извору, као што је то урађено на Слици 3.3. </w:t>
-      </w:r>
-    </w:p>
-    <w:p>
-      <w:pPr>
-        <w:jc w:val="center"/>
-        <w:rPr>
-          <w:rFonts w:ascii="Times New Roman" w:hAnsi="Times New Roman" w:cs="Times New Roman"/>
-          <w:sz w:val="24"/>
-          <w:szCs w:val="24"/>
-        </w:rPr>
-      </w:pPr>
-      <w:r>
-        <w:rPr>
-          <w:rFonts w:ascii="Times New Roman" w:hAnsi="Times New Roman" w:cs="Times New Roman"/>
-          <w:sz w:val="24"/>
-          <w:szCs w:val="24"/>
-        </w:rPr>
         <w:drawing>
           <wp:inline distT="0" distB="0" distL="0" distR="0" wp14:anchorId="329C9CDC" wp14:editId="42390417">
             <wp:extent cx="3476446" cy="1873971"/>
@@ -14152,7 +15358,7 @@
                     </pic:cNvPicPr>
                   </pic:nvPicPr>
                   <pic:blipFill>
-                    <a:blip r:embed="rId34" cstate="print">
+                    <a:blip r:embed="rId36" cstate="print">
                       <a:extLst>
                         <a:ext uri="{28A0092B-C50C-407E-A947-70E740481C1C}">
                           <a14:useLocalDpi xmlns:a14="http://schemas.microsoft.com/office/drawing/2010/main" val="0"/>
@@ -14256,11 +15462,12 @@
       <w:r>
         <w:rPr>
           <w:rFonts w:ascii="Times New Roman" w:hAnsi="Times New Roman" w:cs="Times New Roman"/>
+          <w:noProof/>
           <w:sz w:val="24"/>
           <w:szCs w:val="24"/>
         </w:rPr>
         <w:drawing>
-          <wp:inline distT="0" distB="0" distL="0" distR="0" wp14:anchorId="0DCE8B11" wp14:editId="5ED4BA41">
+          <wp:inline distT="0" distB="0" distL="0" distR="0" wp14:anchorId="0DCE8B11" wp14:editId="772A9D2E">
             <wp:extent cx="2026836" cy="784754"/>
             <wp:effectExtent l="0" t="0" r="0" b="0"/>
             <wp:docPr id="314949663" name="Picture 1" descr="A diagram of a process&#10;&#10;Description automatically generated"/>
@@ -14277,7 +15484,7 @@
                     </pic:cNvPicPr>
                   </pic:nvPicPr>
                   <pic:blipFill rotWithShape="1">
-                    <a:blip r:embed="rId35" cstate="print">
+                    <a:blip r:embed="rId37" cstate="print">
                       <a:extLst>
                         <a:ext uri="{28A0092B-C50C-407E-A947-70E740481C1C}">
                           <a14:useLocalDpi xmlns:a14="http://schemas.microsoft.com/office/drawing/2010/main" val="0"/>
@@ -15275,7 +16482,6 @@
           <w:sz w:val="24"/>
           <w:szCs w:val="24"/>
         </w:rPr>
-        <w:lastRenderedPageBreak/>
         <w:t>Број референце</w:t>
       </w:r>
       <w:r>
@@ -15350,7 +16556,16 @@
           <w:sz w:val="24"/>
           <w:szCs w:val="24"/>
         </w:rPr>
-        <w:t>требало би да се појаве као листа у поглављу Литература)</w:t>
+        <w:t xml:space="preserve">требало би да се појаве као листа </w:t>
+      </w:r>
+      <w:r>
+        <w:rPr>
+          <w:rFonts w:ascii="Times New Roman" w:hAnsi="Times New Roman" w:cs="Times New Roman"/>
+          <w:sz w:val="24"/>
+          <w:szCs w:val="24"/>
+        </w:rPr>
+        <w:lastRenderedPageBreak/>
+        <w:t>у поглављу Литература)</w:t>
       </w:r>
       <w:r>
         <w:rPr>
@@ -15795,13 +17010,19 @@
     <w:p>
       <w:pPr>
         <w:pStyle w:val="Heading1"/>
-      </w:pPr>
-      <w:bookmarkStart w:id="11" w:name="_Toc237443371"/>
-      <w:r>
+        <w:rPr>
+          <w:rFonts w:ascii="Times New Roman" w:hAnsi="Times New Roman" w:cs="Times New Roman"/>
+        </w:rPr>
+      </w:pPr>
+      <w:bookmarkStart w:id="13" w:name="_Toc237451642"/>
+      <w:r>
+        <w:rPr>
+          <w:rFonts w:ascii="Times New Roman" w:hAnsi="Times New Roman" w:cs="Times New Roman"/>
+        </w:rPr>
         <w:lastRenderedPageBreak/>
-        <w:t>4 Презентација</w:t>
-      </w:r>
-      <w:bookmarkEnd w:id="11"/>
+        <w:t>Примјена библиотеке у микросервисном окружењу</w:t>
+      </w:r>
+      <w:bookmarkEnd w:id="13"/>
     </w:p>
     <w:p>
       <w:pPr>
@@ -16024,6 +17245,32 @@
         <w:jc w:val="both"/>
         <w:rPr>
           <w:rFonts w:ascii="Times New Roman" w:hAnsi="Times New Roman" w:cs="Times New Roman"/>
+          <w:sz w:val="24"/>
+          <w:szCs w:val="24"/>
+        </w:rPr>
+      </w:pPr>
+    </w:p>
+    <w:p>
+      <w:pPr>
+        <w:pStyle w:val="Heading1"/>
+        <w:rPr>
+          <w:rFonts w:ascii="Times New Roman" w:hAnsi="Times New Roman" w:cs="Times New Roman"/>
+        </w:rPr>
+      </w:pPr>
+      <w:bookmarkStart w:id="14" w:name="_Toc237451643"/>
+      <w:r>
+        <w:rPr>
+          <w:rFonts w:ascii="Times New Roman" w:hAnsi="Times New Roman" w:cs="Times New Roman"/>
+        </w:rPr>
+        <w:t>Закључак</w:t>
+      </w:r>
+      <w:bookmarkEnd w:id="14"/>
+    </w:p>
+    <w:p>
+      <w:pPr>
+        <w:jc w:val="both"/>
+        <w:rPr>
+          <w:rFonts w:ascii="Times New Roman" w:hAnsi="Times New Roman" w:cs="Times New Roman"/>
         </w:rPr>
       </w:pPr>
     </w:p>
@@ -16043,13 +17290,19 @@
     <w:p>
       <w:pPr>
         <w:pStyle w:val="Heading1"/>
-      </w:pPr>
-      <w:bookmarkStart w:id="12" w:name="_Toc237443372"/>
-      <w:r>
+        <w:rPr>
+          <w:rFonts w:ascii="Times New Roman" w:hAnsi="Times New Roman" w:cs="Times New Roman"/>
+        </w:rPr>
+      </w:pPr>
+      <w:bookmarkStart w:id="15" w:name="_Toc237451644"/>
+      <w:r>
+        <w:rPr>
+          <w:rFonts w:ascii="Times New Roman" w:hAnsi="Times New Roman" w:cs="Times New Roman"/>
+        </w:rPr>
         <w:lastRenderedPageBreak/>
         <w:t>Литература</w:t>
       </w:r>
-      <w:bookmarkEnd w:id="12"/>
+      <w:bookmarkEnd w:id="15"/>
     </w:p>
     <w:p>
       <w:pPr>
@@ -16066,7 +17319,7 @@
           <w:szCs w:val="24"/>
         </w:rPr>
       </w:pPr>
-      <w:bookmarkStart w:id="13" w:name="_Ref236837480"/>
+      <w:bookmarkStart w:id="16" w:name="_Ref236837480"/>
       <w:r>
         <w:rPr>
           <w:rFonts w:ascii="Times New Roman" w:hAnsi="Times New Roman" w:cs="Times New Roman"/>
@@ -16101,7 +17354,7 @@
         </w:rPr>
         <w:t>.</w:t>
       </w:r>
-      <w:bookmarkEnd w:id="13"/>
+      <w:bookmarkEnd w:id="16"/>
     </w:p>
     <w:p>
       <w:pPr>
@@ -16118,7 +17371,7 @@
           <w:szCs w:val="24"/>
         </w:rPr>
       </w:pPr>
-      <w:bookmarkStart w:id="14" w:name="_Ref236837494"/>
+      <w:bookmarkStart w:id="17" w:name="_Ref236837494"/>
       <w:r>
         <w:rPr>
           <w:rFonts w:ascii="Times New Roman" w:hAnsi="Times New Roman" w:cs="Times New Roman"/>
@@ -16145,7 +17398,7 @@
         </w:rPr>
         <w:t>, Manning, 2018.</w:t>
       </w:r>
-      <w:bookmarkEnd w:id="14"/>
+      <w:bookmarkEnd w:id="17"/>
     </w:p>
     <w:p>
       <w:pPr>
@@ -16162,7 +17415,7 @@
           <w:szCs w:val="24"/>
         </w:rPr>
       </w:pPr>
-      <w:bookmarkStart w:id="15" w:name="_Ref236837541"/>
+      <w:bookmarkStart w:id="18" w:name="_Ref236837541"/>
       <w:r>
         <w:rPr>
           <w:rFonts w:ascii="Times New Roman" w:hAnsi="Times New Roman" w:cs="Times New Roman"/>
@@ -16189,7 +17442,7 @@
         </w:rPr>
         <w:t>, RFC 8446, 2018.</w:t>
       </w:r>
-      <w:bookmarkEnd w:id="15"/>
+      <w:bookmarkEnd w:id="18"/>
     </w:p>
     <w:p>
       <w:pPr>
@@ -16319,6 +17572,32 @@
     </w:p>
     <w:p>
       <w:pPr>
+        <w:pStyle w:val="ListParagraph"/>
+        <w:numPr>
+          <w:ilvl w:val="0"/>
+          <w:numId w:val="5"/>
+        </w:numPr>
+        <w:ind w:left="792" w:hanging="432"/>
+        <w:jc w:val="both"/>
+        <w:rPr>
+          <w:rFonts w:ascii="Times New Roman" w:hAnsi="Times New Roman" w:cs="Times New Roman"/>
+          <w:sz w:val="24"/>
+          <w:szCs w:val="24"/>
+        </w:rPr>
+      </w:pPr>
+      <w:bookmarkStart w:id="19" w:name="_Ref237451559"/>
+      <w:r>
+        <w:rPr>
+          <w:rFonts w:ascii="Times New Roman" w:hAnsi="Times New Roman" w:cs="Times New Roman"/>
+          <w:sz w:val="24"/>
+          <w:szCs w:val="24"/>
+        </w:rPr>
+        <w:t>C. P. Schnorr, “Efficient Identification and Signatures for Smart Cards,” Advances in Cryptology — CRYPTO ’89, Springer, 1990, pp. 239–252.</w:t>
+      </w:r>
+      <w:bookmarkEnd w:id="19"/>
+    </w:p>
+    <w:p>
+      <w:pPr>
         <w:rPr>
           <w:rFonts w:ascii="Times New Roman" w:hAnsi="Times New Roman" w:cs="Times New Roman"/>
         </w:rPr>
@@ -16333,16 +17612,23 @@
     <w:p>
       <w:pPr>
         <w:pStyle w:val="Heading1"/>
-      </w:pPr>
-      <w:bookmarkStart w:id="16" w:name="_Toc237443373"/>
-      <w:r>
+        <w:rPr>
+          <w:rFonts w:ascii="Times New Roman" w:hAnsi="Times New Roman" w:cs="Times New Roman"/>
+        </w:rPr>
+      </w:pPr>
+      <w:bookmarkStart w:id="20" w:name="_Toc237451645"/>
+      <w:r>
+        <w:rPr>
+          <w:rFonts w:ascii="Times New Roman" w:hAnsi="Times New Roman" w:cs="Times New Roman"/>
+        </w:rPr>
         <w:lastRenderedPageBreak/>
         <w:t>Биографија</w:t>
       </w:r>
-      <w:bookmarkEnd w:id="16"/>
-    </w:p>
-    <w:p>
-      <w:pPr>
+      <w:bookmarkEnd w:id="20"/>
+    </w:p>
+    <w:p>
+      <w:pPr>
+        <w:jc w:val="both"/>
         <w:rPr>
           <w:rFonts w:ascii="Times New Roman" w:hAnsi="Times New Roman" w:cs="Times New Roman"/>
           <w:lang w:val="ru-RU"/>
@@ -16358,10 +17644,10 @@
       </w:r>
     </w:p>
     <w:sectPr>
-      <w:headerReference w:type="even" r:id="rId36"/>
-      <w:headerReference w:type="default" r:id="rId37"/>
-      <w:footerReference w:type="even" r:id="rId38"/>
-      <w:footerReference w:type="default" r:id="rId39"/>
+      <w:headerReference w:type="even" r:id="rId38"/>
+      <w:headerReference w:type="default" r:id="rId39"/>
+      <w:footerReference w:type="even" r:id="rId40"/>
+      <w:footerReference w:type="default" r:id="rId41"/>
       <w:pgSz w:w="11906" w:h="16838" w:code="9"/>
       <w:pgMar w:top="1152" w:right="1152" w:bottom="1152" w:left="1440" w:header="720" w:footer="432" w:gutter="0"/>
       <w:pgNumType w:start="1"/>
@@ -16819,6 +18105,9 @@
             </w:rPr>
           </w:pPr>
           <w:r>
+            <w:rPr>
+              <w:noProof/>
+            </w:rPr>
             <w:drawing>
               <wp:inline distT="0" distB="0" distL="0" distR="0" wp14:anchorId="5820E788" wp14:editId="015F2713">
                 <wp:extent cx="413385" cy="457200"/>
@@ -17083,6 +18372,9 @@
             </w:rPr>
           </w:pPr>
           <w:r>
+            <w:rPr>
+              <w:noProof/>
+            </w:rPr>
             <w:drawing>
               <wp:inline distT="0" distB="0" distL="0" distR="0" wp14:anchorId="6F1813C4" wp14:editId="09BB485B">
                 <wp:extent cx="413385" cy="457200"/>
@@ -17354,6 +18646,9 @@
             </w:rPr>
           </w:pPr>
           <w:r>
+            <w:rPr>
+              <w:noProof/>
+            </w:rPr>
             <w:drawing>
               <wp:inline distT="0" distB="0" distL="0" distR="0" wp14:anchorId="7273734B" wp14:editId="7FD483F1">
                 <wp:extent cx="783590" cy="866775"/>
@@ -17849,6 +19144,9 @@
             </w:rPr>
           </w:pPr>
           <w:r>
+            <w:rPr>
+              <w:noProof/>
+            </w:rPr>
             <w:drawing>
               <wp:inline distT="0" distB="0" distL="0" distR="0" wp14:anchorId="6376E686" wp14:editId="63769684">
                 <wp:extent cx="781050" cy="857250"/>
@@ -21203,6 +22501,25 @@
       <w:ind w:left="440"/>
     </w:pPr>
   </w:style>
+  <w:style w:type="paragraph" w:styleId="Caption">
+    <w:name w:val="caption"/>
+    <w:basedOn w:val="Normal"/>
+    <w:next w:val="Normal"/>
+    <w:uiPriority w:val="35"/>
+    <w:unhideWhenUsed/>
+    <w:qFormat/>
+    <w:rsid w:val="0021529F"/>
+    <w:pPr>
+      <w:spacing w:after="200" w:line="240" w:lineRule="auto"/>
+    </w:pPr>
+    <w:rPr>
+      <w:i/>
+      <w:iCs/>
+      <w:color w:val="0E2841" w:themeColor="text2"/>
+      <w:sz w:val="18"/>
+      <w:szCs w:val="18"/>
+    </w:rPr>
+  </w:style>
 </w:styles>
 </file>
 

</xml_diff>

<commit_message>
docs: add applications of Zero-Knowledge Proofs
</commit_message>
<xml_diff>
--- a/thesis.docx
+++ b/thesis.docx
@@ -68,10 +68,10 @@
                   <v:path o:extrusionok="f" gradientshapeok="t" o:connecttype="rect"/>
                   <o:lock v:ext="edit" aspectratio="t"/>
                 </v:shapetype>
-                <v:shape id="_x0000_i1025" type="#_x0000_t75" alt="" style="width:63pt;height:63pt;mso-width-percent:0;mso-height-percent:0;mso-width-percent:0;mso-height-percent:0" o:ole="" fillcolor="window">
+                <v:shape id="_x0000_i1025" type="#_x0000_t75" alt="" style="width:63.25pt;height:62.75pt;mso-width-percent:0;mso-height-percent:0;mso-width-percent:0;mso-height-percent:0" o:ole="" fillcolor="window">
                   <v:imagedata r:id="rId8" o:title=""/>
                 </v:shape>
-                <o:OLEObject Type="Embed" ProgID="CorelDraw.Graphic.7" ShapeID="_x0000_i1025" DrawAspect="Content" ObjectID="_1848070345" r:id="rId9"/>
+                <o:OLEObject Type="Embed" ProgID="CorelDraw.Graphic.7" ShapeID="_x0000_i1025" DrawAspect="Content" ObjectID="_1848091887" r:id="rId9"/>
               </w:object>
             </w:r>
           </w:p>
@@ -6947,7 +6947,7 @@
             </w:rPr>
             <w:fldChar w:fldCharType="separate"/>
           </w:r>
-          <w:hyperlink w:anchor="_Toc237457512" w:history="1">
+          <w:hyperlink w:anchor="_Toc237478381" w:history="1">
             <w:r>
               <w:rPr>
                 <w:rStyle w:val="Hyperlink"/>
@@ -6993,7 +6993,7 @@
                 <w:noProof/>
                 <w:webHidden/>
               </w:rPr>
-              <w:instrText xml:space="preserve"> PAGEREF _Toc237457512 \h </w:instrText>
+              <w:instrText xml:space="preserve"> PAGEREF _Toc237478381 \h </w:instrText>
             </w:r>
             <w:r>
               <w:rPr>
@@ -7039,7 +7039,7 @@
               <w:lang w:val="en-US"/>
             </w:rPr>
           </w:pPr>
-          <w:hyperlink w:anchor="_Toc237457513" w:history="1">
+          <w:hyperlink w:anchor="_Toc237478382" w:history="1">
             <w:r>
               <w:rPr>
                 <w:rStyle w:val="Hyperlink"/>
@@ -7148,7 +7148,7 @@
                 <w:noProof/>
                 <w:webHidden/>
               </w:rPr>
-              <w:instrText xml:space="preserve"> PAGEREF _Toc237457513 \h </w:instrText>
+              <w:instrText xml:space="preserve"> PAGEREF _Toc237478382 \h </w:instrText>
             </w:r>
             <w:r>
               <w:rPr>
@@ -7194,7 +7194,7 @@
               <w:lang w:val="en-US"/>
             </w:rPr>
           </w:pPr>
-          <w:hyperlink w:anchor="_Toc237457514" w:history="1">
+          <w:hyperlink w:anchor="_Toc237478383" w:history="1">
             <w:r>
               <w:rPr>
                 <w:rStyle w:val="Hyperlink"/>
@@ -7303,7 +7303,7 @@
                 <w:noProof/>
                 <w:webHidden/>
               </w:rPr>
-              <w:instrText xml:space="preserve"> PAGEREF _Toc237457514 \h </w:instrText>
+              <w:instrText xml:space="preserve"> PAGEREF _Toc237478383 \h </w:instrText>
             </w:r>
             <w:r>
               <w:rPr>
@@ -7349,7 +7349,7 @@
               <w:lang w:val="en-US"/>
             </w:rPr>
           </w:pPr>
-          <w:hyperlink w:anchor="_Toc237457515" w:history="1">
+          <w:hyperlink w:anchor="_Toc237478384" w:history="1">
             <w:r>
               <w:rPr>
                 <w:rStyle w:val="Hyperlink"/>
@@ -7412,7 +7412,7 @@
                 <w:noProof/>
                 <w:webHidden/>
               </w:rPr>
-              <w:instrText xml:space="preserve"> PAGEREF _Toc237457515 \h </w:instrText>
+              <w:instrText xml:space="preserve"> PAGEREF _Toc237478384 \h </w:instrText>
             </w:r>
             <w:r>
               <w:rPr>
@@ -7458,7 +7458,7 @@
               <w:lang w:val="en-US"/>
             </w:rPr>
           </w:pPr>
-          <w:hyperlink w:anchor="_Toc237457516" w:history="1">
+          <w:hyperlink w:anchor="_Toc237478385" w:history="1">
             <w:r>
               <w:rPr>
                 <w:rStyle w:val="Hyperlink"/>
@@ -7504,7 +7504,7 @@
                 <w:noProof/>
                 <w:webHidden/>
               </w:rPr>
-              <w:instrText xml:space="preserve"> PAGEREF _Toc237457516 \h </w:instrText>
+              <w:instrText xml:space="preserve"> PAGEREF _Toc237478385 \h </w:instrText>
             </w:r>
             <w:r>
               <w:rPr>
@@ -7550,7 +7550,7 @@
               <w:lang w:val="en-US"/>
             </w:rPr>
           </w:pPr>
-          <w:hyperlink w:anchor="_Toc237457517" w:history="1">
+          <w:hyperlink w:anchor="_Toc237478386" w:history="1">
             <w:r>
               <w:rPr>
                 <w:rStyle w:val="Hyperlink"/>
@@ -7594,7 +7594,7 @@
                 <w:noProof/>
                 <w:webHidden/>
               </w:rPr>
-              <w:instrText xml:space="preserve"> PAGEREF _Toc237457517 \h </w:instrText>
+              <w:instrText xml:space="preserve"> PAGEREF _Toc237478386 \h </w:instrText>
             </w:r>
             <w:r>
               <w:rPr>
@@ -7640,7 +7640,7 @@
               <w:lang w:val="en-US"/>
             </w:rPr>
           </w:pPr>
-          <w:hyperlink w:anchor="_Toc237457518" w:history="1">
+          <w:hyperlink w:anchor="_Toc237478387" w:history="1">
             <w:r>
               <w:rPr>
                 <w:rStyle w:val="Hyperlink"/>
@@ -7684,7 +7684,7 @@
                 <w:noProof/>
                 <w:webHidden/>
               </w:rPr>
-              <w:instrText xml:space="preserve"> PAGEREF _Toc237457518 \h </w:instrText>
+              <w:instrText xml:space="preserve"> PAGEREF _Toc237478387 \h </w:instrText>
             </w:r>
             <w:r>
               <w:rPr>
@@ -7730,7 +7730,7 @@
               <w:lang w:val="en-US"/>
             </w:rPr>
           </w:pPr>
-          <w:hyperlink w:anchor="_Toc237457519" w:history="1">
+          <w:hyperlink w:anchor="_Toc237478388" w:history="1">
             <w:r>
               <w:rPr>
                 <w:rStyle w:val="Hyperlink"/>
@@ -7829,7 +7829,7 @@
                 <w:noProof/>
                 <w:webHidden/>
               </w:rPr>
-              <w:instrText xml:space="preserve"> PAGEREF _Toc237457519 \h </w:instrText>
+              <w:instrText xml:space="preserve"> PAGEREF _Toc237478388 \h </w:instrText>
             </w:r>
             <w:r>
               <w:rPr>
@@ -7875,7 +7875,7 @@
               <w:lang w:val="en-US"/>
             </w:rPr>
           </w:pPr>
-          <w:hyperlink w:anchor="_Toc237457520" w:history="1">
+          <w:hyperlink w:anchor="_Toc237478389" w:history="1">
             <w:r>
               <w:rPr>
                 <w:rStyle w:val="Hyperlink"/>
@@ -7929,7 +7929,7 @@
                 <w:noProof/>
                 <w:webHidden/>
               </w:rPr>
-              <w:instrText xml:space="preserve"> PAGEREF _Toc237457520 \h </w:instrText>
+              <w:instrText xml:space="preserve"> PAGEREF _Toc237478389 \h </w:instrText>
             </w:r>
             <w:r>
               <w:rPr>
@@ -7975,7 +7975,7 @@
               <w:lang w:val="en-US"/>
             </w:rPr>
           </w:pPr>
-          <w:hyperlink w:anchor="_Toc237457521" w:history="1">
+          <w:hyperlink w:anchor="_Toc237478390" w:history="1">
             <w:r>
               <w:rPr>
                 <w:rStyle w:val="Hyperlink"/>
@@ -8030,7 +8030,7 @@
                 <w:noProof/>
                 <w:webHidden/>
               </w:rPr>
-              <w:instrText xml:space="preserve"> PAGEREF _Toc237457521 \h </w:instrText>
+              <w:instrText xml:space="preserve"> PAGEREF _Toc237478390 \h </w:instrText>
             </w:r>
             <w:r>
               <w:rPr>
@@ -8076,11 +8076,12 @@
               <w:lang w:val="en-US"/>
             </w:rPr>
           </w:pPr>
-          <w:hyperlink w:anchor="_Toc237457522" w:history="1">
+          <w:hyperlink w:anchor="_Toc237478391" w:history="1">
             <w:r>
               <w:rPr>
                 <w:rStyle w:val="Hyperlink"/>
                 <w:noProof/>
+                <w:lang w:val="en-US"/>
               </w:rPr>
               <w:t>2.6</w:t>
             </w:r>
@@ -8128,7 +8129,7 @@
                 <w:noProof/>
                 <w:webHidden/>
               </w:rPr>
-              <w:instrText xml:space="preserve"> PAGEREF _Toc237457522 \h </w:instrText>
+              <w:instrText xml:space="preserve"> PAGEREF _Toc237478391 \h </w:instrText>
             </w:r>
             <w:r>
               <w:rPr>
@@ -8149,6 +8150,99 @@
                 <w:webHidden/>
               </w:rPr>
               <w:t>9</w:t>
+            </w:r>
+            <w:r>
+              <w:rPr>
+                <w:noProof/>
+                <w:webHidden/>
+              </w:rPr>
+              <w:fldChar w:fldCharType="end"/>
+            </w:r>
+          </w:hyperlink>
+        </w:p>
+        <w:p>
+          <w:pPr>
+            <w:pStyle w:val="TOC2"/>
+            <w:tabs>
+              <w:tab w:val="left" w:pos="960"/>
+              <w:tab w:val="right" w:leader="dot" w:pos="9304"/>
+            </w:tabs>
+            <w:rPr>
+              <w:rFonts w:eastAsiaTheme="minorEastAsia"/>
+              <w:noProof/>
+              <w:sz w:val="24"/>
+              <w:szCs w:val="24"/>
+              <w:lang w:val="en-US"/>
+            </w:rPr>
+          </w:pPr>
+          <w:hyperlink w:anchor="_Toc237478392" w:history="1">
+            <w:r>
+              <w:rPr>
+                <w:rStyle w:val="Hyperlink"/>
+                <w:rFonts w:ascii="Times New Roman" w:hAnsi="Times New Roman" w:cs="Times New Roman"/>
+                <w:noProof/>
+                <w:lang w:val="en-US"/>
+              </w:rPr>
+              <w:t>2.7</w:t>
+            </w:r>
+            <w:r>
+              <w:rPr>
+                <w:rFonts w:eastAsiaTheme="minorEastAsia"/>
+                <w:noProof/>
+                <w:sz w:val="24"/>
+                <w:szCs w:val="24"/>
+                <w:lang w:val="en-US"/>
+              </w:rPr>
+              <w:tab/>
+            </w:r>
+            <w:r>
+              <w:rPr>
+                <w:rStyle w:val="Hyperlink"/>
+                <w:rFonts w:ascii="Times New Roman" w:hAnsi="Times New Roman" w:cs="Times New Roman"/>
+                <w:noProof/>
+              </w:rPr>
+              <w:t>Примјене Zero-Knowledge Proof протокола</w:t>
+            </w:r>
+            <w:r>
+              <w:rPr>
+                <w:noProof/>
+                <w:webHidden/>
+              </w:rPr>
+              <w:tab/>
+            </w:r>
+            <w:r>
+              <w:rPr>
+                <w:noProof/>
+                <w:webHidden/>
+              </w:rPr>
+              <w:fldChar w:fldCharType="begin"/>
+            </w:r>
+            <w:r>
+              <w:rPr>
+                <w:noProof/>
+                <w:webHidden/>
+              </w:rPr>
+              <w:instrText xml:space="preserve"> PAGEREF _Toc237478392 \h </w:instrText>
+            </w:r>
+            <w:r>
+              <w:rPr>
+                <w:noProof/>
+                <w:webHidden/>
+              </w:rPr>
+            </w:r>
+            <w:r>
+              <w:rPr>
+                <w:noProof/>
+                <w:webHidden/>
+              </w:rPr>
+              <w:fldChar w:fldCharType="separate"/>
+            </w:r>
+            <w:r>
+              <w:rPr>
+                <w:noProof/>
+                <w:webHidden/>
+              </w:rPr>
+              <w:t>10</w:t>
             </w:r>
             <w:r>
               <w:rPr>
@@ -8174,7 +8268,7 @@
               <w:lang w:val="en-US"/>
             </w:rPr>
           </w:pPr>
-          <w:hyperlink w:anchor="_Toc237457523" w:history="1">
+          <w:hyperlink w:anchor="_Toc237478393" w:history="1">
             <w:r>
               <w:rPr>
                 <w:rStyle w:val="Hyperlink"/>
@@ -8238,7 +8332,7 @@
                 <w:noProof/>
                 <w:webHidden/>
               </w:rPr>
-              <w:instrText xml:space="preserve"> PAGEREF _Toc237457523 \h </w:instrText>
+              <w:instrText xml:space="preserve"> PAGEREF _Toc237478393 \h </w:instrText>
             </w:r>
             <w:r>
               <w:rPr>
@@ -8258,7 +8352,7 @@
                 <w:noProof/>
                 <w:webHidden/>
               </w:rPr>
-              <w:t>10</w:t>
+              <w:t>11</w:t>
             </w:r>
             <w:r>
               <w:rPr>
@@ -8284,7 +8378,7 @@
               <w:lang w:val="en-US"/>
             </w:rPr>
           </w:pPr>
-          <w:hyperlink w:anchor="_Toc237457524" w:history="1">
+          <w:hyperlink w:anchor="_Toc237478394" w:history="1">
             <w:r>
               <w:rPr>
                 <w:rStyle w:val="Hyperlink"/>
@@ -8330,7 +8424,7 @@
                 <w:noProof/>
                 <w:webHidden/>
               </w:rPr>
-              <w:instrText xml:space="preserve"> PAGEREF _Toc237457524 \h </w:instrText>
+              <w:instrText xml:space="preserve"> PAGEREF _Toc237478394 \h </w:instrText>
             </w:r>
             <w:r>
               <w:rPr>
@@ -8350,7 +8444,7 @@
                 <w:noProof/>
                 <w:webHidden/>
               </w:rPr>
-              <w:t>13</w:t>
+              <w:t>14</w:t>
             </w:r>
             <w:r>
               <w:rPr>
@@ -8376,7 +8470,7 @@
               <w:lang w:val="en-US"/>
             </w:rPr>
           </w:pPr>
-          <w:hyperlink w:anchor="_Toc237457525" w:history="1">
+          <w:hyperlink w:anchor="_Toc237478395" w:history="1">
             <w:r>
               <w:rPr>
                 <w:rStyle w:val="Hyperlink"/>
@@ -8422,7 +8516,7 @@
                 <w:noProof/>
                 <w:webHidden/>
               </w:rPr>
-              <w:instrText xml:space="preserve"> PAGEREF _Toc237457525 \h </w:instrText>
+              <w:instrText xml:space="preserve"> PAGEREF _Toc237478395 \h </w:instrText>
             </w:r>
             <w:r>
               <w:rPr>
@@ -8442,7 +8536,7 @@
                 <w:noProof/>
                 <w:webHidden/>
               </w:rPr>
-              <w:t>13</w:t>
+              <w:t>14</w:t>
             </w:r>
             <w:r>
               <w:rPr>
@@ -8468,7 +8562,7 @@
               <w:lang w:val="en-US"/>
             </w:rPr>
           </w:pPr>
-          <w:hyperlink w:anchor="_Toc237457526" w:history="1">
+          <w:hyperlink w:anchor="_Toc237478396" w:history="1">
             <w:r>
               <w:rPr>
                 <w:rStyle w:val="Hyperlink"/>
@@ -8514,7 +8608,7 @@
                 <w:noProof/>
                 <w:webHidden/>
               </w:rPr>
-              <w:instrText xml:space="preserve"> PAGEREF _Toc237457526 \h </w:instrText>
+              <w:instrText xml:space="preserve"> PAGEREF _Toc237478396 \h </w:instrText>
             </w:r>
             <w:r>
               <w:rPr>
@@ -8534,7 +8628,7 @@
                 <w:noProof/>
                 <w:webHidden/>
               </w:rPr>
-              <w:t>14</w:t>
+              <w:t>15</w:t>
             </w:r>
             <w:r>
               <w:rPr>
@@ -8560,7 +8654,7 @@
               <w:lang w:val="en-US"/>
             </w:rPr>
           </w:pPr>
-          <w:hyperlink w:anchor="_Toc237457527" w:history="1">
+          <w:hyperlink w:anchor="_Toc237478397" w:history="1">
             <w:r>
               <w:rPr>
                 <w:rStyle w:val="Hyperlink"/>
@@ -8606,7 +8700,7 @@
                 <w:noProof/>
                 <w:webHidden/>
               </w:rPr>
-              <w:instrText xml:space="preserve"> PAGEREF _Toc237457527 \h </w:instrText>
+              <w:instrText xml:space="preserve"> PAGEREF _Toc237478397 \h </w:instrText>
             </w:r>
             <w:r>
               <w:rPr>
@@ -8626,7 +8720,7 @@
                 <w:noProof/>
                 <w:webHidden/>
               </w:rPr>
-              <w:t>15</w:t>
+              <w:t>16</w:t>
             </w:r>
             <w:r>
               <w:rPr>
@@ -8696,7 +8790,7 @@
           <w:rFonts w:ascii="Times New Roman" w:hAnsi="Times New Roman" w:cs="Times New Roman"/>
         </w:rPr>
       </w:pPr>
-      <w:bookmarkStart w:id="0" w:name="_Toc237457512"/>
+      <w:bookmarkStart w:id="0" w:name="_Toc237478381"/>
       <w:r>
         <w:rPr>
           <w:rFonts w:ascii="Times New Roman" w:hAnsi="Times New Roman" w:cs="Times New Roman"/>
@@ -9436,7 +9530,7 @@
       <w:pPr>
         <w:pStyle w:val="Heading1"/>
       </w:pPr>
-      <w:bookmarkStart w:id="1" w:name="_Toc237457513"/>
+      <w:bookmarkStart w:id="1" w:name="_Toc237478382"/>
       <w:r>
         <w:lastRenderedPageBreak/>
         <w:t xml:space="preserve">Теоријске основе </w:t>
@@ -9569,7 +9663,7 @@
       <w:pPr>
         <w:pStyle w:val="Heading2"/>
       </w:pPr>
-      <w:bookmarkStart w:id="2" w:name="_Toc237457514"/>
+      <w:bookmarkStart w:id="2" w:name="_Toc237478383"/>
       <w:r>
         <w:t xml:space="preserve">Основни концепт </w:t>
       </w:r>
@@ -10195,7 +10289,7 @@
           <w:rFonts w:ascii="Times New Roman" w:hAnsi="Times New Roman" w:cs="Times New Roman"/>
         </w:rPr>
       </w:pPr>
-      <w:bookmarkStart w:id="3" w:name="_Toc237457515"/>
+      <w:bookmarkStart w:id="3" w:name="_Toc237478384"/>
       <w:r>
         <w:rPr>
           <w:rFonts w:ascii="Times New Roman" w:hAnsi="Times New Roman" w:cs="Times New Roman"/>
@@ -10264,7 +10358,7 @@
           <w:rFonts w:ascii="Times New Roman" w:hAnsi="Times New Roman" w:cs="Times New Roman"/>
         </w:rPr>
       </w:pPr>
-      <w:bookmarkStart w:id="4" w:name="_Toc237457516"/>
+      <w:bookmarkStart w:id="4" w:name="_Toc237478385"/>
       <w:r>
         <w:rPr>
           <w:rFonts w:ascii="Times New Roman" w:hAnsi="Times New Roman" w:cs="Times New Roman"/>
@@ -10339,7 +10433,7 @@
       <w:pPr>
         <w:pStyle w:val="Heading3"/>
       </w:pPr>
-      <w:bookmarkStart w:id="5" w:name="_Toc237457517"/>
+      <w:bookmarkStart w:id="5" w:name="_Toc237478386"/>
       <w:r>
         <w:t>Поузданост</w:t>
       </w:r>
@@ -10895,7 +10989,7 @@
       <w:pPr>
         <w:pStyle w:val="Heading3"/>
       </w:pPr>
-      <w:bookmarkStart w:id="6" w:name="_Toc237457518"/>
+      <w:bookmarkStart w:id="6" w:name="_Toc237478387"/>
       <w:r>
         <w:t>Нулто знање</w:t>
       </w:r>
@@ -11683,7 +11777,7 @@
       <w:pPr>
         <w:pStyle w:val="Heading2"/>
       </w:pPr>
-      <w:bookmarkStart w:id="7" w:name="_Toc237457519"/>
+      <w:bookmarkStart w:id="7" w:name="_Toc237478388"/>
       <w:r>
         <w:lastRenderedPageBreak/>
         <w:t xml:space="preserve">Начин функционисања </w:t>
@@ -13441,7 +13535,7 @@
           <w:iCs/>
         </w:rPr>
       </w:pPr>
-      <w:bookmarkStart w:id="8" w:name="_Toc237457520"/>
+      <w:bookmarkStart w:id="8" w:name="_Toc237478389"/>
       <w:r>
         <w:lastRenderedPageBreak/>
         <w:t xml:space="preserve">Интерактивни  </w:t>
@@ -13976,7 +14070,7 @@
           <w:color w:val="000000" w:themeColor="text1"/>
           <w:sz w:val="24"/>
           <w:szCs w:val="24"/>
-          <w:lang w:val="en-US"/>
+          <w:lang w:val="ru-RU"/>
         </w:rPr>
       </w:pPr>
       <w:r>
@@ -14486,7 +14580,7 @@
           <w:lang w:val="en-US"/>
         </w:rPr>
       </w:pPr>
-      <w:bookmarkStart w:id="11" w:name="_Toc237457521"/>
+      <w:bookmarkStart w:id="11" w:name="_Toc237478390"/>
       <w:r>
         <w:lastRenderedPageBreak/>
         <w:t xml:space="preserve">Неинтерактивни </w:t>
@@ -15221,6 +15315,9 @@
         <w:pStyle w:val="NormalWeb"/>
         <w:ind w:left="288"/>
         <w:jc w:val="both"/>
+        <w:rPr>
+          <w:lang w:val="ru-RU"/>
+        </w:rPr>
       </w:pPr>
       <w:r>
         <w:rPr>
@@ -15782,19 +15879,7 @@
         <w:rPr>
           <w:lang w:val="ru-RU"/>
         </w:rPr>
-        <w:t>Сли</w:t>
-      </w:r>
-      <w:r>
-        <w:rPr>
-          <w:lang w:val="ru-RU"/>
-        </w:rPr>
-        <w:t>к</w:t>
-      </w:r>
-      <w:r>
-        <w:rPr>
-          <w:lang w:val="ru-RU"/>
-        </w:rPr>
-        <w:t>а</w:t>
+        <w:t>Слика</w:t>
       </w:r>
       <w:proofErr w:type="spellEnd"/>
       <w:r>
@@ -18760,21 +18845,7 @@
         <w:rPr>
           <w:lang w:val="ru-RU"/>
         </w:rPr>
-        <w:t xml:space="preserve"> се </w:t>
-      </w:r>
-      <w:proofErr w:type="spellStart"/>
-      <w:r>
-        <w:rPr>
-          <w:lang w:val="ru-RU"/>
-        </w:rPr>
-        <w:t>примјењује</w:t>
-      </w:r>
-      <w:proofErr w:type="spellEnd"/>
-      <w:r>
-        <w:rPr>
-          <w:lang w:val="ru-RU"/>
-        </w:rPr>
-        <w:t>.</w:t>
+        <w:t xml:space="preserve"> се примјењује.</w:t>
       </w:r>
     </w:p>
     <w:p>
@@ -18876,71 +18947,74 @@
     <w:p>
       <w:pPr>
         <w:rPr>
-          <w:lang w:val="en-US"/>
+          <w:lang w:val="ru-RU"/>
         </w:rPr>
       </w:pPr>
     </w:p>
     <w:p>
       <w:pPr>
         <w:rPr>
-          <w:lang w:val="en-US"/>
+          <w:lang w:val="ru-RU"/>
         </w:rPr>
       </w:pPr>
     </w:p>
     <w:p>
       <w:pPr>
         <w:rPr>
-          <w:lang w:val="en-US"/>
+          <w:lang w:val="ru-RU"/>
         </w:rPr>
       </w:pPr>
     </w:p>
     <w:p>
       <w:pPr>
         <w:rPr>
-          <w:lang w:val="en-US"/>
+          <w:lang w:val="ru-RU"/>
         </w:rPr>
       </w:pPr>
     </w:p>
     <w:p>
       <w:pPr>
         <w:rPr>
-          <w:lang w:val="en-US"/>
+          <w:lang w:val="ru-RU"/>
         </w:rPr>
       </w:pPr>
     </w:p>
     <w:p>
       <w:pPr>
         <w:rPr>
-          <w:lang w:val="en-US"/>
+          <w:lang w:val="ru-RU"/>
         </w:rPr>
       </w:pPr>
     </w:p>
     <w:p>
       <w:pPr>
         <w:rPr>
-          <w:lang w:val="en-US"/>
+          <w:lang w:val="ru-RU"/>
         </w:rPr>
       </w:pPr>
     </w:p>
     <w:p>
       <w:pPr>
         <w:rPr>
-          <w:lang w:val="en-US"/>
+          <w:lang w:val="ru-RU"/>
         </w:rPr>
       </w:pPr>
     </w:p>
     <w:p>
       <w:pPr>
         <w:rPr>
-          <w:lang w:val="en-US"/>
+          <w:lang w:val="ru-RU"/>
         </w:rPr>
       </w:pPr>
     </w:p>
     <w:p>
       <w:pPr>
         <w:pStyle w:val="Heading2"/>
-      </w:pPr>
-      <w:bookmarkStart w:id="13" w:name="_Toc237457522"/>
+        <w:rPr>
+          <w:lang w:val="en-US"/>
+        </w:rPr>
+      </w:pPr>
+      <w:bookmarkStart w:id="13" w:name="_Toc237478391"/>
       <w:proofErr w:type="spellStart"/>
       <w:r>
         <w:rPr>
@@ -18960,37 +19034,2125 @@
         <w:t>протоколи</w:t>
       </w:r>
       <w:bookmarkEnd w:id="13"/>
+    </w:p>
+    <w:p>
+      <w:pPr>
+        <w:rPr>
+          <w:lang w:val="en-US"/>
+        </w:rPr>
+      </w:pPr>
+    </w:p>
+    <w:p>
+      <w:pPr>
+        <w:rPr>
+          <w:lang w:val="en-US"/>
+        </w:rPr>
+      </w:pPr>
+      <w:r>
+        <w:rPr>
+          <w:lang w:val="en-US"/>
+        </w:rPr>
+        <w:br w:type="page"/>
+      </w:r>
+    </w:p>
+    <w:p>
+      <w:pPr>
+        <w:pStyle w:val="Heading2"/>
+        <w:rPr>
+          <w:rFonts w:ascii="Times New Roman" w:hAnsi="Times New Roman" w:cs="Times New Roman"/>
+          <w:lang w:val="en-US"/>
+        </w:rPr>
+      </w:pPr>
+      <w:bookmarkStart w:id="14" w:name="_Toc237478392"/>
+      <w:r>
+        <w:rPr>
+          <w:rFonts w:ascii="Times New Roman" w:hAnsi="Times New Roman" w:cs="Times New Roman"/>
+        </w:rPr>
+        <w:lastRenderedPageBreak/>
+        <w:t xml:space="preserve">Примјене </w:t>
+      </w:r>
+      <w:r>
+        <w:rPr>
+          <w:rFonts w:ascii="Times New Roman" w:hAnsi="Times New Roman" w:cs="Times New Roman"/>
+        </w:rPr>
+        <w:t>Zero-Knowledge Proof протокола</w:t>
+      </w:r>
+      <w:bookmarkEnd w:id="14"/>
+    </w:p>
+    <w:p>
+      <w:pPr>
+        <w:pStyle w:val="pdq2pgselectionanchorcontainer"/>
+        <w:ind w:left="547"/>
+        <w:jc w:val="both"/>
+        <w:rPr>
+          <w:lang w:val="ru-RU"/>
+        </w:rPr>
+      </w:pPr>
+      <w:r>
+        <w:rPr>
+          <w:rStyle w:val="Emphasis"/>
+        </w:rPr>
+        <w:t>Zero</w:t>
+      </w:r>
+      <w:r>
+        <w:rPr>
+          <w:rStyle w:val="Emphasis"/>
+          <w:lang w:val="ru-RU"/>
+        </w:rPr>
+        <w:t>-</w:t>
+      </w:r>
+      <w:r>
+        <w:rPr>
+          <w:rStyle w:val="Emphasis"/>
+        </w:rPr>
+        <w:t>Knowledge</w:t>
+      </w:r>
+      <w:r>
+        <w:rPr>
+          <w:rStyle w:val="Emphasis"/>
+          <w:lang w:val="ru-RU"/>
+        </w:rPr>
+        <w:t xml:space="preserve"> </w:t>
+      </w:r>
+      <w:r>
+        <w:rPr>
+          <w:rStyle w:val="Emphasis"/>
+        </w:rPr>
+        <w:t>Proof</w:t>
+      </w:r>
+      <w:r>
+        <w:rPr>
+          <w:lang w:val="ru-RU"/>
+        </w:rPr>
+        <w:t xml:space="preserve"> </w:t>
+      </w:r>
+      <w:proofErr w:type="spellStart"/>
+      <w:r>
+        <w:rPr>
+          <w:lang w:val="ru-RU"/>
+        </w:rPr>
+        <w:t>протоколи</w:t>
+      </w:r>
+      <w:proofErr w:type="spellEnd"/>
+      <w:r>
+        <w:rPr>
+          <w:lang w:val="ru-RU"/>
+        </w:rPr>
+        <w:t xml:space="preserve"> могу се </w:t>
+      </w:r>
+      <w:proofErr w:type="spellStart"/>
+      <w:r>
+        <w:rPr>
+          <w:lang w:val="ru-RU"/>
+        </w:rPr>
+        <w:t>примјењивати</w:t>
+      </w:r>
+      <w:proofErr w:type="spellEnd"/>
+      <w:r>
+        <w:rPr>
+          <w:lang w:val="ru-RU"/>
+        </w:rPr>
+        <w:t xml:space="preserve"> у </w:t>
+      </w:r>
+      <w:proofErr w:type="spellStart"/>
+      <w:r>
+        <w:rPr>
+          <w:lang w:val="ru-RU"/>
+        </w:rPr>
+        <w:t>различитим</w:t>
+      </w:r>
+      <w:proofErr w:type="spellEnd"/>
+      <w:r>
+        <w:rPr>
+          <w:lang w:val="ru-RU"/>
+        </w:rPr>
+        <w:t xml:space="preserve"> </w:t>
+      </w:r>
+      <w:proofErr w:type="spellStart"/>
+      <w:r>
+        <w:rPr>
+          <w:lang w:val="ru-RU"/>
+        </w:rPr>
+        <w:t>областима</w:t>
+      </w:r>
+      <w:proofErr w:type="spellEnd"/>
+      <w:r>
+        <w:rPr>
+          <w:lang w:val="ru-RU"/>
+        </w:rPr>
+        <w:t xml:space="preserve"> у </w:t>
+      </w:r>
+      <w:proofErr w:type="spellStart"/>
+      <w:r>
+        <w:rPr>
+          <w:lang w:val="ru-RU"/>
+        </w:rPr>
+        <w:t>којима</w:t>
+      </w:r>
+      <w:proofErr w:type="spellEnd"/>
+      <w:r>
+        <w:rPr>
+          <w:lang w:val="ru-RU"/>
+        </w:rPr>
+        <w:t xml:space="preserve"> </w:t>
+      </w:r>
+      <w:proofErr w:type="spellStart"/>
+      <w:r>
+        <w:rPr>
+          <w:lang w:val="ru-RU"/>
+        </w:rPr>
+        <w:t>је</w:t>
+      </w:r>
+      <w:proofErr w:type="spellEnd"/>
+      <w:r>
+        <w:rPr>
+          <w:lang w:val="ru-RU"/>
+        </w:rPr>
+        <w:t xml:space="preserve"> потребно </w:t>
+      </w:r>
+      <w:proofErr w:type="spellStart"/>
+      <w:r>
+        <w:rPr>
+          <w:lang w:val="ru-RU"/>
+        </w:rPr>
+        <w:t>извршити</w:t>
+      </w:r>
+      <w:proofErr w:type="spellEnd"/>
+      <w:r>
+        <w:rPr>
+          <w:lang w:val="ru-RU"/>
+        </w:rPr>
+        <w:t xml:space="preserve"> </w:t>
+      </w:r>
+      <w:proofErr w:type="spellStart"/>
+      <w:r>
+        <w:rPr>
+          <w:lang w:val="ru-RU"/>
+        </w:rPr>
+        <w:t>провјеру</w:t>
+      </w:r>
+      <w:proofErr w:type="spellEnd"/>
+      <w:r>
+        <w:rPr>
+          <w:lang w:val="ru-RU"/>
+        </w:rPr>
+        <w:t xml:space="preserve"> </w:t>
+      </w:r>
+      <w:proofErr w:type="spellStart"/>
+      <w:r>
+        <w:rPr>
+          <w:lang w:val="ru-RU"/>
+        </w:rPr>
+        <w:t>одређених</w:t>
+      </w:r>
+      <w:proofErr w:type="spellEnd"/>
+      <w:r>
+        <w:rPr>
+          <w:lang w:val="ru-RU"/>
+        </w:rPr>
+        <w:t xml:space="preserve"> </w:t>
+      </w:r>
+      <w:proofErr w:type="spellStart"/>
+      <w:r>
+        <w:rPr>
+          <w:lang w:val="ru-RU"/>
+        </w:rPr>
+        <w:t>информација</w:t>
+      </w:r>
+      <w:proofErr w:type="spellEnd"/>
+      <w:r>
+        <w:rPr>
+          <w:lang w:val="ru-RU"/>
+        </w:rPr>
+        <w:t xml:space="preserve"> без </w:t>
+      </w:r>
+      <w:proofErr w:type="spellStart"/>
+      <w:r>
+        <w:rPr>
+          <w:lang w:val="ru-RU"/>
+        </w:rPr>
+        <w:t>њиховог</w:t>
+      </w:r>
+      <w:proofErr w:type="spellEnd"/>
+      <w:r>
+        <w:rPr>
+          <w:lang w:val="ru-RU"/>
+        </w:rPr>
+        <w:t xml:space="preserve"> </w:t>
+      </w:r>
+      <w:proofErr w:type="spellStart"/>
+      <w:r>
+        <w:rPr>
+          <w:lang w:val="ru-RU"/>
+        </w:rPr>
+        <w:t>директног</w:t>
+      </w:r>
+      <w:proofErr w:type="spellEnd"/>
+      <w:r>
+        <w:rPr>
+          <w:lang w:val="ru-RU"/>
+        </w:rPr>
+        <w:t xml:space="preserve"> </w:t>
+      </w:r>
+      <w:proofErr w:type="spellStart"/>
+      <w:r>
+        <w:rPr>
+          <w:lang w:val="ru-RU"/>
+        </w:rPr>
+        <w:t>откривања</w:t>
+      </w:r>
+      <w:proofErr w:type="spellEnd"/>
+      <w:r>
+        <w:rPr>
+          <w:lang w:val="ru-RU"/>
+        </w:rPr>
+        <w:t xml:space="preserve">. </w:t>
+      </w:r>
+      <w:proofErr w:type="spellStart"/>
+      <w:r>
+        <w:rPr>
+          <w:lang w:val="ru-RU"/>
+        </w:rPr>
+        <w:t>Неке</w:t>
+      </w:r>
+      <w:proofErr w:type="spellEnd"/>
+      <w:r>
+        <w:rPr>
+          <w:lang w:val="ru-RU"/>
+        </w:rPr>
+        <w:t xml:space="preserve"> од </w:t>
+      </w:r>
+      <w:proofErr w:type="spellStart"/>
+      <w:r>
+        <w:rPr>
+          <w:lang w:val="ru-RU"/>
+        </w:rPr>
+        <w:t>значајнијих</w:t>
+      </w:r>
+      <w:proofErr w:type="spellEnd"/>
+      <w:r>
+        <w:rPr>
+          <w:lang w:val="ru-RU"/>
+        </w:rPr>
+        <w:t xml:space="preserve"> области </w:t>
+      </w:r>
+      <w:proofErr w:type="spellStart"/>
+      <w:r>
+        <w:rPr>
+          <w:lang w:val="ru-RU"/>
+        </w:rPr>
+        <w:t>примјене</w:t>
+      </w:r>
+      <w:proofErr w:type="spellEnd"/>
+      <w:r>
+        <w:rPr>
+          <w:lang w:val="ru-RU"/>
+        </w:rPr>
+        <w:t xml:space="preserve"> су </w:t>
+      </w:r>
+      <w:proofErr w:type="spellStart"/>
+      <w:r>
+        <w:rPr>
+          <w:lang w:val="ru-RU"/>
+        </w:rPr>
+        <w:t>блокчејн</w:t>
+      </w:r>
+      <w:proofErr w:type="spellEnd"/>
+      <w:r>
+        <w:rPr>
+          <w:lang w:val="ru-RU"/>
+        </w:rPr>
+        <w:t xml:space="preserve"> </w:t>
+      </w:r>
+      <w:proofErr w:type="spellStart"/>
+      <w:r>
+        <w:rPr>
+          <w:lang w:val="ru-RU"/>
+        </w:rPr>
+        <w:t>системи</w:t>
+      </w:r>
+      <w:proofErr w:type="spellEnd"/>
+      <w:r>
+        <w:rPr>
+          <w:lang w:val="ru-RU"/>
+        </w:rPr>
+        <w:t xml:space="preserve">, </w:t>
+      </w:r>
+      <w:proofErr w:type="spellStart"/>
+      <w:r>
+        <w:rPr>
+          <w:lang w:val="ru-RU"/>
+        </w:rPr>
+        <w:t>управљање</w:t>
+      </w:r>
+      <w:proofErr w:type="spellEnd"/>
+      <w:r>
+        <w:rPr>
+          <w:lang w:val="ru-RU"/>
+        </w:rPr>
+        <w:t xml:space="preserve"> </w:t>
+      </w:r>
+      <w:proofErr w:type="spellStart"/>
+      <w:r>
+        <w:rPr>
+          <w:lang w:val="ru-RU"/>
+        </w:rPr>
+        <w:t>дигиталним</w:t>
+      </w:r>
+      <w:proofErr w:type="spellEnd"/>
+      <w:r>
+        <w:rPr>
+          <w:lang w:val="ru-RU"/>
+        </w:rPr>
+        <w:t xml:space="preserve"> идентитетом, </w:t>
+      </w:r>
+      <w:proofErr w:type="spellStart"/>
+      <w:r>
+        <w:rPr>
+          <w:lang w:val="ru-RU"/>
+        </w:rPr>
+        <w:t>електронско</w:t>
+      </w:r>
+      <w:proofErr w:type="spellEnd"/>
+      <w:r>
+        <w:rPr>
+          <w:lang w:val="ru-RU"/>
+        </w:rPr>
+        <w:t xml:space="preserve"> </w:t>
+      </w:r>
+      <w:proofErr w:type="spellStart"/>
+      <w:r>
+        <w:rPr>
+          <w:lang w:val="ru-RU"/>
+        </w:rPr>
+        <w:t>гласање</w:t>
+      </w:r>
+      <w:proofErr w:type="spellEnd"/>
+      <w:r>
+        <w:rPr>
+          <w:lang w:val="ru-RU"/>
+        </w:rPr>
+        <w:t xml:space="preserve"> и </w:t>
+      </w:r>
+      <w:proofErr w:type="spellStart"/>
+      <w:r>
+        <w:rPr>
+          <w:lang w:val="ru-RU"/>
+        </w:rPr>
+        <w:t>аутентификација</w:t>
+      </w:r>
+      <w:proofErr w:type="spellEnd"/>
+      <w:r>
+        <w:rPr>
+          <w:lang w:val="ru-RU"/>
+        </w:rPr>
+        <w:t xml:space="preserve"> [</w:t>
+      </w:r>
+      <w:r>
+        <w:rPr>
+          <w:lang w:val="ru-RU"/>
+        </w:rPr>
+        <w:t>ДОДАЈ РЕФ</w:t>
+      </w:r>
+      <w:r>
+        <w:rPr>
+          <w:lang w:val="ru-RU"/>
+        </w:rPr>
+        <w:t>].</w:t>
+      </w:r>
+    </w:p>
+    <w:p>
+      <w:pPr>
+        <w:pStyle w:val="NormalWeb"/>
+        <w:ind w:left="547"/>
+        <w:jc w:val="both"/>
+        <w:rPr>
+          <w:lang w:val="ru-RU"/>
+        </w:rPr>
+      </w:pPr>
+      <w:proofErr w:type="spellStart"/>
+      <w:r>
+        <w:rPr>
+          <w:lang w:val="ru-RU"/>
+        </w:rPr>
+        <w:t>Једна</w:t>
+      </w:r>
+      <w:proofErr w:type="spellEnd"/>
+      <w:r>
+        <w:rPr>
+          <w:lang w:val="ru-RU"/>
+        </w:rPr>
+        <w:t xml:space="preserve"> од </w:t>
+      </w:r>
+      <w:proofErr w:type="spellStart"/>
+      <w:r>
+        <w:rPr>
+          <w:lang w:val="ru-RU"/>
+        </w:rPr>
+        <w:t>познатијих</w:t>
+      </w:r>
+      <w:proofErr w:type="spellEnd"/>
+      <w:r>
+        <w:rPr>
+          <w:lang w:val="ru-RU"/>
+        </w:rPr>
+        <w:t xml:space="preserve"> </w:t>
+      </w:r>
+      <w:proofErr w:type="spellStart"/>
+      <w:r>
+        <w:rPr>
+          <w:lang w:val="ru-RU"/>
+        </w:rPr>
+        <w:t>примјена</w:t>
+      </w:r>
+      <w:proofErr w:type="spellEnd"/>
+      <w:r>
+        <w:rPr>
+          <w:lang w:val="ru-RU"/>
+        </w:rPr>
+        <w:t xml:space="preserve"> </w:t>
+      </w:r>
+      <w:r>
+        <w:t>ZKP</w:t>
+      </w:r>
+      <w:r>
+        <w:rPr>
+          <w:lang w:val="ru-RU"/>
+        </w:rPr>
+        <w:t xml:space="preserve"> протокола </w:t>
+      </w:r>
+      <w:proofErr w:type="spellStart"/>
+      <w:r>
+        <w:rPr>
+          <w:lang w:val="ru-RU"/>
+        </w:rPr>
+        <w:t>је</w:t>
+      </w:r>
+      <w:proofErr w:type="spellEnd"/>
+      <w:r>
+        <w:rPr>
+          <w:lang w:val="ru-RU"/>
+        </w:rPr>
+        <w:t xml:space="preserve"> у </w:t>
+      </w:r>
+      <w:proofErr w:type="spellStart"/>
+      <w:r>
+        <w:rPr>
+          <w:lang w:val="ru-RU"/>
+        </w:rPr>
+        <w:t>блокчејн</w:t>
+      </w:r>
+      <w:proofErr w:type="spellEnd"/>
+      <w:r>
+        <w:rPr>
+          <w:lang w:val="ru-RU"/>
+        </w:rPr>
+        <w:t xml:space="preserve"> </w:t>
+      </w:r>
+      <w:proofErr w:type="spellStart"/>
+      <w:r>
+        <w:rPr>
+          <w:lang w:val="ru-RU"/>
+        </w:rPr>
+        <w:t>системима</w:t>
+      </w:r>
+      <w:proofErr w:type="spellEnd"/>
+      <w:r>
+        <w:rPr>
+          <w:lang w:val="ru-RU"/>
+        </w:rPr>
+        <w:t xml:space="preserve">. У </w:t>
+      </w:r>
+      <w:proofErr w:type="spellStart"/>
+      <w:r>
+        <w:rPr>
+          <w:lang w:val="ru-RU"/>
+        </w:rPr>
+        <w:t>овом</w:t>
+      </w:r>
+      <w:proofErr w:type="spellEnd"/>
+      <w:r>
+        <w:rPr>
+          <w:lang w:val="ru-RU"/>
+        </w:rPr>
+        <w:t xml:space="preserve"> </w:t>
+      </w:r>
+      <w:proofErr w:type="spellStart"/>
+      <w:r>
+        <w:rPr>
+          <w:lang w:val="ru-RU"/>
+        </w:rPr>
+        <w:t>случају</w:t>
+      </w:r>
+      <w:proofErr w:type="spellEnd"/>
+      <w:r>
+        <w:rPr>
+          <w:lang w:val="ru-RU"/>
+        </w:rPr>
+        <w:t xml:space="preserve"> </w:t>
+      </w:r>
+      <w:proofErr w:type="spellStart"/>
+      <w:r>
+        <w:rPr>
+          <w:lang w:val="ru-RU"/>
+        </w:rPr>
+        <w:t>могуће</w:t>
+      </w:r>
+      <w:proofErr w:type="spellEnd"/>
+      <w:r>
+        <w:rPr>
+          <w:lang w:val="ru-RU"/>
+        </w:rPr>
+        <w:t xml:space="preserve"> </w:t>
+      </w:r>
+      <w:proofErr w:type="spellStart"/>
+      <w:r>
+        <w:rPr>
+          <w:lang w:val="ru-RU"/>
+        </w:rPr>
+        <w:t>је</w:t>
+      </w:r>
+      <w:proofErr w:type="spellEnd"/>
+      <w:r>
+        <w:rPr>
+          <w:lang w:val="ru-RU"/>
+        </w:rPr>
+        <w:t xml:space="preserve"> </w:t>
+      </w:r>
+      <w:proofErr w:type="spellStart"/>
+      <w:r>
+        <w:rPr>
+          <w:lang w:val="ru-RU"/>
+        </w:rPr>
+        <w:t>доказати</w:t>
+      </w:r>
+      <w:proofErr w:type="spellEnd"/>
+      <w:r>
+        <w:rPr>
+          <w:lang w:val="ru-RU"/>
+        </w:rPr>
+        <w:t xml:space="preserve"> </w:t>
+      </w:r>
+      <w:proofErr w:type="spellStart"/>
+      <w:r>
+        <w:rPr>
+          <w:lang w:val="ru-RU"/>
+        </w:rPr>
+        <w:t>исправност</w:t>
+      </w:r>
+      <w:proofErr w:type="spellEnd"/>
+      <w:r>
+        <w:rPr>
+          <w:lang w:val="ru-RU"/>
+        </w:rPr>
+        <w:t xml:space="preserve"> </w:t>
+      </w:r>
+      <w:proofErr w:type="spellStart"/>
+      <w:r>
+        <w:rPr>
+          <w:lang w:val="ru-RU"/>
+        </w:rPr>
+        <w:t>одређене</w:t>
+      </w:r>
+      <w:proofErr w:type="spellEnd"/>
+      <w:r>
+        <w:rPr>
+          <w:lang w:val="ru-RU"/>
+        </w:rPr>
+        <w:t xml:space="preserve"> </w:t>
+      </w:r>
+      <w:proofErr w:type="spellStart"/>
+      <w:r>
+        <w:rPr>
+          <w:lang w:val="ru-RU"/>
+        </w:rPr>
+        <w:t>трансакције</w:t>
+      </w:r>
+      <w:proofErr w:type="spellEnd"/>
+      <w:r>
+        <w:rPr>
+          <w:lang w:val="ru-RU"/>
+        </w:rPr>
+        <w:t xml:space="preserve"> без </w:t>
+      </w:r>
+      <w:proofErr w:type="spellStart"/>
+      <w:r>
+        <w:rPr>
+          <w:lang w:val="ru-RU"/>
+        </w:rPr>
+        <w:t>откривања</w:t>
+      </w:r>
+      <w:proofErr w:type="spellEnd"/>
+      <w:r>
+        <w:rPr>
+          <w:lang w:val="ru-RU"/>
+        </w:rPr>
+        <w:t xml:space="preserve"> свих </w:t>
+      </w:r>
+      <w:proofErr w:type="spellStart"/>
+      <w:r>
+        <w:rPr>
+          <w:lang w:val="ru-RU"/>
+        </w:rPr>
+        <w:t>података</w:t>
+      </w:r>
+      <w:proofErr w:type="spellEnd"/>
+      <w:r>
+        <w:rPr>
+          <w:lang w:val="ru-RU"/>
+        </w:rPr>
+        <w:t xml:space="preserve"> </w:t>
+      </w:r>
+      <w:proofErr w:type="spellStart"/>
+      <w:r>
+        <w:rPr>
+          <w:lang w:val="ru-RU"/>
+        </w:rPr>
+        <w:t>који</w:t>
+      </w:r>
+      <w:proofErr w:type="spellEnd"/>
+      <w:r>
+        <w:rPr>
+          <w:lang w:val="ru-RU"/>
+        </w:rPr>
+        <w:t xml:space="preserve"> су </w:t>
+      </w:r>
+      <w:proofErr w:type="spellStart"/>
+      <w:r>
+        <w:rPr>
+          <w:lang w:val="ru-RU"/>
+        </w:rPr>
+        <w:t>кориштени</w:t>
+      </w:r>
+      <w:proofErr w:type="spellEnd"/>
+      <w:r>
+        <w:rPr>
+          <w:lang w:val="ru-RU"/>
+        </w:rPr>
+        <w:t xml:space="preserve"> приликом </w:t>
+      </w:r>
+      <w:proofErr w:type="spellStart"/>
+      <w:r>
+        <w:rPr>
+          <w:lang w:val="ru-RU"/>
+        </w:rPr>
+        <w:t>њеног</w:t>
+      </w:r>
+      <w:proofErr w:type="spellEnd"/>
+      <w:r>
+        <w:rPr>
+          <w:lang w:val="ru-RU"/>
+        </w:rPr>
+        <w:t xml:space="preserve"> </w:t>
+      </w:r>
+      <w:proofErr w:type="spellStart"/>
+      <w:r>
+        <w:rPr>
+          <w:lang w:val="ru-RU"/>
+        </w:rPr>
+        <w:t>формирања</w:t>
+      </w:r>
+      <w:proofErr w:type="spellEnd"/>
+      <w:r>
+        <w:rPr>
+          <w:lang w:val="ru-RU"/>
+        </w:rPr>
+        <w:t xml:space="preserve">. На </w:t>
+      </w:r>
+      <w:proofErr w:type="spellStart"/>
+      <w:r>
+        <w:rPr>
+          <w:lang w:val="ru-RU"/>
+        </w:rPr>
+        <w:t>овај</w:t>
+      </w:r>
+      <w:proofErr w:type="spellEnd"/>
+      <w:r>
+        <w:rPr>
+          <w:lang w:val="ru-RU"/>
+        </w:rPr>
+        <w:t xml:space="preserve"> начин </w:t>
+      </w:r>
+      <w:proofErr w:type="spellStart"/>
+      <w:r>
+        <w:rPr>
+          <w:lang w:val="ru-RU"/>
+        </w:rPr>
+        <w:t>омогућава</w:t>
+      </w:r>
+      <w:proofErr w:type="spellEnd"/>
+      <w:r>
+        <w:rPr>
+          <w:lang w:val="ru-RU"/>
+        </w:rPr>
+        <w:t xml:space="preserve"> се </w:t>
+      </w:r>
+      <w:proofErr w:type="spellStart"/>
+      <w:r>
+        <w:rPr>
+          <w:lang w:val="ru-RU"/>
+        </w:rPr>
+        <w:t>провјера</w:t>
+      </w:r>
+      <w:proofErr w:type="spellEnd"/>
+      <w:r>
+        <w:rPr>
+          <w:lang w:val="ru-RU"/>
+        </w:rPr>
+        <w:t xml:space="preserve"> исправности </w:t>
+      </w:r>
+      <w:proofErr w:type="spellStart"/>
+      <w:r>
+        <w:rPr>
+          <w:lang w:val="ru-RU"/>
+        </w:rPr>
+        <w:t>трансакција</w:t>
+      </w:r>
+      <w:proofErr w:type="spellEnd"/>
+      <w:r>
+        <w:rPr>
+          <w:lang w:val="ru-RU"/>
+        </w:rPr>
+        <w:t xml:space="preserve"> уз </w:t>
+      </w:r>
+      <w:proofErr w:type="spellStart"/>
+      <w:r>
+        <w:rPr>
+          <w:lang w:val="ru-RU"/>
+        </w:rPr>
+        <w:t>истовремено</w:t>
+      </w:r>
+      <w:proofErr w:type="spellEnd"/>
+      <w:r>
+        <w:rPr>
+          <w:lang w:val="ru-RU"/>
+        </w:rPr>
+        <w:t xml:space="preserve"> </w:t>
+      </w:r>
+      <w:proofErr w:type="spellStart"/>
+      <w:r>
+        <w:rPr>
+          <w:lang w:val="ru-RU"/>
+        </w:rPr>
+        <w:t>очување</w:t>
+      </w:r>
+      <w:proofErr w:type="spellEnd"/>
+      <w:r>
+        <w:rPr>
+          <w:lang w:val="ru-RU"/>
+        </w:rPr>
+        <w:t xml:space="preserve"> приватности </w:t>
+      </w:r>
+      <w:proofErr w:type="spellStart"/>
+      <w:r>
+        <w:rPr>
+          <w:lang w:val="ru-RU"/>
+        </w:rPr>
+        <w:t>одређених</w:t>
+      </w:r>
+      <w:proofErr w:type="spellEnd"/>
+      <w:r>
+        <w:rPr>
+          <w:lang w:val="ru-RU"/>
+        </w:rPr>
+        <w:t xml:space="preserve"> </w:t>
+      </w:r>
+      <w:proofErr w:type="spellStart"/>
+      <w:r>
+        <w:rPr>
+          <w:lang w:val="ru-RU"/>
+        </w:rPr>
+        <w:t>информација</w:t>
+      </w:r>
+      <w:proofErr w:type="spellEnd"/>
+      <w:r>
+        <w:rPr>
+          <w:lang w:val="ru-RU"/>
+        </w:rPr>
+        <w:t xml:space="preserve"> [</w:t>
+      </w:r>
+      <w:r>
+        <w:rPr>
+          <w:lang w:val="sr-Cyrl-RS"/>
+        </w:rPr>
+        <w:t>ДОДАЈ РЕФ</w:t>
+      </w:r>
+      <w:r>
+        <w:rPr>
+          <w:lang w:val="ru-RU"/>
+        </w:rPr>
+        <w:t>].</w:t>
+      </w:r>
+    </w:p>
+    <w:p>
+      <w:pPr>
+        <w:pStyle w:val="NormalWeb"/>
+        <w:ind w:left="547"/>
+        <w:jc w:val="both"/>
+        <w:rPr>
+          <w:lang w:val="ru-RU"/>
+        </w:rPr>
+      </w:pPr>
+      <w:r>
+        <w:t>ZKP</w:t>
+      </w:r>
+      <w:r>
+        <w:rPr>
+          <w:lang w:val="ru-RU"/>
+        </w:rPr>
+        <w:t xml:space="preserve"> </w:t>
+      </w:r>
+      <w:proofErr w:type="spellStart"/>
+      <w:r>
+        <w:rPr>
+          <w:lang w:val="ru-RU"/>
+        </w:rPr>
+        <w:t>протоколи</w:t>
+      </w:r>
+      <w:proofErr w:type="spellEnd"/>
+      <w:r>
+        <w:rPr>
+          <w:lang w:val="ru-RU"/>
+        </w:rPr>
+        <w:t xml:space="preserve"> могу се </w:t>
+      </w:r>
+      <w:proofErr w:type="spellStart"/>
+      <w:r>
+        <w:rPr>
+          <w:lang w:val="ru-RU"/>
+        </w:rPr>
+        <w:t>користити</w:t>
+      </w:r>
+      <w:proofErr w:type="spellEnd"/>
+      <w:r>
+        <w:rPr>
+          <w:lang w:val="ru-RU"/>
+        </w:rPr>
+        <w:t xml:space="preserve"> и за </w:t>
+      </w:r>
+      <w:proofErr w:type="spellStart"/>
+      <w:r>
+        <w:rPr>
+          <w:lang w:val="ru-RU"/>
+        </w:rPr>
+        <w:t>управљање</w:t>
+      </w:r>
+      <w:proofErr w:type="spellEnd"/>
+      <w:r>
+        <w:rPr>
+          <w:lang w:val="ru-RU"/>
+        </w:rPr>
+        <w:t xml:space="preserve"> </w:t>
+      </w:r>
+      <w:proofErr w:type="spellStart"/>
+      <w:r>
+        <w:rPr>
+          <w:lang w:val="ru-RU"/>
+        </w:rPr>
+        <w:t>дигиталним</w:t>
+      </w:r>
+      <w:proofErr w:type="spellEnd"/>
+      <w:r>
+        <w:rPr>
+          <w:lang w:val="ru-RU"/>
+        </w:rPr>
+        <w:t xml:space="preserve"> идентитетом. На </w:t>
+      </w:r>
+      <w:proofErr w:type="spellStart"/>
+      <w:r>
+        <w:rPr>
+          <w:lang w:val="ru-RU"/>
+        </w:rPr>
+        <w:t>примјер</w:t>
+      </w:r>
+      <w:proofErr w:type="spellEnd"/>
+      <w:r>
+        <w:rPr>
+          <w:lang w:val="ru-RU"/>
+        </w:rPr>
+        <w:t xml:space="preserve">, </w:t>
+      </w:r>
+      <w:proofErr w:type="spellStart"/>
+      <w:r>
+        <w:rPr>
+          <w:lang w:val="ru-RU"/>
+        </w:rPr>
+        <w:t>корисник</w:t>
+      </w:r>
+      <w:proofErr w:type="spellEnd"/>
+      <w:r>
+        <w:rPr>
+          <w:lang w:val="ru-RU"/>
+        </w:rPr>
+        <w:t xml:space="preserve"> </w:t>
+      </w:r>
+      <w:proofErr w:type="spellStart"/>
+      <w:r>
+        <w:rPr>
+          <w:lang w:val="ru-RU"/>
+        </w:rPr>
+        <w:t>може</w:t>
+      </w:r>
+      <w:proofErr w:type="spellEnd"/>
+      <w:r>
+        <w:rPr>
+          <w:lang w:val="ru-RU"/>
+        </w:rPr>
+        <w:t xml:space="preserve"> </w:t>
+      </w:r>
+      <w:proofErr w:type="spellStart"/>
+      <w:r>
+        <w:rPr>
+          <w:lang w:val="ru-RU"/>
+        </w:rPr>
+        <w:t>доказати</w:t>
+      </w:r>
+      <w:proofErr w:type="spellEnd"/>
+      <w:r>
+        <w:rPr>
+          <w:lang w:val="ru-RU"/>
+        </w:rPr>
+        <w:t xml:space="preserve"> да </w:t>
+      </w:r>
+      <w:proofErr w:type="spellStart"/>
+      <w:r>
+        <w:rPr>
+          <w:lang w:val="ru-RU"/>
+        </w:rPr>
+        <w:t>испуњава</w:t>
+      </w:r>
+      <w:proofErr w:type="spellEnd"/>
+      <w:r>
+        <w:rPr>
+          <w:lang w:val="ru-RU"/>
+        </w:rPr>
+        <w:t xml:space="preserve"> </w:t>
+      </w:r>
+      <w:proofErr w:type="spellStart"/>
+      <w:r>
+        <w:rPr>
+          <w:lang w:val="ru-RU"/>
+        </w:rPr>
+        <w:t>одређени</w:t>
+      </w:r>
+      <w:proofErr w:type="spellEnd"/>
+      <w:r>
+        <w:rPr>
+          <w:lang w:val="ru-RU"/>
+        </w:rPr>
+        <w:t xml:space="preserve"> </w:t>
+      </w:r>
+      <w:proofErr w:type="spellStart"/>
+      <w:r>
+        <w:rPr>
+          <w:lang w:val="ru-RU"/>
+        </w:rPr>
+        <w:t>старосни</w:t>
+      </w:r>
+      <w:proofErr w:type="spellEnd"/>
+      <w:r>
+        <w:rPr>
+          <w:lang w:val="ru-RU"/>
+        </w:rPr>
+        <w:t xml:space="preserve"> </w:t>
+      </w:r>
+      <w:proofErr w:type="spellStart"/>
+      <w:r>
+        <w:rPr>
+          <w:lang w:val="ru-RU"/>
+        </w:rPr>
+        <w:t>услов</w:t>
+      </w:r>
+      <w:proofErr w:type="spellEnd"/>
+      <w:r>
+        <w:rPr>
+          <w:lang w:val="ru-RU"/>
+        </w:rPr>
+        <w:t xml:space="preserve"> без </w:t>
+      </w:r>
+      <w:proofErr w:type="spellStart"/>
+      <w:r>
+        <w:rPr>
+          <w:lang w:val="ru-RU"/>
+        </w:rPr>
+        <w:t>откривања</w:t>
+      </w:r>
+      <w:proofErr w:type="spellEnd"/>
+      <w:r>
+        <w:rPr>
+          <w:lang w:val="ru-RU"/>
+        </w:rPr>
+        <w:t xml:space="preserve"> </w:t>
+      </w:r>
+      <w:proofErr w:type="spellStart"/>
+      <w:r>
+        <w:rPr>
+          <w:lang w:val="ru-RU"/>
+        </w:rPr>
+        <w:t>тачног</w:t>
+      </w:r>
+      <w:proofErr w:type="spellEnd"/>
+      <w:r>
+        <w:rPr>
+          <w:lang w:val="ru-RU"/>
+        </w:rPr>
+        <w:t xml:space="preserve"> </w:t>
+      </w:r>
+      <w:proofErr w:type="spellStart"/>
+      <w:r>
+        <w:rPr>
+          <w:lang w:val="ru-RU"/>
+        </w:rPr>
+        <w:t>датума</w:t>
+      </w:r>
+      <w:proofErr w:type="spellEnd"/>
+      <w:r>
+        <w:rPr>
+          <w:lang w:val="ru-RU"/>
+        </w:rPr>
+        <w:t xml:space="preserve"> </w:t>
+      </w:r>
+      <w:proofErr w:type="spellStart"/>
+      <w:r>
+        <w:rPr>
+          <w:lang w:val="ru-RU"/>
+        </w:rPr>
+        <w:t>рођења</w:t>
+      </w:r>
+      <w:proofErr w:type="spellEnd"/>
+      <w:r>
+        <w:rPr>
+          <w:lang w:val="ru-RU"/>
+        </w:rPr>
+        <w:t xml:space="preserve">. На </w:t>
+      </w:r>
+      <w:proofErr w:type="spellStart"/>
+      <w:r>
+        <w:rPr>
+          <w:lang w:val="ru-RU"/>
+        </w:rPr>
+        <w:t>тај</w:t>
+      </w:r>
+      <w:proofErr w:type="spellEnd"/>
+      <w:r>
+        <w:rPr>
+          <w:lang w:val="ru-RU"/>
+        </w:rPr>
+        <w:t xml:space="preserve"> начин </w:t>
+      </w:r>
+      <w:proofErr w:type="spellStart"/>
+      <w:r>
+        <w:rPr>
+          <w:lang w:val="ru-RU"/>
+        </w:rPr>
+        <w:t>другој</w:t>
+      </w:r>
+      <w:proofErr w:type="spellEnd"/>
+      <w:r>
+        <w:rPr>
+          <w:lang w:val="ru-RU"/>
+        </w:rPr>
+        <w:t xml:space="preserve"> </w:t>
+      </w:r>
+      <w:proofErr w:type="spellStart"/>
+      <w:r>
+        <w:rPr>
+          <w:lang w:val="ru-RU"/>
+        </w:rPr>
+        <w:t>страни</w:t>
+      </w:r>
+      <w:proofErr w:type="spellEnd"/>
+      <w:r>
+        <w:rPr>
+          <w:lang w:val="ru-RU"/>
+        </w:rPr>
+        <w:t xml:space="preserve"> се </w:t>
+      </w:r>
+      <w:proofErr w:type="spellStart"/>
+      <w:r>
+        <w:rPr>
+          <w:lang w:val="ru-RU"/>
+        </w:rPr>
+        <w:t>открива</w:t>
+      </w:r>
+      <w:proofErr w:type="spellEnd"/>
+      <w:r>
+        <w:rPr>
+          <w:lang w:val="ru-RU"/>
+        </w:rPr>
+        <w:t xml:space="preserve"> само </w:t>
+      </w:r>
+      <w:proofErr w:type="spellStart"/>
+      <w:r>
+        <w:rPr>
+          <w:lang w:val="ru-RU"/>
+        </w:rPr>
+        <w:t>информација</w:t>
+      </w:r>
+      <w:proofErr w:type="spellEnd"/>
+      <w:r>
+        <w:rPr>
+          <w:lang w:val="ru-RU"/>
+        </w:rPr>
+        <w:t xml:space="preserve"> </w:t>
+      </w:r>
+      <w:proofErr w:type="spellStart"/>
+      <w:r>
+        <w:rPr>
+          <w:lang w:val="ru-RU"/>
+        </w:rPr>
+        <w:t>која</w:t>
+      </w:r>
+      <w:proofErr w:type="spellEnd"/>
+      <w:r>
+        <w:rPr>
+          <w:lang w:val="ru-RU"/>
+        </w:rPr>
+        <w:t xml:space="preserve"> </w:t>
+      </w:r>
+      <w:proofErr w:type="spellStart"/>
+      <w:r>
+        <w:rPr>
+          <w:lang w:val="ru-RU"/>
+        </w:rPr>
+        <w:t>је</w:t>
+      </w:r>
+      <w:proofErr w:type="spellEnd"/>
+      <w:r>
+        <w:rPr>
+          <w:lang w:val="ru-RU"/>
+        </w:rPr>
+        <w:t xml:space="preserve"> </w:t>
+      </w:r>
+      <w:proofErr w:type="spellStart"/>
+      <w:r>
+        <w:rPr>
+          <w:lang w:val="ru-RU"/>
+        </w:rPr>
+        <w:t>неопходна</w:t>
+      </w:r>
+      <w:proofErr w:type="spellEnd"/>
+      <w:r>
+        <w:rPr>
+          <w:lang w:val="ru-RU"/>
+        </w:rPr>
+        <w:t xml:space="preserve"> за </w:t>
+      </w:r>
+      <w:proofErr w:type="spellStart"/>
+      <w:r>
+        <w:rPr>
+          <w:lang w:val="ru-RU"/>
+        </w:rPr>
+        <w:t>конкретну</w:t>
+      </w:r>
+      <w:proofErr w:type="spellEnd"/>
+      <w:r>
+        <w:rPr>
+          <w:lang w:val="ru-RU"/>
+        </w:rPr>
+        <w:t xml:space="preserve"> </w:t>
+      </w:r>
+      <w:proofErr w:type="spellStart"/>
+      <w:r>
+        <w:rPr>
+          <w:lang w:val="ru-RU"/>
+        </w:rPr>
+        <w:t>провјеру</w:t>
+      </w:r>
+      <w:proofErr w:type="spellEnd"/>
+      <w:r>
+        <w:rPr>
+          <w:lang w:val="ru-RU"/>
+        </w:rPr>
+        <w:t xml:space="preserve"> [</w:t>
+      </w:r>
+      <w:r>
+        <w:rPr>
+          <w:lang w:val="sr-Cyrl-RS"/>
+        </w:rPr>
+        <w:t>ДОДАЈ РЕФ</w:t>
+      </w:r>
+      <w:r>
+        <w:rPr>
+          <w:lang w:val="ru-RU"/>
+        </w:rPr>
+        <w:t>].</w:t>
+      </w:r>
+    </w:p>
+    <w:p>
+      <w:pPr>
+        <w:pStyle w:val="NormalWeb"/>
+        <w:ind w:left="547"/>
+        <w:jc w:val="both"/>
+        <w:rPr>
+          <w:lang w:val="ru-RU"/>
+        </w:rPr>
+      </w:pPr>
+      <w:proofErr w:type="spellStart"/>
+      <w:r>
+        <w:rPr>
+          <w:lang w:val="ru-RU"/>
+        </w:rPr>
+        <w:t>Још</w:t>
+      </w:r>
+      <w:proofErr w:type="spellEnd"/>
+      <w:r>
+        <w:rPr>
+          <w:lang w:val="ru-RU"/>
+        </w:rPr>
+        <w:t xml:space="preserve"> </w:t>
+      </w:r>
+      <w:proofErr w:type="spellStart"/>
+      <w:r>
+        <w:rPr>
+          <w:lang w:val="ru-RU"/>
+        </w:rPr>
+        <w:t>једна</w:t>
+      </w:r>
+      <w:proofErr w:type="spellEnd"/>
+      <w:r>
+        <w:rPr>
+          <w:lang w:val="ru-RU"/>
+        </w:rPr>
+        <w:t xml:space="preserve"> </w:t>
+      </w:r>
+      <w:proofErr w:type="spellStart"/>
+      <w:r>
+        <w:rPr>
+          <w:lang w:val="ru-RU"/>
+        </w:rPr>
+        <w:t>област</w:t>
+      </w:r>
+      <w:proofErr w:type="spellEnd"/>
+      <w:r>
+        <w:rPr>
+          <w:lang w:val="ru-RU"/>
+        </w:rPr>
+        <w:t xml:space="preserve"> </w:t>
+      </w:r>
+      <w:proofErr w:type="spellStart"/>
+      <w:r>
+        <w:rPr>
+          <w:lang w:val="ru-RU"/>
+        </w:rPr>
+        <w:t>примјене</w:t>
+      </w:r>
+      <w:proofErr w:type="spellEnd"/>
+      <w:r>
+        <w:rPr>
+          <w:lang w:val="ru-RU"/>
+        </w:rPr>
+        <w:t xml:space="preserve"> су </w:t>
+      </w:r>
+      <w:proofErr w:type="spellStart"/>
+      <w:r>
+        <w:rPr>
+          <w:lang w:val="ru-RU"/>
+        </w:rPr>
+        <w:t>системи</w:t>
+      </w:r>
+      <w:proofErr w:type="spellEnd"/>
+      <w:r>
+        <w:rPr>
+          <w:lang w:val="ru-RU"/>
+        </w:rPr>
+        <w:t xml:space="preserve"> </w:t>
+      </w:r>
+      <w:proofErr w:type="spellStart"/>
+      <w:r>
+        <w:rPr>
+          <w:lang w:val="ru-RU"/>
+        </w:rPr>
+        <w:t>електронског</w:t>
+      </w:r>
+      <w:proofErr w:type="spellEnd"/>
+      <w:r>
+        <w:rPr>
+          <w:lang w:val="ru-RU"/>
+        </w:rPr>
+        <w:t xml:space="preserve"> </w:t>
+      </w:r>
+      <w:proofErr w:type="spellStart"/>
+      <w:r>
+        <w:rPr>
+          <w:lang w:val="ru-RU"/>
+        </w:rPr>
+        <w:t>гласања</w:t>
+      </w:r>
+      <w:proofErr w:type="spellEnd"/>
+      <w:r>
+        <w:rPr>
+          <w:lang w:val="ru-RU"/>
+        </w:rPr>
+        <w:t xml:space="preserve">. Код </w:t>
+      </w:r>
+      <w:proofErr w:type="spellStart"/>
+      <w:r>
+        <w:rPr>
+          <w:lang w:val="ru-RU"/>
+        </w:rPr>
+        <w:t>ових</w:t>
+      </w:r>
+      <w:proofErr w:type="spellEnd"/>
+      <w:r>
+        <w:rPr>
+          <w:lang w:val="ru-RU"/>
+        </w:rPr>
+        <w:t xml:space="preserve"> система </w:t>
+      </w:r>
+      <w:r>
+        <w:t>ZKP</w:t>
+      </w:r>
+      <w:r>
+        <w:rPr>
+          <w:lang w:val="ru-RU"/>
+        </w:rPr>
+        <w:t xml:space="preserve"> </w:t>
+      </w:r>
+      <w:proofErr w:type="spellStart"/>
+      <w:r>
+        <w:rPr>
+          <w:lang w:val="ru-RU"/>
+        </w:rPr>
+        <w:t>протоколи</w:t>
+      </w:r>
+      <w:proofErr w:type="spellEnd"/>
+      <w:r>
+        <w:rPr>
+          <w:lang w:val="ru-RU"/>
+        </w:rPr>
+        <w:t xml:space="preserve"> могу </w:t>
+      </w:r>
+      <w:proofErr w:type="spellStart"/>
+      <w:r>
+        <w:rPr>
+          <w:lang w:val="ru-RU"/>
+        </w:rPr>
+        <w:t>омогућити</w:t>
+      </w:r>
+      <w:proofErr w:type="spellEnd"/>
+      <w:r>
+        <w:rPr>
+          <w:lang w:val="ru-RU"/>
+        </w:rPr>
+        <w:t xml:space="preserve"> </w:t>
+      </w:r>
+      <w:proofErr w:type="spellStart"/>
+      <w:r>
+        <w:rPr>
+          <w:lang w:val="ru-RU"/>
+        </w:rPr>
+        <w:t>провјеру</w:t>
+      </w:r>
+      <w:proofErr w:type="spellEnd"/>
+      <w:r>
+        <w:rPr>
+          <w:lang w:val="ru-RU"/>
+        </w:rPr>
+        <w:t xml:space="preserve"> исправности гласа без </w:t>
+      </w:r>
+      <w:proofErr w:type="spellStart"/>
+      <w:r>
+        <w:rPr>
+          <w:lang w:val="ru-RU"/>
+        </w:rPr>
+        <w:t>откривања</w:t>
+      </w:r>
+      <w:proofErr w:type="spellEnd"/>
+      <w:r>
+        <w:rPr>
+          <w:lang w:val="ru-RU"/>
+        </w:rPr>
+        <w:t xml:space="preserve"> </w:t>
+      </w:r>
+      <w:proofErr w:type="spellStart"/>
+      <w:r>
+        <w:rPr>
+          <w:lang w:val="ru-RU"/>
+        </w:rPr>
+        <w:t>избора</w:t>
+      </w:r>
+      <w:proofErr w:type="spellEnd"/>
+      <w:r>
+        <w:rPr>
+          <w:lang w:val="ru-RU"/>
+        </w:rPr>
+        <w:t xml:space="preserve"> </w:t>
+      </w:r>
+      <w:proofErr w:type="spellStart"/>
+      <w:r>
+        <w:rPr>
+          <w:lang w:val="ru-RU"/>
+        </w:rPr>
+        <w:t>гласача</w:t>
+      </w:r>
+      <w:proofErr w:type="spellEnd"/>
+      <w:r>
+        <w:rPr>
+          <w:lang w:val="ru-RU"/>
+        </w:rPr>
+        <w:t xml:space="preserve">, </w:t>
+      </w:r>
+      <w:proofErr w:type="spellStart"/>
+      <w:r>
+        <w:rPr>
+          <w:lang w:val="ru-RU"/>
+        </w:rPr>
+        <w:t>чиме</w:t>
+      </w:r>
+      <w:proofErr w:type="spellEnd"/>
+      <w:r>
+        <w:rPr>
+          <w:lang w:val="ru-RU"/>
+        </w:rPr>
+        <w:t xml:space="preserve"> се </w:t>
+      </w:r>
+      <w:proofErr w:type="spellStart"/>
+      <w:r>
+        <w:rPr>
+          <w:lang w:val="ru-RU"/>
+        </w:rPr>
+        <w:t>истовремено</w:t>
+      </w:r>
+      <w:proofErr w:type="spellEnd"/>
+      <w:r>
+        <w:rPr>
+          <w:lang w:val="ru-RU"/>
+        </w:rPr>
+        <w:t xml:space="preserve"> </w:t>
+      </w:r>
+      <w:proofErr w:type="spellStart"/>
+      <w:r>
+        <w:rPr>
+          <w:lang w:val="ru-RU"/>
+        </w:rPr>
+        <w:t>настоје</w:t>
+      </w:r>
+      <w:proofErr w:type="spellEnd"/>
+      <w:r>
+        <w:rPr>
+          <w:lang w:val="ru-RU"/>
+        </w:rPr>
+        <w:t xml:space="preserve"> </w:t>
+      </w:r>
+      <w:proofErr w:type="spellStart"/>
+      <w:r>
+        <w:rPr>
+          <w:lang w:val="ru-RU"/>
+        </w:rPr>
+        <w:t>обезбиједити</w:t>
+      </w:r>
+      <w:proofErr w:type="spellEnd"/>
+      <w:r>
+        <w:rPr>
+          <w:lang w:val="ru-RU"/>
+        </w:rPr>
+        <w:t xml:space="preserve"> </w:t>
+      </w:r>
+      <w:proofErr w:type="spellStart"/>
+      <w:r>
+        <w:rPr>
+          <w:lang w:val="ru-RU"/>
+        </w:rPr>
+        <w:t>могућност</w:t>
+      </w:r>
+      <w:proofErr w:type="spellEnd"/>
+      <w:r>
+        <w:rPr>
+          <w:lang w:val="ru-RU"/>
+        </w:rPr>
+        <w:t xml:space="preserve"> </w:t>
+      </w:r>
+      <w:proofErr w:type="spellStart"/>
+      <w:r>
+        <w:rPr>
+          <w:lang w:val="ru-RU"/>
+        </w:rPr>
+        <w:t>провјере</w:t>
+      </w:r>
+      <w:proofErr w:type="spellEnd"/>
+      <w:r>
+        <w:rPr>
+          <w:lang w:val="ru-RU"/>
+        </w:rPr>
+        <w:t xml:space="preserve"> и </w:t>
+      </w:r>
+      <w:proofErr w:type="spellStart"/>
+      <w:r>
+        <w:rPr>
+          <w:lang w:val="ru-RU"/>
+        </w:rPr>
+        <w:t>приватност</w:t>
+      </w:r>
+      <w:proofErr w:type="spellEnd"/>
+      <w:r>
+        <w:rPr>
+          <w:lang w:val="ru-RU"/>
+        </w:rPr>
+        <w:t xml:space="preserve"> [</w:t>
+      </w:r>
+      <w:r>
+        <w:rPr>
+          <w:lang w:val="sr-Cyrl-RS"/>
+        </w:rPr>
+        <w:t>ДОДАЈ РЕФ</w:t>
+      </w:r>
+      <w:r>
+        <w:rPr>
+          <w:lang w:val="ru-RU"/>
+        </w:rPr>
+        <w:t>].</w:t>
+      </w:r>
+    </w:p>
+    <w:p>
+      <w:pPr>
+        <w:pStyle w:val="NormalWeb"/>
+        <w:ind w:left="547"/>
+        <w:jc w:val="both"/>
+        <w:rPr>
+          <w:lang w:val="ru-RU"/>
+        </w:rPr>
+      </w:pPr>
+      <w:r>
+        <w:rPr>
+          <w:lang w:val="ru-RU"/>
+        </w:rPr>
+        <w:t xml:space="preserve">За </w:t>
+      </w:r>
+      <w:proofErr w:type="spellStart"/>
+      <w:r>
+        <w:rPr>
+          <w:lang w:val="ru-RU"/>
+        </w:rPr>
+        <w:t>овај</w:t>
+      </w:r>
+      <w:proofErr w:type="spellEnd"/>
+      <w:r>
+        <w:rPr>
+          <w:lang w:val="ru-RU"/>
+        </w:rPr>
+        <w:t xml:space="preserve"> рад </w:t>
+      </w:r>
+      <w:proofErr w:type="spellStart"/>
+      <w:r>
+        <w:rPr>
+          <w:lang w:val="ru-RU"/>
+        </w:rPr>
+        <w:t>посебно</w:t>
+      </w:r>
+      <w:proofErr w:type="spellEnd"/>
+      <w:r>
+        <w:rPr>
+          <w:lang w:val="ru-RU"/>
+        </w:rPr>
+        <w:t xml:space="preserve"> </w:t>
+      </w:r>
+      <w:proofErr w:type="spellStart"/>
+      <w:r>
+        <w:rPr>
+          <w:lang w:val="ru-RU"/>
+        </w:rPr>
+        <w:t>је</w:t>
+      </w:r>
+      <w:proofErr w:type="spellEnd"/>
+      <w:r>
+        <w:rPr>
+          <w:lang w:val="ru-RU"/>
+        </w:rPr>
+        <w:t xml:space="preserve"> </w:t>
+      </w:r>
+      <w:proofErr w:type="spellStart"/>
+      <w:r>
+        <w:rPr>
+          <w:lang w:val="ru-RU"/>
+        </w:rPr>
+        <w:t>значајна</w:t>
+      </w:r>
+      <w:proofErr w:type="spellEnd"/>
+      <w:r>
+        <w:rPr>
+          <w:lang w:val="ru-RU"/>
+        </w:rPr>
+        <w:t xml:space="preserve"> </w:t>
+      </w:r>
+      <w:proofErr w:type="spellStart"/>
+      <w:r>
+        <w:rPr>
+          <w:lang w:val="ru-RU"/>
+        </w:rPr>
+        <w:t>могућност</w:t>
+      </w:r>
+      <w:proofErr w:type="spellEnd"/>
+      <w:r>
+        <w:rPr>
+          <w:lang w:val="ru-RU"/>
+        </w:rPr>
+        <w:t xml:space="preserve"> </w:t>
+      </w:r>
+      <w:proofErr w:type="spellStart"/>
+      <w:r>
+        <w:rPr>
+          <w:lang w:val="ru-RU"/>
+        </w:rPr>
+        <w:t>примјене</w:t>
+      </w:r>
+      <w:proofErr w:type="spellEnd"/>
+      <w:r>
+        <w:rPr>
+          <w:lang w:val="ru-RU"/>
+        </w:rPr>
+        <w:t xml:space="preserve"> </w:t>
+      </w:r>
+      <w:r>
+        <w:t>ZKP</w:t>
+      </w:r>
+      <w:r>
+        <w:rPr>
+          <w:lang w:val="ru-RU"/>
+        </w:rPr>
+        <w:t xml:space="preserve"> протокола у </w:t>
+      </w:r>
+      <w:proofErr w:type="spellStart"/>
+      <w:r>
+        <w:rPr>
+          <w:lang w:val="ru-RU"/>
+        </w:rPr>
+        <w:t>процесу</w:t>
+      </w:r>
+      <w:proofErr w:type="spellEnd"/>
+      <w:r>
+        <w:rPr>
+          <w:lang w:val="ru-RU"/>
+        </w:rPr>
+        <w:t xml:space="preserve"> </w:t>
+      </w:r>
+      <w:proofErr w:type="spellStart"/>
+      <w:r>
+        <w:rPr>
+          <w:lang w:val="ru-RU"/>
+        </w:rPr>
+        <w:t>аутентификације</w:t>
+      </w:r>
+      <w:proofErr w:type="spellEnd"/>
+      <w:r>
+        <w:rPr>
+          <w:lang w:val="ru-RU"/>
+        </w:rPr>
+        <w:t xml:space="preserve">. </w:t>
+      </w:r>
+      <w:proofErr w:type="spellStart"/>
+      <w:r>
+        <w:rPr>
+          <w:lang w:val="ru-RU"/>
+        </w:rPr>
+        <w:t>Умјесто</w:t>
+      </w:r>
+      <w:proofErr w:type="spellEnd"/>
+      <w:r>
+        <w:rPr>
+          <w:lang w:val="ru-RU"/>
+        </w:rPr>
+        <w:t xml:space="preserve"> </w:t>
+      </w:r>
+      <w:proofErr w:type="spellStart"/>
+      <w:r>
+        <w:rPr>
+          <w:lang w:val="ru-RU"/>
+        </w:rPr>
+        <w:t>откривања</w:t>
+      </w:r>
+      <w:proofErr w:type="spellEnd"/>
+      <w:r>
+        <w:rPr>
+          <w:lang w:val="ru-RU"/>
+        </w:rPr>
+        <w:t xml:space="preserve"> </w:t>
+      </w:r>
+      <w:proofErr w:type="spellStart"/>
+      <w:r>
+        <w:rPr>
+          <w:lang w:val="ru-RU"/>
+        </w:rPr>
+        <w:t>тајне</w:t>
+      </w:r>
+      <w:proofErr w:type="spellEnd"/>
+      <w:r>
+        <w:rPr>
+          <w:lang w:val="ru-RU"/>
+        </w:rPr>
+        <w:t xml:space="preserve"> </w:t>
+      </w:r>
+      <w:proofErr w:type="spellStart"/>
+      <w:r>
+        <w:rPr>
+          <w:lang w:val="ru-RU"/>
+        </w:rPr>
+        <w:t>информације</w:t>
+      </w:r>
+      <w:proofErr w:type="spellEnd"/>
+      <w:r>
+        <w:rPr>
+          <w:lang w:val="ru-RU"/>
+        </w:rPr>
+        <w:t xml:space="preserve">, </w:t>
+      </w:r>
+      <w:proofErr w:type="spellStart"/>
+      <w:r>
+        <w:rPr>
+          <w:lang w:val="ru-RU"/>
+        </w:rPr>
+        <w:t>доказивач</w:t>
+      </w:r>
+      <w:proofErr w:type="spellEnd"/>
+      <w:r>
+        <w:rPr>
+          <w:lang w:val="ru-RU"/>
+        </w:rPr>
+        <w:t xml:space="preserve"> </w:t>
+      </w:r>
+      <w:proofErr w:type="spellStart"/>
+      <w:r>
+        <w:rPr>
+          <w:lang w:val="ru-RU"/>
+        </w:rPr>
+        <w:t>може</w:t>
+      </w:r>
+      <w:proofErr w:type="spellEnd"/>
+      <w:r>
+        <w:rPr>
+          <w:lang w:val="ru-RU"/>
+        </w:rPr>
+        <w:t xml:space="preserve"> </w:t>
+      </w:r>
+      <w:proofErr w:type="spellStart"/>
+      <w:r>
+        <w:rPr>
+          <w:lang w:val="ru-RU"/>
+        </w:rPr>
+        <w:t>доказати</w:t>
+      </w:r>
+      <w:proofErr w:type="spellEnd"/>
+      <w:r>
+        <w:rPr>
+          <w:lang w:val="ru-RU"/>
+        </w:rPr>
+        <w:t xml:space="preserve"> да </w:t>
+      </w:r>
+      <w:proofErr w:type="spellStart"/>
+      <w:r>
+        <w:rPr>
+          <w:lang w:val="ru-RU"/>
+        </w:rPr>
+        <w:t>је</w:t>
+      </w:r>
+      <w:proofErr w:type="spellEnd"/>
+      <w:r>
+        <w:rPr>
+          <w:lang w:val="ru-RU"/>
+        </w:rPr>
+        <w:t xml:space="preserve"> </w:t>
+      </w:r>
+      <w:proofErr w:type="spellStart"/>
+      <w:r>
+        <w:rPr>
+          <w:lang w:val="ru-RU"/>
+        </w:rPr>
+        <w:t>посједује</w:t>
+      </w:r>
+      <w:proofErr w:type="spellEnd"/>
+      <w:r>
+        <w:rPr>
+          <w:lang w:val="ru-RU"/>
+        </w:rPr>
+        <w:t xml:space="preserve">, док </w:t>
+      </w:r>
+      <w:proofErr w:type="spellStart"/>
+      <w:r>
+        <w:rPr>
+          <w:lang w:val="ru-RU"/>
+        </w:rPr>
+        <w:t>провјерилац</w:t>
+      </w:r>
+      <w:proofErr w:type="spellEnd"/>
+      <w:r>
+        <w:rPr>
+          <w:lang w:val="ru-RU"/>
+        </w:rPr>
+        <w:t xml:space="preserve"> на основу </w:t>
+      </w:r>
+      <w:proofErr w:type="spellStart"/>
+      <w:r>
+        <w:rPr>
+          <w:lang w:val="ru-RU"/>
+        </w:rPr>
+        <w:t>добијеног</w:t>
+      </w:r>
+      <w:proofErr w:type="spellEnd"/>
+      <w:r>
+        <w:rPr>
+          <w:lang w:val="ru-RU"/>
+        </w:rPr>
+        <w:t xml:space="preserve"> </w:t>
+      </w:r>
+      <w:proofErr w:type="spellStart"/>
+      <w:r>
+        <w:rPr>
+          <w:lang w:val="ru-RU"/>
+        </w:rPr>
+        <w:t>доказа</w:t>
+      </w:r>
+      <w:proofErr w:type="spellEnd"/>
+      <w:r>
+        <w:rPr>
+          <w:lang w:val="ru-RU"/>
+        </w:rPr>
+        <w:t xml:space="preserve"> </w:t>
+      </w:r>
+      <w:proofErr w:type="spellStart"/>
+      <w:r>
+        <w:rPr>
+          <w:lang w:val="ru-RU"/>
+        </w:rPr>
+        <w:t>утврђује</w:t>
+      </w:r>
+      <w:proofErr w:type="spellEnd"/>
+      <w:r>
+        <w:rPr>
+          <w:lang w:val="ru-RU"/>
+        </w:rPr>
+        <w:t xml:space="preserve"> </w:t>
+      </w:r>
+      <w:proofErr w:type="spellStart"/>
+      <w:r>
+        <w:rPr>
+          <w:lang w:val="ru-RU"/>
+        </w:rPr>
+        <w:t>исправност</w:t>
+      </w:r>
+      <w:proofErr w:type="spellEnd"/>
+      <w:r>
+        <w:rPr>
+          <w:lang w:val="ru-RU"/>
+        </w:rPr>
+        <w:t xml:space="preserve"> </w:t>
+      </w:r>
+      <w:proofErr w:type="spellStart"/>
+      <w:r>
+        <w:rPr>
+          <w:lang w:val="ru-RU"/>
+        </w:rPr>
+        <w:t>тврдње</w:t>
+      </w:r>
+      <w:proofErr w:type="spellEnd"/>
+      <w:r>
+        <w:rPr>
+          <w:lang w:val="ru-RU"/>
+        </w:rPr>
+        <w:t xml:space="preserve">. </w:t>
+      </w:r>
+      <w:proofErr w:type="spellStart"/>
+      <w:r>
+        <w:rPr>
+          <w:lang w:val="ru-RU"/>
+        </w:rPr>
+        <w:t>Овакав</w:t>
+      </w:r>
+      <w:proofErr w:type="spellEnd"/>
+      <w:r>
+        <w:rPr>
+          <w:lang w:val="ru-RU"/>
+        </w:rPr>
+        <w:t xml:space="preserve"> приступ </w:t>
+      </w:r>
+      <w:proofErr w:type="spellStart"/>
+      <w:r>
+        <w:rPr>
+          <w:lang w:val="ru-RU"/>
+        </w:rPr>
+        <w:t>може</w:t>
+      </w:r>
+      <w:proofErr w:type="spellEnd"/>
+      <w:r>
+        <w:rPr>
+          <w:lang w:val="ru-RU"/>
+        </w:rPr>
+        <w:t xml:space="preserve"> се </w:t>
+      </w:r>
+      <w:proofErr w:type="spellStart"/>
+      <w:r>
+        <w:rPr>
+          <w:lang w:val="ru-RU"/>
+        </w:rPr>
+        <w:t>примијенити</w:t>
+      </w:r>
+      <w:proofErr w:type="spellEnd"/>
+      <w:r>
+        <w:rPr>
+          <w:lang w:val="ru-RU"/>
+        </w:rPr>
+        <w:t xml:space="preserve"> и приликом </w:t>
+      </w:r>
+      <w:proofErr w:type="spellStart"/>
+      <w:r>
+        <w:rPr>
+          <w:lang w:val="ru-RU"/>
+        </w:rPr>
+        <w:t>аутентификације</w:t>
+      </w:r>
+      <w:proofErr w:type="spellEnd"/>
+      <w:r>
+        <w:rPr>
+          <w:lang w:val="ru-RU"/>
+        </w:rPr>
+        <w:t xml:space="preserve"> </w:t>
+      </w:r>
+      <w:proofErr w:type="spellStart"/>
+      <w:r>
+        <w:rPr>
+          <w:lang w:val="ru-RU"/>
+        </w:rPr>
+        <w:t>између</w:t>
+      </w:r>
+      <w:proofErr w:type="spellEnd"/>
+      <w:r>
+        <w:rPr>
+          <w:lang w:val="ru-RU"/>
+        </w:rPr>
+        <w:t xml:space="preserve"> </w:t>
+      </w:r>
+      <w:proofErr w:type="spellStart"/>
+      <w:r>
+        <w:rPr>
+          <w:lang w:val="ru-RU"/>
+        </w:rPr>
+        <w:t>софтверских</w:t>
+      </w:r>
+      <w:proofErr w:type="spellEnd"/>
+      <w:r>
+        <w:rPr>
+          <w:lang w:val="ru-RU"/>
+        </w:rPr>
+        <w:t xml:space="preserve"> сервиса, </w:t>
+      </w:r>
+      <w:proofErr w:type="spellStart"/>
+      <w:r>
+        <w:rPr>
+          <w:lang w:val="ru-RU"/>
+        </w:rPr>
+        <w:t>што</w:t>
+      </w:r>
+      <w:proofErr w:type="spellEnd"/>
+      <w:r>
+        <w:rPr>
+          <w:lang w:val="ru-RU"/>
+        </w:rPr>
+        <w:t xml:space="preserve"> </w:t>
+      </w:r>
+      <w:proofErr w:type="spellStart"/>
+      <w:r>
+        <w:rPr>
+          <w:lang w:val="ru-RU"/>
+        </w:rPr>
+        <w:t>ће</w:t>
+      </w:r>
+      <w:proofErr w:type="spellEnd"/>
+      <w:r>
+        <w:rPr>
+          <w:lang w:val="ru-RU"/>
+        </w:rPr>
+        <w:t xml:space="preserve"> </w:t>
+      </w:r>
+      <w:proofErr w:type="spellStart"/>
+      <w:r>
+        <w:rPr>
+          <w:lang w:val="ru-RU"/>
+        </w:rPr>
+        <w:t>бити</w:t>
+      </w:r>
+      <w:proofErr w:type="spellEnd"/>
+      <w:r>
+        <w:rPr>
+          <w:lang w:val="ru-RU"/>
+        </w:rPr>
+        <w:t xml:space="preserve"> </w:t>
+      </w:r>
+      <w:proofErr w:type="spellStart"/>
+      <w:r>
+        <w:rPr>
+          <w:lang w:val="ru-RU"/>
+        </w:rPr>
+        <w:t>детаљније</w:t>
+      </w:r>
+      <w:proofErr w:type="spellEnd"/>
+      <w:r>
+        <w:rPr>
+          <w:lang w:val="ru-RU"/>
+        </w:rPr>
+        <w:t xml:space="preserve"> </w:t>
+      </w:r>
+      <w:proofErr w:type="spellStart"/>
+      <w:r>
+        <w:rPr>
+          <w:lang w:val="ru-RU"/>
+        </w:rPr>
+        <w:t>размотрено</w:t>
+      </w:r>
+      <w:proofErr w:type="spellEnd"/>
+      <w:r>
+        <w:rPr>
+          <w:lang w:val="ru-RU"/>
+        </w:rPr>
+        <w:t xml:space="preserve"> у наставку рада.</w:t>
+      </w:r>
+    </w:p>
+    <w:p>
+      <w:pPr>
+        <w:ind w:left="547"/>
+        <w:rPr>
+          <w:lang w:val="ru-RU"/>
+        </w:rPr>
+      </w:pPr>
+    </w:p>
+    <w:p>
+      <w:pPr>
+        <w:ind w:left="547"/>
+      </w:pPr>
+    </w:p>
+    <w:p>
+      <w:pPr>
+        <w:ind w:left="547"/>
+      </w:pPr>
+    </w:p>
+    <w:p>
+      <w:pPr>
+        <w:ind w:left="547"/>
+      </w:pPr>
+    </w:p>
+    <w:p>
+      <w:pPr>
+        <w:ind w:left="547"/>
+      </w:pPr>
+    </w:p>
+    <w:p>
+      <w:pPr>
+        <w:ind w:left="547"/>
+      </w:pPr>
+    </w:p>
+    <w:p>
+      <w:pPr>
+        <w:ind w:left="547"/>
+      </w:pPr>
+    </w:p>
+    <w:p>
+      <w:pPr>
+        <w:ind w:left="288"/>
+      </w:pPr>
     </w:p>
     <w:p/>
     <w:p/>
     <w:p/>
     <w:p/>
     <w:p/>
-    <w:p/>
-    <w:p/>
-    <w:p/>
-    <w:p/>
-    <w:p/>
-    <w:p/>
-    <w:p/>
-    <w:p/>
-    <w:p/>
-    <w:p/>
-    <w:p/>
-    <w:p/>
-    <w:p/>
-    <w:p/>
-    <w:p/>
-    <w:p/>
-    <w:p/>
-    <w:p/>
-    <w:p/>
-    <w:p/>
-    <w:p/>
-    <w:p/>
-    <w:p/>
-    <w:p/>
-    <w:p/>
     <w:p>
       <w:pPr>
         <w:pStyle w:val="Heading1"/>
@@ -18998,7 +21160,7 @@
           <w:rFonts w:ascii="Times New Roman" w:hAnsi="Times New Roman" w:cs="Times New Roman"/>
         </w:rPr>
       </w:pPr>
-      <w:bookmarkStart w:id="14" w:name="_Toc237457523"/>
+      <w:bookmarkStart w:id="15" w:name="_Toc237478393"/>
       <w:r>
         <w:rPr>
           <w:rFonts w:ascii="Times New Roman" w:hAnsi="Times New Roman" w:cs="Times New Roman"/>
@@ -19020,7 +21182,7 @@
         </w:rPr>
         <w:t xml:space="preserve"> библиотеке</w:t>
       </w:r>
-      <w:bookmarkEnd w:id="14"/>
+      <w:bookmarkEnd w:id="15"/>
     </w:p>
     <w:p>
       <w:pPr>
@@ -19542,10 +21704,10 @@
                                 <w:sz w:val="20"/>
                               </w:rPr>
                               <w:object w:dxaOrig="1382" w:dyaOrig="1380" w14:anchorId="07567C10">
-                                <v:shape id="_x0000_i1037" type="#_x0000_t75" alt="" style="width:94.8pt;height:94.8pt;mso-width-percent:0;mso-height-percent:0;mso-width-percent:0;mso-height-percent:0" o:ole="" fillcolor="window">
+                                <v:shape id="_x0000_i1027" type="#_x0000_t75" alt="" style="width:94.9pt;height:94.9pt;mso-width-percent:0;mso-height-percent:0;mso-width-percent:0;mso-height-percent:0" o:ole="" fillcolor="window">
                                   <v:imagedata r:id="rId8" o:title=""/>
                                 </v:shape>
-                                <o:OLEObject Type="Embed" ProgID="CorelDraw.Graphic.7" ShapeID="_x0000_i1037" DrawAspect="Content" ObjectID="_1848070346" r:id="rId34"/>
+                                <o:OLEObject Type="Embed" ProgID="CorelDraw.Graphic.7" ShapeID="_x0000_i1027" DrawAspect="Content" ObjectID="_1848091888" r:id="rId34"/>
                               </w:object>
                             </w:r>
                           </w:p>
@@ -19604,9 +21766,9 @@
                         </w:rPr>
                         <w:object w:dxaOrig="1382" w:dyaOrig="1380" w14:anchorId="07567C10">
                           <v:shape id="_x0000_i1037" type="#_x0000_t75" alt="" style="width:94.8pt;height:94.8pt;mso-width-percent:0;mso-height-percent:0;mso-width-percent:0;mso-height-percent:0" o:ole="" fillcolor="window">
-                            <v:imagedata r:id="rId8" o:title=""/>
+                            <v:imagedata r:id="rId35" o:title=""/>
                           </v:shape>
-                          <o:OLEObject Type="Embed" ProgID="CorelDraw.Graphic.7" ShapeID="_x0000_i1037" DrawAspect="Content" ObjectID="_1848070346" r:id="rId35"/>
+                          <o:OLEObject Type="Embed" ProgID="CorelDraw.Graphic.7" ShapeID="_x0000_i1037" DrawAspect="Content" ObjectID="_1848070346" r:id="rId36"/>
                         </w:object>
                       </w:r>
                     </w:p>
@@ -19750,7 +21912,7 @@
                     </pic:cNvPicPr>
                   </pic:nvPicPr>
                   <pic:blipFill>
-                    <a:blip r:embed="rId36" cstate="print">
+                    <a:blip r:embed="rId37" cstate="print">
                       <a:extLst>
                         <a:ext uri="{28A0092B-C50C-407E-A947-70E740481C1C}">
                           <a14:useLocalDpi xmlns:a14="http://schemas.microsoft.com/office/drawing/2010/main" val="0"/>
@@ -19859,7 +22021,7 @@
           <w:szCs w:val="24"/>
         </w:rPr>
         <w:drawing>
-          <wp:inline distT="0" distB="0" distL="0" distR="0" wp14:anchorId="0DCE8B11" wp14:editId="5C0068D5">
+          <wp:inline distT="0" distB="0" distL="0" distR="0" wp14:anchorId="0DCE8B11" wp14:editId="0712EBEB">
             <wp:extent cx="2026836" cy="784754"/>
             <wp:effectExtent l="0" t="0" r="0" b="0"/>
             <wp:docPr id="314949663" name="Picture 1" descr="A diagram of a process&#10;&#10;Description automatically generated"/>
@@ -19876,7 +22038,7 @@
                     </pic:cNvPicPr>
                   </pic:nvPicPr>
                   <pic:blipFill rotWithShape="1">
-                    <a:blip r:embed="rId37" cstate="print">
+                    <a:blip r:embed="rId38" cstate="print">
                       <a:extLst>
                         <a:ext uri="{28A0092B-C50C-407E-A947-70E740481C1C}">
                           <a14:useLocalDpi xmlns:a14="http://schemas.microsoft.com/office/drawing/2010/main" val="0"/>
@@ -21406,255 +23568,13 @@
           <w:rFonts w:ascii="Times New Roman" w:hAnsi="Times New Roman" w:cs="Times New Roman"/>
         </w:rPr>
       </w:pPr>
-      <w:bookmarkStart w:id="15" w:name="_Toc237457524"/>
+      <w:bookmarkStart w:id="16" w:name="_Toc237478394"/>
       <w:r>
         <w:rPr>
           <w:rFonts w:ascii="Times New Roman" w:hAnsi="Times New Roman" w:cs="Times New Roman"/>
         </w:rPr>
         <w:lastRenderedPageBreak/>
         <w:t>Примјена библиотеке у микросервисном окружењу</w:t>
-      </w:r>
-      <w:bookmarkEnd w:id="15"/>
-    </w:p>
-    <w:p>
-      <w:pPr>
-        <w:jc w:val="both"/>
-        <w:rPr>
-          <w:rFonts w:ascii="Times New Roman" w:hAnsi="Times New Roman" w:cs="Times New Roman"/>
-          <w:sz w:val="24"/>
-          <w:szCs w:val="24"/>
-        </w:rPr>
-      </w:pPr>
-      <w:r>
-        <w:rPr>
-          <w:rFonts w:ascii="Times New Roman" w:hAnsi="Times New Roman" w:cs="Times New Roman"/>
-          <w:sz w:val="24"/>
-          <w:szCs w:val="24"/>
-        </w:rPr>
-        <w:t xml:space="preserve">Презентација </w:t>
-      </w:r>
-      <w:r>
-        <w:rPr>
-          <w:rFonts w:ascii="Times New Roman" w:hAnsi="Times New Roman" w:cs="Times New Roman"/>
-          <w:sz w:val="24"/>
-          <w:szCs w:val="24"/>
-        </w:rPr>
-        <w:t xml:space="preserve">коришћена приликом одбране завршног рада </w:t>
-      </w:r>
-      <w:r>
-        <w:rPr>
-          <w:rFonts w:ascii="Times New Roman" w:hAnsi="Times New Roman" w:cs="Times New Roman"/>
-          <w:sz w:val="24"/>
-          <w:szCs w:val="24"/>
-        </w:rPr>
-        <w:t>мора да траје до 10 минута за дипломске радове и</w:t>
-      </w:r>
-      <w:r>
-        <w:rPr>
-          <w:rFonts w:ascii="Times New Roman" w:hAnsi="Times New Roman" w:cs="Times New Roman"/>
-          <w:sz w:val="24"/>
-          <w:szCs w:val="24"/>
-        </w:rPr>
-        <w:t>ли</w:t>
-      </w:r>
-      <w:r>
-        <w:rPr>
-          <w:rFonts w:ascii="Times New Roman" w:hAnsi="Times New Roman" w:cs="Times New Roman"/>
-          <w:sz w:val="24"/>
-          <w:szCs w:val="24"/>
-        </w:rPr>
-        <w:t xml:space="preserve"> до 15 минута за мастер радове. </w:t>
-      </w:r>
-    </w:p>
-    <w:p>
-      <w:pPr>
-        <w:jc w:val="both"/>
-        <w:rPr>
-          <w:rFonts w:ascii="Times New Roman" w:hAnsi="Times New Roman" w:cs="Times New Roman"/>
-          <w:sz w:val="24"/>
-          <w:szCs w:val="24"/>
-        </w:rPr>
-      </w:pPr>
-      <w:r>
-        <w:rPr>
-          <w:rFonts w:ascii="Times New Roman" w:hAnsi="Times New Roman" w:cs="Times New Roman"/>
-          <w:sz w:val="24"/>
-          <w:szCs w:val="24"/>
-        </w:rPr>
-        <w:t xml:space="preserve">У зависности од садржаја рада, потребно је најпре </w:t>
-      </w:r>
-      <w:r>
-        <w:rPr>
-          <w:rFonts w:ascii="Times New Roman" w:hAnsi="Times New Roman" w:cs="Times New Roman"/>
-          <w:sz w:val="24"/>
-          <w:szCs w:val="24"/>
-        </w:rPr>
-        <w:t>презентовати</w:t>
-      </w:r>
-      <w:r>
-        <w:rPr>
-          <w:rFonts w:ascii="Times New Roman" w:hAnsi="Times New Roman" w:cs="Times New Roman"/>
-          <w:sz w:val="24"/>
-          <w:szCs w:val="24"/>
-        </w:rPr>
-        <w:t xml:space="preserve"> увод који представља домен рада, мотивацију и циљ (нпр. </w:t>
-      </w:r>
-      <w:r>
-        <w:rPr>
-          <w:rFonts w:ascii="Times New Roman" w:hAnsi="Times New Roman" w:cs="Times New Roman"/>
-          <w:sz w:val="24"/>
-          <w:szCs w:val="24"/>
-        </w:rPr>
-        <w:t>један</w:t>
-      </w:r>
-      <w:r>
-        <w:rPr>
-          <w:rFonts w:ascii="Times New Roman" w:hAnsi="Times New Roman" w:cs="Times New Roman"/>
-          <w:sz w:val="24"/>
-          <w:szCs w:val="24"/>
-        </w:rPr>
-        <w:t xml:space="preserve"> до </w:t>
-      </w:r>
-      <w:r>
-        <w:rPr>
-          <w:rFonts w:ascii="Times New Roman" w:hAnsi="Times New Roman" w:cs="Times New Roman"/>
-          <w:sz w:val="24"/>
-          <w:szCs w:val="24"/>
-        </w:rPr>
-        <w:t>два</w:t>
-      </w:r>
-      <w:r>
-        <w:rPr>
-          <w:rFonts w:ascii="Times New Roman" w:hAnsi="Times New Roman" w:cs="Times New Roman"/>
-          <w:sz w:val="24"/>
-          <w:szCs w:val="24"/>
-        </w:rPr>
-        <w:t xml:space="preserve"> слајда). Затим је потребно представити решење описано у раду (то може бити архитектура система за радове који обухватају софтверско решење) или теоријски увод и главне резултате (за радове у којима је фокус био на истраживању области). Уколико је у питању софтверско решење, </w:t>
-      </w:r>
-      <w:r>
-        <w:rPr>
-          <w:rFonts w:ascii="Times New Roman" w:hAnsi="Times New Roman" w:cs="Times New Roman"/>
-          <w:sz w:val="24"/>
-          <w:szCs w:val="24"/>
-        </w:rPr>
-        <w:t xml:space="preserve">потребно је </w:t>
-      </w:r>
-      <w:r>
-        <w:rPr>
-          <w:rFonts w:ascii="Times New Roman" w:hAnsi="Times New Roman" w:cs="Times New Roman"/>
-          <w:sz w:val="24"/>
-          <w:szCs w:val="24"/>
-        </w:rPr>
-        <w:t xml:space="preserve">снимити </w:t>
-      </w:r>
-      <w:r>
-        <w:rPr>
-          <w:rFonts w:ascii="Times New Roman" w:hAnsi="Times New Roman" w:cs="Times New Roman"/>
-          <w:sz w:val="24"/>
-          <w:szCs w:val="24"/>
-        </w:rPr>
-        <w:t>показни</w:t>
-      </w:r>
-      <w:r>
-        <w:rPr>
-          <w:rFonts w:ascii="Times New Roman" w:hAnsi="Times New Roman" w:cs="Times New Roman"/>
-          <w:sz w:val="24"/>
-          <w:szCs w:val="24"/>
-        </w:rPr>
-        <w:t xml:space="preserve"> видео</w:t>
-      </w:r>
-      <w:r>
-        <w:rPr>
-          <w:rFonts w:ascii="Times New Roman" w:hAnsi="Times New Roman" w:cs="Times New Roman"/>
-          <w:sz w:val="24"/>
-          <w:szCs w:val="24"/>
-        </w:rPr>
-        <w:t xml:space="preserve"> (</w:t>
-      </w:r>
-      <w:r>
-        <w:rPr>
-          <w:rFonts w:ascii="Times New Roman" w:hAnsi="Times New Roman" w:cs="Times New Roman"/>
-          <w:i/>
-          <w:iCs/>
-          <w:sz w:val="24"/>
-          <w:szCs w:val="24"/>
-        </w:rPr>
-        <w:t>demo</w:t>
-      </w:r>
-      <w:r>
-        <w:rPr>
-          <w:rFonts w:ascii="Times New Roman" w:hAnsi="Times New Roman" w:cs="Times New Roman"/>
-          <w:sz w:val="24"/>
-          <w:szCs w:val="24"/>
-        </w:rPr>
-        <w:t>)</w:t>
-      </w:r>
-      <w:r>
-        <w:rPr>
-          <w:rFonts w:ascii="Times New Roman" w:hAnsi="Times New Roman" w:cs="Times New Roman"/>
-          <w:sz w:val="24"/>
-          <w:szCs w:val="24"/>
-        </w:rPr>
-        <w:t xml:space="preserve"> у трајању од 3 до 5 минута. На крају презентације потребно је најпре сумирати главне доприносе презентованог рада, а затим који су будући правци рада или истраживања. </w:t>
-      </w:r>
-    </w:p>
-    <w:p>
-      <w:pPr>
-        <w:jc w:val="both"/>
-        <w:rPr>
-          <w:rFonts w:ascii="Times New Roman" w:hAnsi="Times New Roman" w:cs="Times New Roman"/>
-          <w:sz w:val="24"/>
-          <w:szCs w:val="24"/>
-        </w:rPr>
-      </w:pPr>
-      <w:r>
-        <w:rPr>
-          <w:rFonts w:ascii="Times New Roman" w:hAnsi="Times New Roman" w:cs="Times New Roman"/>
-          <w:sz w:val="24"/>
-          <w:szCs w:val="24"/>
-        </w:rPr>
-        <w:t xml:space="preserve">Требало би избећи, </w:t>
-      </w:r>
-      <w:r>
-        <w:rPr>
-          <w:rFonts w:ascii="Times New Roman" w:hAnsi="Times New Roman" w:cs="Times New Roman"/>
-          <w:sz w:val="24"/>
-          <w:szCs w:val="24"/>
-        </w:rPr>
-        <w:t>у зависности од теме рада</w:t>
-      </w:r>
-      <w:r>
-        <w:rPr>
-          <w:rFonts w:ascii="Times New Roman" w:hAnsi="Times New Roman" w:cs="Times New Roman"/>
-          <w:sz w:val="24"/>
-          <w:szCs w:val="24"/>
-        </w:rPr>
-        <w:t>, велике количине текста на слајдовима.</w:t>
-      </w:r>
-    </w:p>
-    <w:p>
-      <w:pPr>
-        <w:jc w:val="both"/>
-        <w:rPr>
-          <w:rFonts w:ascii="Times New Roman" w:hAnsi="Times New Roman" w:cs="Times New Roman"/>
-          <w:sz w:val="24"/>
-          <w:szCs w:val="24"/>
-        </w:rPr>
-      </w:pPr>
-    </w:p>
-    <w:p>
-      <w:pPr>
-        <w:pStyle w:val="Heading1"/>
-        <w:rPr>
-          <w:rFonts w:ascii="Times New Roman" w:hAnsi="Times New Roman" w:cs="Times New Roman"/>
-        </w:rPr>
-      </w:pPr>
-      <w:bookmarkStart w:id="16" w:name="_Toc237457525"/>
-      <w:r>
-        <w:rPr>
-          <w:rFonts w:ascii="Times New Roman" w:hAnsi="Times New Roman" w:cs="Times New Roman"/>
-        </w:rPr>
-        <w:t>Закључак</w:t>
       </w:r>
       <w:bookmarkEnd w:id="16"/>
     </w:p>
@@ -21663,30 +23583,272 @@
         <w:jc w:val="both"/>
         <w:rPr>
           <w:rFonts w:ascii="Times New Roman" w:hAnsi="Times New Roman" w:cs="Times New Roman"/>
-        </w:rPr>
-      </w:pPr>
+          <w:sz w:val="24"/>
+          <w:szCs w:val="24"/>
+        </w:rPr>
+      </w:pPr>
+      <w:r>
+        <w:rPr>
+          <w:rFonts w:ascii="Times New Roman" w:hAnsi="Times New Roman" w:cs="Times New Roman"/>
+          <w:sz w:val="24"/>
+          <w:szCs w:val="24"/>
+        </w:rPr>
+        <w:t xml:space="preserve">Презентација </w:t>
+      </w:r>
+      <w:r>
+        <w:rPr>
+          <w:rFonts w:ascii="Times New Roman" w:hAnsi="Times New Roman" w:cs="Times New Roman"/>
+          <w:sz w:val="24"/>
+          <w:szCs w:val="24"/>
+        </w:rPr>
+        <w:t xml:space="preserve">коришћена приликом одбране завршног рада </w:t>
+      </w:r>
+      <w:r>
+        <w:rPr>
+          <w:rFonts w:ascii="Times New Roman" w:hAnsi="Times New Roman" w:cs="Times New Roman"/>
+          <w:sz w:val="24"/>
+          <w:szCs w:val="24"/>
+        </w:rPr>
+        <w:t>мора да траје до 10 минута за дипломске радове и</w:t>
+      </w:r>
+      <w:r>
+        <w:rPr>
+          <w:rFonts w:ascii="Times New Roman" w:hAnsi="Times New Roman" w:cs="Times New Roman"/>
+          <w:sz w:val="24"/>
+          <w:szCs w:val="24"/>
+        </w:rPr>
+        <w:t>ли</w:t>
+      </w:r>
+      <w:r>
+        <w:rPr>
+          <w:rFonts w:ascii="Times New Roman" w:hAnsi="Times New Roman" w:cs="Times New Roman"/>
+          <w:sz w:val="24"/>
+          <w:szCs w:val="24"/>
+        </w:rPr>
+        <w:t xml:space="preserve"> до 15 минута за мастер радове. </w:t>
+      </w:r>
     </w:p>
     <w:p>
       <w:pPr>
-        <w:rPr>
-          <w:rFonts w:ascii="Times New Roman" w:hAnsi="Times New Roman" w:cs="Times New Roman"/>
-        </w:rPr>
-      </w:pPr>
-      <w:r>
-        <w:rPr>
-          <w:rFonts w:ascii="Times New Roman" w:hAnsi="Times New Roman" w:cs="Times New Roman"/>
-        </w:rPr>
-        <w:br w:type="page"/>
+        <w:jc w:val="both"/>
+        <w:rPr>
+          <w:rFonts w:ascii="Times New Roman" w:hAnsi="Times New Roman" w:cs="Times New Roman"/>
+          <w:sz w:val="24"/>
+          <w:szCs w:val="24"/>
+        </w:rPr>
+      </w:pPr>
+      <w:r>
+        <w:rPr>
+          <w:rFonts w:ascii="Times New Roman" w:hAnsi="Times New Roman" w:cs="Times New Roman"/>
+          <w:sz w:val="24"/>
+          <w:szCs w:val="24"/>
+        </w:rPr>
+        <w:t xml:space="preserve">У зависности од садржаја рада, потребно је најпре </w:t>
+      </w:r>
+      <w:r>
+        <w:rPr>
+          <w:rFonts w:ascii="Times New Roman" w:hAnsi="Times New Roman" w:cs="Times New Roman"/>
+          <w:sz w:val="24"/>
+          <w:szCs w:val="24"/>
+        </w:rPr>
+        <w:t>презентовати</w:t>
+      </w:r>
+      <w:r>
+        <w:rPr>
+          <w:rFonts w:ascii="Times New Roman" w:hAnsi="Times New Roman" w:cs="Times New Roman"/>
+          <w:sz w:val="24"/>
+          <w:szCs w:val="24"/>
+        </w:rPr>
+        <w:t xml:space="preserve"> увод који представља домен рада, мотивацију и циљ (нпр. </w:t>
+      </w:r>
+      <w:r>
+        <w:rPr>
+          <w:rFonts w:ascii="Times New Roman" w:hAnsi="Times New Roman" w:cs="Times New Roman"/>
+          <w:sz w:val="24"/>
+          <w:szCs w:val="24"/>
+        </w:rPr>
+        <w:t>један</w:t>
+      </w:r>
+      <w:r>
+        <w:rPr>
+          <w:rFonts w:ascii="Times New Roman" w:hAnsi="Times New Roman" w:cs="Times New Roman"/>
+          <w:sz w:val="24"/>
+          <w:szCs w:val="24"/>
+        </w:rPr>
+        <w:t xml:space="preserve"> до </w:t>
+      </w:r>
+      <w:r>
+        <w:rPr>
+          <w:rFonts w:ascii="Times New Roman" w:hAnsi="Times New Roman" w:cs="Times New Roman"/>
+          <w:sz w:val="24"/>
+          <w:szCs w:val="24"/>
+        </w:rPr>
+        <w:t>два</w:t>
+      </w:r>
+      <w:r>
+        <w:rPr>
+          <w:rFonts w:ascii="Times New Roman" w:hAnsi="Times New Roman" w:cs="Times New Roman"/>
+          <w:sz w:val="24"/>
+          <w:szCs w:val="24"/>
+        </w:rPr>
+        <w:t xml:space="preserve"> слајда). Затим је потребно представити решење описано у раду (то може бити архитектура система за радове који обухватају софтверско решење) или теоријски увод и главне резултате (за радове у којима је фокус био на истраживању области). Уколико је у питању софтверско решење, </w:t>
+      </w:r>
+      <w:r>
+        <w:rPr>
+          <w:rFonts w:ascii="Times New Roman" w:hAnsi="Times New Roman" w:cs="Times New Roman"/>
+          <w:sz w:val="24"/>
+          <w:szCs w:val="24"/>
+        </w:rPr>
+        <w:t xml:space="preserve">потребно је </w:t>
+      </w:r>
+      <w:r>
+        <w:rPr>
+          <w:rFonts w:ascii="Times New Roman" w:hAnsi="Times New Roman" w:cs="Times New Roman"/>
+          <w:sz w:val="24"/>
+          <w:szCs w:val="24"/>
+        </w:rPr>
+        <w:t xml:space="preserve">снимити </w:t>
+      </w:r>
+      <w:r>
+        <w:rPr>
+          <w:rFonts w:ascii="Times New Roman" w:hAnsi="Times New Roman" w:cs="Times New Roman"/>
+          <w:sz w:val="24"/>
+          <w:szCs w:val="24"/>
+        </w:rPr>
+        <w:t>показни</w:t>
+      </w:r>
+      <w:r>
+        <w:rPr>
+          <w:rFonts w:ascii="Times New Roman" w:hAnsi="Times New Roman" w:cs="Times New Roman"/>
+          <w:sz w:val="24"/>
+          <w:szCs w:val="24"/>
+        </w:rPr>
+        <w:t xml:space="preserve"> видео</w:t>
+      </w:r>
+      <w:r>
+        <w:rPr>
+          <w:rFonts w:ascii="Times New Roman" w:hAnsi="Times New Roman" w:cs="Times New Roman"/>
+          <w:sz w:val="24"/>
+          <w:szCs w:val="24"/>
+        </w:rPr>
+        <w:t xml:space="preserve"> (</w:t>
+      </w:r>
+      <w:r>
+        <w:rPr>
+          <w:rFonts w:ascii="Times New Roman" w:hAnsi="Times New Roman" w:cs="Times New Roman"/>
+          <w:i/>
+          <w:iCs/>
+          <w:sz w:val="24"/>
+          <w:szCs w:val="24"/>
+        </w:rPr>
+        <w:t>demo</w:t>
+      </w:r>
+      <w:r>
+        <w:rPr>
+          <w:rFonts w:ascii="Times New Roman" w:hAnsi="Times New Roman" w:cs="Times New Roman"/>
+          <w:sz w:val="24"/>
+          <w:szCs w:val="24"/>
+        </w:rPr>
+        <w:t>)</w:t>
+      </w:r>
+      <w:r>
+        <w:rPr>
+          <w:rFonts w:ascii="Times New Roman" w:hAnsi="Times New Roman" w:cs="Times New Roman"/>
+          <w:sz w:val="24"/>
+          <w:szCs w:val="24"/>
+        </w:rPr>
+        <w:t xml:space="preserve"> у трајању од 3 до 5 минута. На крају презентације потребно је најпре сумирати главне доприносе презентованог рада, а затим који су будући правци рада или истраживања. </w:t>
       </w:r>
     </w:p>
     <w:p>
       <w:pPr>
+        <w:jc w:val="both"/>
+        <w:rPr>
+          <w:rFonts w:ascii="Times New Roman" w:hAnsi="Times New Roman" w:cs="Times New Roman"/>
+          <w:sz w:val="24"/>
+          <w:szCs w:val="24"/>
+        </w:rPr>
+      </w:pPr>
+      <w:r>
+        <w:rPr>
+          <w:rFonts w:ascii="Times New Roman" w:hAnsi="Times New Roman" w:cs="Times New Roman"/>
+          <w:sz w:val="24"/>
+          <w:szCs w:val="24"/>
+        </w:rPr>
+        <w:t xml:space="preserve">Требало би избећи, </w:t>
+      </w:r>
+      <w:r>
+        <w:rPr>
+          <w:rFonts w:ascii="Times New Roman" w:hAnsi="Times New Roman" w:cs="Times New Roman"/>
+          <w:sz w:val="24"/>
+          <w:szCs w:val="24"/>
+        </w:rPr>
+        <w:t>у зависности од теме рада</w:t>
+      </w:r>
+      <w:r>
+        <w:rPr>
+          <w:rFonts w:ascii="Times New Roman" w:hAnsi="Times New Roman" w:cs="Times New Roman"/>
+          <w:sz w:val="24"/>
+          <w:szCs w:val="24"/>
+        </w:rPr>
+        <w:t>, велике количине текста на слајдовима.</w:t>
+      </w:r>
+    </w:p>
+    <w:p>
+      <w:pPr>
+        <w:jc w:val="both"/>
+        <w:rPr>
+          <w:rFonts w:ascii="Times New Roman" w:hAnsi="Times New Roman" w:cs="Times New Roman"/>
+          <w:sz w:val="24"/>
+          <w:szCs w:val="24"/>
+        </w:rPr>
+      </w:pPr>
+    </w:p>
+    <w:p>
+      <w:pPr>
         <w:pStyle w:val="Heading1"/>
         <w:rPr>
           <w:rFonts w:ascii="Times New Roman" w:hAnsi="Times New Roman" w:cs="Times New Roman"/>
         </w:rPr>
       </w:pPr>
-      <w:bookmarkStart w:id="17" w:name="_Toc237457526"/>
+      <w:bookmarkStart w:id="17" w:name="_Toc237478395"/>
+      <w:r>
+        <w:rPr>
+          <w:rFonts w:ascii="Times New Roman" w:hAnsi="Times New Roman" w:cs="Times New Roman"/>
+        </w:rPr>
+        <w:t>Закључак</w:t>
+      </w:r>
+      <w:bookmarkEnd w:id="17"/>
+    </w:p>
+    <w:p>
+      <w:pPr>
+        <w:jc w:val="both"/>
+        <w:rPr>
+          <w:rFonts w:ascii="Times New Roman" w:hAnsi="Times New Roman" w:cs="Times New Roman"/>
+        </w:rPr>
+      </w:pPr>
+    </w:p>
+    <w:p>
+      <w:pPr>
+        <w:rPr>
+          <w:rFonts w:ascii="Times New Roman" w:hAnsi="Times New Roman" w:cs="Times New Roman"/>
+        </w:rPr>
+      </w:pPr>
+      <w:r>
+        <w:rPr>
+          <w:rFonts w:ascii="Times New Roman" w:hAnsi="Times New Roman" w:cs="Times New Roman"/>
+        </w:rPr>
+        <w:br w:type="page"/>
+      </w:r>
+    </w:p>
+    <w:p>
+      <w:pPr>
+        <w:pStyle w:val="Heading1"/>
+        <w:rPr>
+          <w:rFonts w:ascii="Times New Roman" w:hAnsi="Times New Roman" w:cs="Times New Roman"/>
+        </w:rPr>
+      </w:pPr>
+      <w:bookmarkStart w:id="18" w:name="_Toc237478396"/>
       <w:r>
         <w:rPr>
           <w:rFonts w:ascii="Times New Roman" w:hAnsi="Times New Roman" w:cs="Times New Roman"/>
@@ -21694,7 +23856,7 @@
         <w:lastRenderedPageBreak/>
         <w:t>Литература</w:t>
       </w:r>
-      <w:bookmarkEnd w:id="17"/>
+      <w:bookmarkEnd w:id="18"/>
     </w:p>
     <w:p>
       <w:pPr>
@@ -21711,7 +23873,7 @@
           <w:szCs w:val="24"/>
         </w:rPr>
       </w:pPr>
-      <w:bookmarkStart w:id="18" w:name="_Ref236837480"/>
+      <w:bookmarkStart w:id="19" w:name="_Ref236837480"/>
       <w:r>
         <w:rPr>
           <w:rFonts w:ascii="Times New Roman" w:hAnsi="Times New Roman" w:cs="Times New Roman"/>
@@ -21746,7 +23908,7 @@
         </w:rPr>
         <w:t>.</w:t>
       </w:r>
-      <w:bookmarkEnd w:id="18"/>
+      <w:bookmarkEnd w:id="19"/>
     </w:p>
     <w:p>
       <w:pPr>
@@ -21763,7 +23925,7 @@
           <w:szCs w:val="24"/>
         </w:rPr>
       </w:pPr>
-      <w:bookmarkStart w:id="19" w:name="_Ref236837494"/>
+      <w:bookmarkStart w:id="20" w:name="_Ref236837494"/>
       <w:r>
         <w:rPr>
           <w:rFonts w:ascii="Times New Roman" w:hAnsi="Times New Roman" w:cs="Times New Roman"/>
@@ -21790,7 +23952,7 @@
         </w:rPr>
         <w:t>, Manning, 2018.</w:t>
       </w:r>
-      <w:bookmarkEnd w:id="19"/>
+      <w:bookmarkEnd w:id="20"/>
     </w:p>
     <w:p>
       <w:pPr>
@@ -21807,7 +23969,7 @@
           <w:szCs w:val="24"/>
         </w:rPr>
       </w:pPr>
-      <w:bookmarkStart w:id="20" w:name="_Ref236837541"/>
+      <w:bookmarkStart w:id="21" w:name="_Ref236837541"/>
       <w:r>
         <w:rPr>
           <w:rFonts w:ascii="Times New Roman" w:hAnsi="Times New Roman" w:cs="Times New Roman"/>
@@ -21834,7 +23996,7 @@
         </w:rPr>
         <w:t>, RFC 8446, 2018.</w:t>
       </w:r>
-      <w:bookmarkEnd w:id="20"/>
+      <w:bookmarkEnd w:id="21"/>
     </w:p>
     <w:p>
       <w:pPr>
@@ -21977,7 +24139,7 @@
           <w:szCs w:val="24"/>
         </w:rPr>
       </w:pPr>
-      <w:bookmarkStart w:id="21" w:name="_Ref237451559"/>
+      <w:bookmarkStart w:id="22" w:name="_Ref237451559"/>
       <w:r>
         <w:rPr>
           <w:rFonts w:ascii="Times New Roman" w:hAnsi="Times New Roman" w:cs="Times New Roman"/>
@@ -21985,41 +24147,41 @@
           <w:szCs w:val="24"/>
         </w:rPr>
         <w:t>C. P. Schnorr, “Efficient Identification and Signatures for Smart Cards,” Advances in Cryptology — CRYPTO ’89, Springer, 1990, pp. 239–252.</w:t>
-      </w:r>
-      <w:bookmarkEnd w:id="21"/>
-    </w:p>
-    <w:p>
-      <w:pPr>
-        <w:rPr>
-          <w:rFonts w:ascii="Times New Roman" w:hAnsi="Times New Roman" w:cs="Times New Roman"/>
-        </w:rPr>
-      </w:pPr>
-      <w:r>
-        <w:rPr>
-          <w:rFonts w:ascii="Times New Roman" w:hAnsi="Times New Roman" w:cs="Times New Roman"/>
-        </w:rPr>
-        <w:br w:type="page"/>
-      </w:r>
-    </w:p>
-    <w:p>
-      <w:pPr>
-        <w:pStyle w:val="Heading1"/>
-        <w:rPr>
-          <w:rFonts w:ascii="Times New Roman" w:hAnsi="Times New Roman" w:cs="Times New Roman"/>
-        </w:rPr>
-      </w:pPr>
-      <w:bookmarkStart w:id="22" w:name="_Toc237457527"/>
-      <w:r>
-        <w:rPr>
-          <w:rFonts w:ascii="Times New Roman" w:hAnsi="Times New Roman" w:cs="Times New Roman"/>
-        </w:rPr>
-        <w:lastRenderedPageBreak/>
-        <w:t>Биографија</w:t>
       </w:r>
       <w:bookmarkEnd w:id="22"/>
     </w:p>
     <w:p>
       <w:pPr>
+        <w:rPr>
+          <w:rFonts w:ascii="Times New Roman" w:hAnsi="Times New Roman" w:cs="Times New Roman"/>
+        </w:rPr>
+      </w:pPr>
+      <w:r>
+        <w:rPr>
+          <w:rFonts w:ascii="Times New Roman" w:hAnsi="Times New Roman" w:cs="Times New Roman"/>
+        </w:rPr>
+        <w:br w:type="page"/>
+      </w:r>
+    </w:p>
+    <w:p>
+      <w:pPr>
+        <w:pStyle w:val="Heading1"/>
+        <w:rPr>
+          <w:rFonts w:ascii="Times New Roman" w:hAnsi="Times New Roman" w:cs="Times New Roman"/>
+        </w:rPr>
+      </w:pPr>
+      <w:bookmarkStart w:id="23" w:name="_Toc237478397"/>
+      <w:r>
+        <w:rPr>
+          <w:rFonts w:ascii="Times New Roman" w:hAnsi="Times New Roman" w:cs="Times New Roman"/>
+        </w:rPr>
+        <w:lastRenderedPageBreak/>
+        <w:t>Биографија</w:t>
+      </w:r>
+      <w:bookmarkEnd w:id="23"/>
+    </w:p>
+    <w:p>
+      <w:pPr>
         <w:jc w:val="both"/>
         <w:rPr>
           <w:rFonts w:ascii="Times New Roman" w:hAnsi="Times New Roman" w:cs="Times New Roman"/>
@@ -22036,10 +24198,10 @@
       </w:r>
     </w:p>
     <w:sectPr>
-      <w:headerReference w:type="even" r:id="rId38"/>
-      <w:headerReference w:type="default" r:id="rId39"/>
-      <w:footerReference w:type="even" r:id="rId40"/>
-      <w:footerReference w:type="default" r:id="rId41"/>
+      <w:headerReference w:type="even" r:id="rId39"/>
+      <w:headerReference w:type="default" r:id="rId40"/>
+      <w:footerReference w:type="even" r:id="rId41"/>
+      <w:footerReference w:type="default" r:id="rId42"/>
       <w:pgSz w:w="11906" w:h="16838" w:code="9"/>
       <w:pgMar w:top="1152" w:right="1152" w:bottom="1152" w:left="1440" w:header="720" w:footer="432" w:gutter="0"/>
       <w:pgNumType w:start="1"/>

</xml_diff>

<commit_message>
style: fix document alignment
</commit_message>
<xml_diff>
--- a/thesis.docx
+++ b/thesis.docx
@@ -71,7 +71,7 @@
                 <v:shape id="_x0000_i1025" type="#_x0000_t75" alt="" style="width:63pt;height:63pt;mso-width-percent:0;mso-height-percent:0;mso-width-percent:0;mso-height-percent:0" o:ole="" fillcolor="window">
                   <v:imagedata r:id="rId8" o:title=""/>
                 </v:shape>
-                <o:OLEObject Type="Embed" ProgID="CorelDraw.Graphic.7" ShapeID="_x0000_i1025" DrawAspect="Content" ObjectID="_1848922803" r:id="rId9"/>
+                <o:OLEObject Type="Embed" ProgID="CorelDraw.Graphic.7" ShapeID="_x0000_i1025" DrawAspect="Content" ObjectID="_1848922999" r:id="rId9"/>
               </w:object>
             </w:r>
           </w:p>
@@ -8118,21 +8118,7 @@
                 <w:rStyle w:val="Hyperlink"/>
                 <w:noProof/>
               </w:rPr>
-              <w:t>прот</w:t>
-            </w:r>
-            <w:r>
-              <w:rPr>
-                <w:rStyle w:val="Hyperlink"/>
-                <w:noProof/>
-              </w:rPr>
-              <w:t>о</w:t>
-            </w:r>
-            <w:r>
-              <w:rPr>
-                <w:rStyle w:val="Hyperlink"/>
-                <w:noProof/>
-              </w:rPr>
-              <w:t>кол</w:t>
+              <w:t>протокол</w:t>
             </w:r>
             <w:r>
               <w:rPr>
@@ -19847,21 +19833,7 @@
         <w:rPr>
           <w:lang w:val="ru-RU"/>
         </w:rPr>
-        <w:t xml:space="preserve"> се </w:t>
-      </w:r>
-      <w:proofErr w:type="spellStart"/>
-      <w:r>
-        <w:rPr>
-          <w:lang w:val="ru-RU"/>
-        </w:rPr>
-        <w:t>примјењује</w:t>
-      </w:r>
-      <w:proofErr w:type="spellEnd"/>
-      <w:r>
-        <w:rPr>
-          <w:lang w:val="ru-RU"/>
-        </w:rPr>
-        <w:t>.</w:t>
+        <w:t xml:space="preserve"> се примјењује.</w:t>
       </w:r>
     </w:p>
     <w:p>
@@ -25732,7 +25704,7 @@
     </w:p>
     <w:p>
       <w:pPr>
-        <w:jc w:val="center"/>
+        <w:jc w:val="both"/>
         <w:rPr>
           <w:rFonts w:ascii="Times New Roman" w:hAnsi="Times New Roman" w:cs="Times New Roman"/>
           <w:sz w:val="24"/>
@@ -25761,16 +25733,7 @@
           <w:sz w:val="24"/>
           <w:szCs w:val="24"/>
         </w:rPr>
-        <w:t xml:space="preserve">ће у наредном поглављу бити размотрени неки од </w:t>
-      </w:r>
-      <w:r>
-        <w:rPr>
-          <w:rFonts w:ascii="Times New Roman" w:hAnsi="Times New Roman" w:cs="Times New Roman"/>
-          <w:sz w:val="24"/>
-          <w:szCs w:val="24"/>
-        </w:rPr>
-        <w:lastRenderedPageBreak/>
-        <w:t>безбједносних ризика који се могу јавити приликом употребе традиционалних приступа аутентификацији.</w:t>
+        <w:t>ће у наредном поглављу бити размотрени неки од безбједносних ризика који се могу јавити приликом употребе традиционалних приступа аутентификацији.</w:t>
       </w:r>
     </w:p>
     <w:p>
@@ -25785,6 +25748,7 @@
         <w:rPr>
           <w:rFonts w:ascii="Times New Roman" w:hAnsi="Times New Roman" w:cs="Times New Roman"/>
         </w:rPr>
+        <w:lastRenderedPageBreak/>
         <w:t>Безбједносни ризици традиционлних приступа</w:t>
       </w:r>
       <w:bookmarkEnd w:id="18"/>
@@ -27349,7 +27313,6 @@
         <w:rPr>
           <w:lang w:val="ru-RU"/>
         </w:rPr>
-        <w:lastRenderedPageBreak/>
         <w:t>Ова</w:t>
       </w:r>
       <w:proofErr w:type="spellEnd"/>
@@ -27492,21 +27455,7 @@
         <w:rPr>
           <w:lang w:val="ru-RU"/>
         </w:rPr>
-        <w:t xml:space="preserve"> </w:t>
-      </w:r>
-      <w:proofErr w:type="spellStart"/>
-      <w:r>
-        <w:rPr>
-          <w:lang w:val="ru-RU"/>
-        </w:rPr>
-        <w:t>поглављу</w:t>
-      </w:r>
-      <w:proofErr w:type="spellEnd"/>
-      <w:r>
-        <w:rPr>
-          <w:lang w:val="ru-RU"/>
-        </w:rPr>
-        <w:t>.</w:t>
+        <w:t xml:space="preserve"> поглављу.</w:t>
       </w:r>
     </w:p>
     <w:p>
@@ -34416,6 +34365,7 @@
   <w:style w:type="character" w:default="1" w:styleId="DefaultParagraphFont">
     <w:name w:val="Default Paragraph Font"/>
     <w:uiPriority w:val="1"/>
+    <w:semiHidden/>
     <w:unhideWhenUsed/>
   </w:style>
   <w:style w:type="table" w:default="1" w:styleId="TableNormal">

</xml_diff>